<commit_message>
Align proposal with current twelve-transaction scoring rule.
Co-authored-by: Cursor <cursoragent@cursor.com>
</commit_message>
<xml_diff>
--- a/Proposal/Group 15 proposal.docx
+++ b/Proposal/Group 15 proposal.docx
@@ -19,7 +19,7 @@
           <w:lang w:eastAsia="en-GB"/>
         </w:rPr>
         <w:drawing>
-          <wp:anchor distT="0" distB="0" distL="114300" distR="114300" simplePos="0" relativeHeight="251659264" behindDoc="0" locked="0" layoutInCell="1" allowOverlap="1" wp14:anchorId="08A008BB" wp14:editId="100F4930">
+          <wp:anchor distT="0" distB="0" distL="114300" distR="114300" simplePos="0" relativeHeight="251659264" behindDoc="0" locked="0" layoutInCell="1" allowOverlap="1" wp14:anchorId="5D45EC44" wp14:editId="5E85E5B6">
             <wp:simplePos x="0" y="0"/>
             <wp:positionH relativeFrom="margin">
               <wp:posOffset>-512445</wp:posOffset>
@@ -1075,7 +1075,7 @@
             </w:rPr>
             <w:fldChar w:fldCharType="separate"/>
           </w:r>
-          <w:hyperlink w:anchor="_Toc234742405" w:history="1">
+          <w:hyperlink w:anchor="_Toc235630712" w:history="1">
             <w:r>
               <w:rPr>
                 <w:rStyle w:val="Hyperlink"/>
@@ -1103,7 +1103,7 @@
                 <w:noProof/>
                 <w:webHidden/>
               </w:rPr>
-              <w:instrText xml:space="preserve"> PAGEREF _Toc234742405 \h </w:instrText>
+              <w:instrText xml:space="preserve"> PAGEREF _Toc235630712 \h </w:instrText>
             </w:r>
             <w:r>
               <w:rPr>
@@ -1144,7 +1144,7 @@
               <w:noProof/>
             </w:rPr>
           </w:pPr>
-          <w:hyperlink w:anchor="_Toc234742406" w:history="1">
+          <w:hyperlink w:anchor="_Toc235630713" w:history="1">
             <w:r>
               <w:rPr>
                 <w:rStyle w:val="Hyperlink"/>
@@ -1172,7 +1172,7 @@
                 <w:noProof/>
                 <w:webHidden/>
               </w:rPr>
-              <w:instrText xml:space="preserve"> PAGEREF _Toc234742406 \h </w:instrText>
+              <w:instrText xml:space="preserve"> PAGEREF _Toc235630713 \h </w:instrText>
             </w:r>
             <w:r>
               <w:rPr>
@@ -1213,7 +1213,7 @@
               <w:noProof/>
             </w:rPr>
           </w:pPr>
-          <w:hyperlink w:anchor="_Toc234742407" w:history="1">
+          <w:hyperlink w:anchor="_Toc235630714" w:history="1">
             <w:r>
               <w:rPr>
                 <w:rStyle w:val="Hyperlink"/>
@@ -1241,7 +1241,7 @@
                 <w:noProof/>
                 <w:webHidden/>
               </w:rPr>
-              <w:instrText xml:space="preserve"> PAGEREF _Toc234742407 \h </w:instrText>
+              <w:instrText xml:space="preserve"> PAGEREF _Toc235630714 \h </w:instrText>
             </w:r>
             <w:r>
               <w:rPr>
@@ -1282,7 +1282,7 @@
               <w:noProof/>
             </w:rPr>
           </w:pPr>
-          <w:hyperlink w:anchor="_Toc234742408" w:history="1">
+          <w:hyperlink w:anchor="_Toc235630715" w:history="1">
             <w:r>
               <w:rPr>
                 <w:rStyle w:val="Hyperlink"/>
@@ -1310,7 +1310,7 @@
                 <w:noProof/>
                 <w:webHidden/>
               </w:rPr>
-              <w:instrText xml:space="preserve"> PAGEREF _Toc234742408 \h </w:instrText>
+              <w:instrText xml:space="preserve"> PAGEREF _Toc235630715 \h </w:instrText>
             </w:r>
             <w:r>
               <w:rPr>
@@ -1351,7 +1351,7 @@
               <w:noProof/>
             </w:rPr>
           </w:pPr>
-          <w:hyperlink w:anchor="_Toc234742409" w:history="1">
+          <w:hyperlink w:anchor="_Toc235630716" w:history="1">
             <w:r>
               <w:rPr>
                 <w:rStyle w:val="Hyperlink"/>
@@ -1379,7 +1379,7 @@
                 <w:noProof/>
                 <w:webHidden/>
               </w:rPr>
-              <w:instrText xml:space="preserve"> PAGEREF _Toc234742409 \h </w:instrText>
+              <w:instrText xml:space="preserve"> PAGEREF _Toc235630716 \h </w:instrText>
             </w:r>
             <w:r>
               <w:rPr>
@@ -1420,7 +1420,7 @@
               <w:noProof/>
             </w:rPr>
           </w:pPr>
-          <w:hyperlink w:anchor="_Toc234742410" w:history="1">
+          <w:hyperlink w:anchor="_Toc235630717" w:history="1">
             <w:r>
               <w:rPr>
                 <w:rStyle w:val="Hyperlink"/>
@@ -1448,7 +1448,7 @@
                 <w:noProof/>
                 <w:webHidden/>
               </w:rPr>
-              <w:instrText xml:space="preserve"> PAGEREF _Toc234742410 \h </w:instrText>
+              <w:instrText xml:space="preserve"> PAGEREF _Toc235630717 \h </w:instrText>
             </w:r>
             <w:r>
               <w:rPr>
@@ -1489,7 +1489,7 @@
               <w:noProof/>
             </w:rPr>
           </w:pPr>
-          <w:hyperlink w:anchor="_Toc234742411" w:history="1">
+          <w:hyperlink w:anchor="_Toc235630718" w:history="1">
             <w:r>
               <w:rPr>
                 <w:rStyle w:val="Hyperlink"/>
@@ -1517,7 +1517,7 @@
                 <w:noProof/>
                 <w:webHidden/>
               </w:rPr>
-              <w:instrText xml:space="preserve"> PAGEREF _Toc234742411 \h </w:instrText>
+              <w:instrText xml:space="preserve"> PAGEREF _Toc235630718 \h </w:instrText>
             </w:r>
             <w:r>
               <w:rPr>
@@ -1558,7 +1558,7 @@
               <w:noProof/>
             </w:rPr>
           </w:pPr>
-          <w:hyperlink w:anchor="_Toc234742412" w:history="1">
+          <w:hyperlink w:anchor="_Toc235630719" w:history="1">
             <w:r>
               <w:rPr>
                 <w:rStyle w:val="Hyperlink"/>
@@ -1586,7 +1586,7 @@
                 <w:noProof/>
                 <w:webHidden/>
               </w:rPr>
-              <w:instrText xml:space="preserve"> PAGEREF _Toc234742412 \h </w:instrText>
+              <w:instrText xml:space="preserve"> PAGEREF _Toc235630719 \h </w:instrText>
             </w:r>
             <w:r>
               <w:rPr>
@@ -1627,7 +1627,7 @@
               <w:noProof/>
             </w:rPr>
           </w:pPr>
-          <w:hyperlink w:anchor="_Toc234742413" w:history="1">
+          <w:hyperlink w:anchor="_Toc235630720" w:history="1">
             <w:r>
               <w:rPr>
                 <w:rStyle w:val="Hyperlink"/>
@@ -1655,7 +1655,7 @@
                 <w:noProof/>
                 <w:webHidden/>
               </w:rPr>
-              <w:instrText xml:space="preserve"> PAGEREF _Toc234742413 \h </w:instrText>
+              <w:instrText xml:space="preserve"> PAGEREF _Toc235630720 \h </w:instrText>
             </w:r>
             <w:r>
               <w:rPr>
@@ -1696,7 +1696,7 @@
               <w:noProof/>
             </w:rPr>
           </w:pPr>
-          <w:hyperlink w:anchor="_Toc234742414" w:history="1">
+          <w:hyperlink w:anchor="_Toc235630721" w:history="1">
             <w:r>
               <w:rPr>
                 <w:rStyle w:val="Hyperlink"/>
@@ -1724,7 +1724,7 @@
                 <w:noProof/>
                 <w:webHidden/>
               </w:rPr>
-              <w:instrText xml:space="preserve"> PAGEREF _Toc234742414 \h </w:instrText>
+              <w:instrText xml:space="preserve"> PAGEREF _Toc235630721 \h </w:instrText>
             </w:r>
             <w:r>
               <w:rPr>
@@ -1765,7 +1765,7 @@
               <w:noProof/>
             </w:rPr>
           </w:pPr>
-          <w:hyperlink w:anchor="_Toc234742415" w:history="1">
+          <w:hyperlink w:anchor="_Toc235630722" w:history="1">
             <w:r>
               <w:rPr>
                 <w:rStyle w:val="Hyperlink"/>
@@ -1793,7 +1793,7 @@
                 <w:noProof/>
                 <w:webHidden/>
               </w:rPr>
-              <w:instrText xml:space="preserve"> PAGEREF _Toc234742415 \h </w:instrText>
+              <w:instrText xml:space="preserve"> PAGEREF _Toc235630722 \h </w:instrText>
             </w:r>
             <w:r>
               <w:rPr>
@@ -1834,7 +1834,7 @@
               <w:noProof/>
             </w:rPr>
           </w:pPr>
-          <w:hyperlink w:anchor="_Toc234742416" w:history="1">
+          <w:hyperlink w:anchor="_Toc235630723" w:history="1">
             <w:r>
               <w:rPr>
                 <w:rStyle w:val="Hyperlink"/>
@@ -1862,7 +1862,7 @@
                 <w:noProof/>
                 <w:webHidden/>
               </w:rPr>
-              <w:instrText xml:space="preserve"> PAGEREF _Toc234742416 \h </w:instrText>
+              <w:instrText xml:space="preserve"> PAGEREF _Toc235630723 \h </w:instrText>
             </w:r>
             <w:r>
               <w:rPr>
@@ -1903,7 +1903,7 @@
               <w:noProof/>
             </w:rPr>
           </w:pPr>
-          <w:hyperlink w:anchor="_Toc234742417" w:history="1">
+          <w:hyperlink w:anchor="_Toc235630724" w:history="1">
             <w:r>
               <w:rPr>
                 <w:rStyle w:val="Hyperlink"/>
@@ -1931,7 +1931,7 @@
                 <w:noProof/>
                 <w:webHidden/>
               </w:rPr>
-              <w:instrText xml:space="preserve"> PAGEREF _Toc234742417 \h </w:instrText>
+              <w:instrText xml:space="preserve"> PAGEREF _Toc235630724 \h </w:instrText>
             </w:r>
             <w:r>
               <w:rPr>
@@ -1972,7 +1972,7 @@
               <w:noProof/>
             </w:rPr>
           </w:pPr>
-          <w:hyperlink w:anchor="_Toc234742418" w:history="1">
+          <w:hyperlink w:anchor="_Toc235630725" w:history="1">
             <w:r>
               <w:rPr>
                 <w:rStyle w:val="Hyperlink"/>
@@ -2000,7 +2000,7 @@
                 <w:noProof/>
                 <w:webHidden/>
               </w:rPr>
-              <w:instrText xml:space="preserve"> PAGEREF _Toc234742418 \h </w:instrText>
+              <w:instrText xml:space="preserve"> PAGEREF _Toc235630725 \h </w:instrText>
             </w:r>
             <w:r>
               <w:rPr>
@@ -2041,7 +2041,7 @@
               <w:noProof/>
             </w:rPr>
           </w:pPr>
-          <w:hyperlink w:anchor="_Toc234742419" w:history="1">
+          <w:hyperlink w:anchor="_Toc235630726" w:history="1">
             <w:r>
               <w:rPr>
                 <w:rStyle w:val="Hyperlink"/>
@@ -2069,7 +2069,7 @@
                 <w:noProof/>
                 <w:webHidden/>
               </w:rPr>
-              <w:instrText xml:space="preserve"> PAGEREF _Toc234742419 \h </w:instrText>
+              <w:instrText xml:space="preserve"> PAGEREF _Toc235630726 \h </w:instrText>
             </w:r>
             <w:r>
               <w:rPr>
@@ -2110,7 +2110,7 @@
               <w:noProof/>
             </w:rPr>
           </w:pPr>
-          <w:hyperlink w:anchor="_Toc234742420" w:history="1">
+          <w:hyperlink w:anchor="_Toc235630727" w:history="1">
             <w:r>
               <w:rPr>
                 <w:rStyle w:val="Hyperlink"/>
@@ -2138,7 +2138,7 @@
                 <w:noProof/>
                 <w:webHidden/>
               </w:rPr>
-              <w:instrText xml:space="preserve"> PAGEREF _Toc234742420 \h </w:instrText>
+              <w:instrText xml:space="preserve"> PAGEREF _Toc235630727 \h </w:instrText>
             </w:r>
             <w:r>
               <w:rPr>
@@ -2179,7 +2179,7 @@
               <w:noProof/>
             </w:rPr>
           </w:pPr>
-          <w:hyperlink w:anchor="_Toc234742421" w:history="1">
+          <w:hyperlink w:anchor="_Toc235630728" w:history="1">
             <w:r>
               <w:rPr>
                 <w:rStyle w:val="Hyperlink"/>
@@ -2207,7 +2207,7 @@
                 <w:noProof/>
                 <w:webHidden/>
               </w:rPr>
-              <w:instrText xml:space="preserve"> PAGEREF _Toc234742421 \h </w:instrText>
+              <w:instrText xml:space="preserve"> PAGEREF _Toc235630728 \h </w:instrText>
             </w:r>
             <w:r>
               <w:rPr>
@@ -2248,7 +2248,7 @@
               <w:noProof/>
             </w:rPr>
           </w:pPr>
-          <w:hyperlink w:anchor="_Toc234742422" w:history="1">
+          <w:hyperlink w:anchor="_Toc235630729" w:history="1">
             <w:r>
               <w:rPr>
                 <w:rStyle w:val="Hyperlink"/>
@@ -2276,7 +2276,7 @@
                 <w:noProof/>
                 <w:webHidden/>
               </w:rPr>
-              <w:instrText xml:space="preserve"> PAGEREF _Toc234742422 \h </w:instrText>
+              <w:instrText xml:space="preserve"> PAGEREF _Toc235630729 \h </w:instrText>
             </w:r>
             <w:r>
               <w:rPr>
@@ -2317,7 +2317,7 @@
               <w:noProof/>
             </w:rPr>
           </w:pPr>
-          <w:hyperlink w:anchor="_Toc234742423" w:history="1">
+          <w:hyperlink w:anchor="_Toc235630730" w:history="1">
             <w:r>
               <w:rPr>
                 <w:rStyle w:val="Hyperlink"/>
@@ -2345,7 +2345,7 @@
                 <w:noProof/>
                 <w:webHidden/>
               </w:rPr>
-              <w:instrText xml:space="preserve"> PAGEREF _Toc234742423 \h </w:instrText>
+              <w:instrText xml:space="preserve"> PAGEREF _Toc235630730 \h </w:instrText>
             </w:r>
             <w:r>
               <w:rPr>
@@ -2386,7 +2386,7 @@
               <w:noProof/>
             </w:rPr>
           </w:pPr>
-          <w:hyperlink w:anchor="_Toc234742424" w:history="1">
+          <w:hyperlink w:anchor="_Toc235630731" w:history="1">
             <w:r>
               <w:rPr>
                 <w:rStyle w:val="Hyperlink"/>
@@ -2414,7 +2414,7 @@
                 <w:noProof/>
                 <w:webHidden/>
               </w:rPr>
-              <w:instrText xml:space="preserve"> PAGEREF _Toc234742424 \h </w:instrText>
+              <w:instrText xml:space="preserve"> PAGEREF _Toc235630731 \h </w:instrText>
             </w:r>
             <w:r>
               <w:rPr>
@@ -2455,7 +2455,7 @@
               <w:noProof/>
             </w:rPr>
           </w:pPr>
-          <w:hyperlink w:anchor="_Toc234742425" w:history="1">
+          <w:hyperlink w:anchor="_Toc235630732" w:history="1">
             <w:r>
               <w:rPr>
                 <w:rStyle w:val="Hyperlink"/>
@@ -2483,7 +2483,7 @@
                 <w:noProof/>
                 <w:webHidden/>
               </w:rPr>
-              <w:instrText xml:space="preserve"> PAGEREF _Toc234742425 \h </w:instrText>
+              <w:instrText xml:space="preserve"> PAGEREF _Toc235630732 \h </w:instrText>
             </w:r>
             <w:r>
               <w:rPr>
@@ -2524,7 +2524,7 @@
               <w:noProof/>
             </w:rPr>
           </w:pPr>
-          <w:hyperlink w:anchor="_Toc234742426" w:history="1">
+          <w:hyperlink w:anchor="_Toc235630733" w:history="1">
             <w:r>
               <w:rPr>
                 <w:rStyle w:val="Hyperlink"/>
@@ -2552,7 +2552,7 @@
                 <w:noProof/>
                 <w:webHidden/>
               </w:rPr>
-              <w:instrText xml:space="preserve"> PAGEREF _Toc234742426 \h </w:instrText>
+              <w:instrText xml:space="preserve"> PAGEREF _Toc235630733 \h </w:instrText>
             </w:r>
             <w:r>
               <w:rPr>
@@ -2593,7 +2593,7 @@
               <w:noProof/>
             </w:rPr>
           </w:pPr>
-          <w:hyperlink w:anchor="_Toc234742427" w:history="1">
+          <w:hyperlink w:anchor="_Toc235630734" w:history="1">
             <w:r>
               <w:rPr>
                 <w:rStyle w:val="Hyperlink"/>
@@ -2621,7 +2621,7 @@
                 <w:noProof/>
                 <w:webHidden/>
               </w:rPr>
-              <w:instrText xml:space="preserve"> PAGEREF _Toc234742427 \h </w:instrText>
+              <w:instrText xml:space="preserve"> PAGEREF _Toc235630734 \h </w:instrText>
             </w:r>
             <w:r>
               <w:rPr>
@@ -2662,7 +2662,7 @@
               <w:noProof/>
             </w:rPr>
           </w:pPr>
-          <w:hyperlink w:anchor="_Toc234742428" w:history="1">
+          <w:hyperlink w:anchor="_Toc235630735" w:history="1">
             <w:r>
               <w:rPr>
                 <w:rStyle w:val="Hyperlink"/>
@@ -2690,7 +2690,7 @@
                 <w:noProof/>
                 <w:webHidden/>
               </w:rPr>
-              <w:instrText xml:space="preserve"> PAGEREF _Toc234742428 \h </w:instrText>
+              <w:instrText xml:space="preserve"> PAGEREF _Toc235630735 \h </w:instrText>
             </w:r>
             <w:r>
               <w:rPr>
@@ -2731,7 +2731,7 @@
               <w:noProof/>
             </w:rPr>
           </w:pPr>
-          <w:hyperlink w:anchor="_Toc234742429" w:history="1">
+          <w:hyperlink w:anchor="_Toc235630736" w:history="1">
             <w:r>
               <w:rPr>
                 <w:rStyle w:val="Hyperlink"/>
@@ -2759,7 +2759,7 @@
                 <w:noProof/>
                 <w:webHidden/>
               </w:rPr>
-              <w:instrText xml:space="preserve"> PAGEREF _Toc234742429 \h </w:instrText>
+              <w:instrText xml:space="preserve"> PAGEREF _Toc235630736 \h </w:instrText>
             </w:r>
             <w:r>
               <w:rPr>
@@ -2800,7 +2800,7 @@
               <w:noProof/>
             </w:rPr>
           </w:pPr>
-          <w:hyperlink w:anchor="_Toc234742430" w:history="1">
+          <w:hyperlink w:anchor="_Toc235630737" w:history="1">
             <w:r>
               <w:rPr>
                 <w:rStyle w:val="Hyperlink"/>
@@ -2828,7 +2828,7 @@
                 <w:noProof/>
                 <w:webHidden/>
               </w:rPr>
-              <w:instrText xml:space="preserve"> PAGEREF _Toc234742430 \h </w:instrText>
+              <w:instrText xml:space="preserve"> PAGEREF _Toc235630737 \h </w:instrText>
             </w:r>
             <w:r>
               <w:rPr>
@@ -2869,7 +2869,7 @@
               <w:noProof/>
             </w:rPr>
           </w:pPr>
-          <w:hyperlink w:anchor="_Toc234742431" w:history="1">
+          <w:hyperlink w:anchor="_Toc235630738" w:history="1">
             <w:r>
               <w:rPr>
                 <w:rStyle w:val="Hyperlink"/>
@@ -2897,7 +2897,7 @@
                 <w:noProof/>
                 <w:webHidden/>
               </w:rPr>
-              <w:instrText xml:space="preserve"> PAGEREF _Toc234742431 \h </w:instrText>
+              <w:instrText xml:space="preserve"> PAGEREF _Toc235630738 \h </w:instrText>
             </w:r>
             <w:r>
               <w:rPr>
@@ -2938,7 +2938,7 @@
               <w:noProof/>
             </w:rPr>
           </w:pPr>
-          <w:hyperlink w:anchor="_Toc234742432" w:history="1">
+          <w:hyperlink w:anchor="_Toc235630739" w:history="1">
             <w:r>
               <w:rPr>
                 <w:rStyle w:val="Hyperlink"/>
@@ -2966,7 +2966,7 @@
                 <w:noProof/>
                 <w:webHidden/>
               </w:rPr>
-              <w:instrText xml:space="preserve"> PAGEREF _Toc234742432 \h </w:instrText>
+              <w:instrText xml:space="preserve"> PAGEREF _Toc235630739 \h </w:instrText>
             </w:r>
             <w:r>
               <w:rPr>
@@ -3007,7 +3007,7 @@
               <w:noProof/>
             </w:rPr>
           </w:pPr>
-          <w:hyperlink w:anchor="_Toc234742433" w:history="1">
+          <w:hyperlink w:anchor="_Toc235630740" w:history="1">
             <w:r>
               <w:rPr>
                 <w:rStyle w:val="Hyperlink"/>
@@ -3035,7 +3035,7 @@
                 <w:noProof/>
                 <w:webHidden/>
               </w:rPr>
-              <w:instrText xml:space="preserve"> PAGEREF _Toc234742433 \h </w:instrText>
+              <w:instrText xml:space="preserve"> PAGEREF _Toc235630740 \h </w:instrText>
             </w:r>
             <w:r>
               <w:rPr>
@@ -3055,7 +3055,7 @@
                 <w:noProof/>
                 <w:webHidden/>
               </w:rPr>
-              <w:t>12</w:t>
+              <w:t>13</w:t>
             </w:r>
             <w:r>
               <w:rPr>
@@ -3076,7 +3076,7 @@
               <w:noProof/>
             </w:rPr>
           </w:pPr>
-          <w:hyperlink w:anchor="_Toc234742434" w:history="1">
+          <w:hyperlink w:anchor="_Toc235630741" w:history="1">
             <w:r>
               <w:rPr>
                 <w:rStyle w:val="Hyperlink"/>
@@ -3104,7 +3104,7 @@
                 <w:noProof/>
                 <w:webHidden/>
               </w:rPr>
-              <w:instrText xml:space="preserve"> PAGEREF _Toc234742434 \h </w:instrText>
+              <w:instrText xml:space="preserve"> PAGEREF _Toc235630741 \h </w:instrText>
             </w:r>
             <w:r>
               <w:rPr>
@@ -3145,7 +3145,7 @@
               <w:noProof/>
             </w:rPr>
           </w:pPr>
-          <w:hyperlink w:anchor="_Toc234742435" w:history="1">
+          <w:hyperlink w:anchor="_Toc235630742" w:history="1">
             <w:r>
               <w:rPr>
                 <w:rStyle w:val="Hyperlink"/>
@@ -3173,7 +3173,7 @@
                 <w:noProof/>
                 <w:webHidden/>
               </w:rPr>
-              <w:instrText xml:space="preserve"> PAGEREF _Toc234742435 \h </w:instrText>
+              <w:instrText xml:space="preserve"> PAGEREF _Toc235630742 \h </w:instrText>
             </w:r>
             <w:r>
               <w:rPr>
@@ -3214,10 +3214,11 @@
               <w:noProof/>
             </w:rPr>
           </w:pPr>
-          <w:hyperlink w:anchor="_Toc234742436" w:history="1">
+          <w:hyperlink w:anchor="_Toc235630743" w:history="1">
             <w:r>
               <w:rPr>
                 <w:rStyle w:val="Hyperlink"/>
+                <w:rFonts w:ascii="Times New Roman" w:hAnsi="Times New Roman" w:cs="Times New Roman"/>
                 <w:noProof/>
               </w:rPr>
               <w:t>CHAPTER FOUR</w:t>
@@ -3241,7 +3242,7 @@
                 <w:noProof/>
                 <w:webHidden/>
               </w:rPr>
-              <w:instrText xml:space="preserve"> PAGEREF _Toc234742436 \h </w:instrText>
+              <w:instrText xml:space="preserve"> PAGEREF _Toc235630743 \h </w:instrText>
             </w:r>
             <w:r>
               <w:rPr>
@@ -3282,7 +3283,7 @@
               <w:noProof/>
             </w:rPr>
           </w:pPr>
-          <w:hyperlink w:anchor="_Toc234742437" w:history="1">
+          <w:hyperlink w:anchor="_Toc235630744" w:history="1">
             <w:r>
               <w:rPr>
                 <w:rStyle w:val="Hyperlink"/>
@@ -3310,7 +3311,7 @@
                 <w:noProof/>
                 <w:webHidden/>
               </w:rPr>
-              <w:instrText xml:space="preserve"> PAGEREF _Toc234742437 \h </w:instrText>
+              <w:instrText xml:space="preserve"> PAGEREF _Toc235630744 \h </w:instrText>
             </w:r>
             <w:r>
               <w:rPr>
@@ -3351,7 +3352,7 @@
               <w:noProof/>
             </w:rPr>
           </w:pPr>
-          <w:hyperlink w:anchor="_Toc234742438" w:history="1">
+          <w:hyperlink w:anchor="_Toc235630745" w:history="1">
             <w:r>
               <w:rPr>
                 <w:rStyle w:val="Hyperlink"/>
@@ -3379,7 +3380,7 @@
                 <w:noProof/>
                 <w:webHidden/>
               </w:rPr>
-              <w:instrText xml:space="preserve"> PAGEREF _Toc234742438 \h </w:instrText>
+              <w:instrText xml:space="preserve"> PAGEREF _Toc235630745 \h </w:instrText>
             </w:r>
             <w:r>
               <w:rPr>
@@ -3420,7 +3421,7 @@
               <w:noProof/>
             </w:rPr>
           </w:pPr>
-          <w:hyperlink w:anchor="_Toc234742439" w:history="1">
+          <w:hyperlink w:anchor="_Toc235630746" w:history="1">
             <w:r>
               <w:rPr>
                 <w:rStyle w:val="Hyperlink"/>
@@ -3448,7 +3449,7 @@
                 <w:noProof/>
                 <w:webHidden/>
               </w:rPr>
-              <w:instrText xml:space="preserve"> PAGEREF _Toc234742439 \h </w:instrText>
+              <w:instrText xml:space="preserve"> PAGEREF _Toc235630746 \h </w:instrText>
             </w:r>
             <w:r>
               <w:rPr>
@@ -3468,7 +3469,7 @@
                 <w:noProof/>
                 <w:webHidden/>
               </w:rPr>
-              <w:t>14</w:t>
+              <w:t>15</w:t>
             </w:r>
             <w:r>
               <w:rPr>
@@ -3489,7 +3490,7 @@
               <w:noProof/>
             </w:rPr>
           </w:pPr>
-          <w:hyperlink w:anchor="_Toc234742440" w:history="1">
+          <w:hyperlink w:anchor="_Toc235630747" w:history="1">
             <w:r>
               <w:rPr>
                 <w:rStyle w:val="Hyperlink"/>
@@ -3517,7 +3518,7 @@
                 <w:noProof/>
                 <w:webHidden/>
               </w:rPr>
-              <w:instrText xml:space="preserve"> PAGEREF _Toc234742440 \h </w:instrText>
+              <w:instrText xml:space="preserve"> PAGEREF _Toc235630747 \h </w:instrText>
             </w:r>
             <w:r>
               <w:rPr>
@@ -3537,7 +3538,7 @@
                 <w:noProof/>
                 <w:webHidden/>
               </w:rPr>
-              <w:t>15</w:t>
+              <w:t>16</w:t>
             </w:r>
             <w:r>
               <w:rPr>
@@ -3558,7 +3559,7 @@
               <w:noProof/>
             </w:rPr>
           </w:pPr>
-          <w:hyperlink w:anchor="_Toc234742441" w:history="1">
+          <w:hyperlink w:anchor="_Toc235630748" w:history="1">
             <w:r>
               <w:rPr>
                 <w:rStyle w:val="Hyperlink"/>
@@ -3586,7 +3587,7 @@
                 <w:noProof/>
                 <w:webHidden/>
               </w:rPr>
-              <w:instrText xml:space="preserve"> PAGEREF _Toc234742441 \h </w:instrText>
+              <w:instrText xml:space="preserve"> PAGEREF _Toc235630748 \h </w:instrText>
             </w:r>
             <w:r>
               <w:rPr>
@@ -3606,7 +3607,7 @@
                 <w:noProof/>
                 <w:webHidden/>
               </w:rPr>
-              <w:t>15</w:t>
+              <w:t>19</w:t>
             </w:r>
             <w:r>
               <w:rPr>
@@ -3627,10 +3628,11 @@
               <w:noProof/>
             </w:rPr>
           </w:pPr>
-          <w:hyperlink w:anchor="_Toc234742442" w:history="1">
+          <w:hyperlink w:anchor="_Toc235630749" w:history="1">
             <w:r>
               <w:rPr>
                 <w:rStyle w:val="Hyperlink"/>
+                <w:rFonts w:ascii="Times New Roman" w:hAnsi="Times New Roman" w:cs="Times New Roman"/>
                 <w:noProof/>
               </w:rPr>
               <w:t>CHAPTER FIVE</w:t>
@@ -3654,7 +3656,7 @@
                 <w:noProof/>
                 <w:webHidden/>
               </w:rPr>
-              <w:instrText xml:space="preserve"> PAGEREF _Toc234742442 \h </w:instrText>
+              <w:instrText xml:space="preserve"> PAGEREF _Toc235630749 \h </w:instrText>
             </w:r>
             <w:r>
               <w:rPr>
@@ -3674,7 +3676,7 @@
                 <w:noProof/>
                 <w:webHidden/>
               </w:rPr>
-              <w:t>16</w:t>
+              <w:t>21</w:t>
             </w:r>
             <w:r>
               <w:rPr>
@@ -3695,7 +3697,7 @@
               <w:noProof/>
             </w:rPr>
           </w:pPr>
-          <w:hyperlink w:anchor="_Toc234742443" w:history="1">
+          <w:hyperlink w:anchor="_Toc235630750" w:history="1">
             <w:r>
               <w:rPr>
                 <w:rStyle w:val="Hyperlink"/>
@@ -3723,7 +3725,7 @@
                 <w:noProof/>
                 <w:webHidden/>
               </w:rPr>
-              <w:instrText xml:space="preserve"> PAGEREF _Toc234742443 \h </w:instrText>
+              <w:instrText xml:space="preserve"> PAGEREF _Toc235630750 \h </w:instrText>
             </w:r>
             <w:r>
               <w:rPr>
@@ -3743,7 +3745,7 @@
                 <w:noProof/>
                 <w:webHidden/>
               </w:rPr>
-              <w:t>16</w:t>
+              <w:t>21</w:t>
             </w:r>
             <w:r>
               <w:rPr>
@@ -3764,7 +3766,7 @@
               <w:noProof/>
             </w:rPr>
           </w:pPr>
-          <w:hyperlink w:anchor="_Toc234742444" w:history="1">
+          <w:hyperlink w:anchor="_Toc235630751" w:history="1">
             <w:r>
               <w:rPr>
                 <w:rStyle w:val="Hyperlink"/>
@@ -3792,7 +3794,7 @@
                 <w:noProof/>
                 <w:webHidden/>
               </w:rPr>
-              <w:instrText xml:space="preserve"> PAGEREF _Toc234742444 \h </w:instrText>
+              <w:instrText xml:space="preserve"> PAGEREF _Toc235630751 \h </w:instrText>
             </w:r>
             <w:r>
               <w:rPr>
@@ -3812,7 +3814,7 @@
                 <w:noProof/>
                 <w:webHidden/>
               </w:rPr>
-              <w:t>16</w:t>
+              <w:t>21</w:t>
             </w:r>
             <w:r>
               <w:rPr>
@@ -3833,7 +3835,7 @@
               <w:noProof/>
             </w:rPr>
           </w:pPr>
-          <w:hyperlink w:anchor="_Toc234742445" w:history="1">
+          <w:hyperlink w:anchor="_Toc235630752" w:history="1">
             <w:r>
               <w:rPr>
                 <w:rStyle w:val="Hyperlink"/>
@@ -3861,7 +3863,7 @@
                 <w:noProof/>
                 <w:webHidden/>
               </w:rPr>
-              <w:instrText xml:space="preserve"> PAGEREF _Toc234742445 \h </w:instrText>
+              <w:instrText xml:space="preserve"> PAGEREF _Toc235630752 \h </w:instrText>
             </w:r>
             <w:r>
               <w:rPr>
@@ -3881,7 +3883,7 @@
                 <w:noProof/>
                 <w:webHidden/>
               </w:rPr>
-              <w:t>17</w:t>
+              <w:t>22</w:t>
             </w:r>
             <w:r>
               <w:rPr>
@@ -3902,7 +3904,7 @@
               <w:noProof/>
             </w:rPr>
           </w:pPr>
-          <w:hyperlink w:anchor="_Toc234742446" w:history="1">
+          <w:hyperlink w:anchor="_Toc235630753" w:history="1">
             <w:r>
               <w:rPr>
                 <w:rStyle w:val="Hyperlink"/>
@@ -3930,7 +3932,7 @@
                 <w:noProof/>
                 <w:webHidden/>
               </w:rPr>
-              <w:instrText xml:space="preserve"> PAGEREF _Toc234742446 \h </w:instrText>
+              <w:instrText xml:space="preserve"> PAGEREF _Toc235630753 \h </w:instrText>
             </w:r>
             <w:r>
               <w:rPr>
@@ -3950,7 +3952,7 @@
                 <w:noProof/>
                 <w:webHidden/>
               </w:rPr>
-              <w:t>17</w:t>
+              <w:t>23</w:t>
             </w:r>
             <w:r>
               <w:rPr>
@@ -3971,7 +3973,7 @@
               <w:noProof/>
             </w:rPr>
           </w:pPr>
-          <w:hyperlink w:anchor="_Toc234742447" w:history="1">
+          <w:hyperlink w:anchor="_Toc235630754" w:history="1">
             <w:r>
               <w:rPr>
                 <w:rStyle w:val="Hyperlink"/>
@@ -3999,7 +4001,7 @@
                 <w:noProof/>
                 <w:webHidden/>
               </w:rPr>
-              <w:instrText xml:space="preserve"> PAGEREF _Toc234742447 \h </w:instrText>
+              <w:instrText xml:space="preserve"> PAGEREF _Toc235630754 \h </w:instrText>
             </w:r>
             <w:r>
               <w:rPr>
@@ -4019,7 +4021,7 @@
                 <w:noProof/>
                 <w:webHidden/>
               </w:rPr>
-              <w:t>18</w:t>
+              <w:t>24</w:t>
             </w:r>
             <w:r>
               <w:rPr>
@@ -4236,6 +4238,446 @@
     </w:p>
     <w:p>
       <w:pPr>
+        <w:jc w:val="both"/>
+        <w:rPr>
+          <w:rFonts w:ascii="Times New Roman" w:hAnsi="Times New Roman" w:cs="Times New Roman"/>
+          <w:sz w:val="24"/>
+          <w:szCs w:val="24"/>
+        </w:rPr>
+      </w:pPr>
+      <w:r>
+        <w:rPr>
+          <w:rFonts w:ascii="Times New Roman" w:hAnsi="Times New Roman" w:cs="Times New Roman"/>
+          <w:sz w:val="24"/>
+          <w:szCs w:val="24"/>
+        </w:rPr>
+        <w:t>Figure 3.1: Project phase/ framework activities timeline</w:t>
+      </w:r>
+      <w:r>
+        <w:rPr>
+          <w:rFonts w:ascii="Times New Roman" w:hAnsi="Times New Roman" w:cs="Times New Roman"/>
+          <w:sz w:val="24"/>
+          <w:szCs w:val="24"/>
+        </w:rPr>
+        <w:t>…………………………</w:t>
+      </w:r>
+      <w:r>
+        <w:rPr>
+          <w:rFonts w:ascii="Times New Roman" w:hAnsi="Times New Roman" w:cs="Times New Roman"/>
+          <w:sz w:val="24"/>
+          <w:szCs w:val="24"/>
+        </w:rPr>
+        <w:t>.</w:t>
+      </w:r>
+      <w:r>
+        <w:rPr>
+          <w:rFonts w:ascii="Times New Roman" w:hAnsi="Times New Roman" w:cs="Times New Roman"/>
+          <w:sz w:val="24"/>
+          <w:szCs w:val="24"/>
+        </w:rPr>
+        <w:t>………….13</w:t>
+      </w:r>
+    </w:p>
+    <w:p>
+      <w:pPr>
+        <w:jc w:val="both"/>
+        <w:rPr>
+          <w:rFonts w:ascii="Times New Roman" w:hAnsi="Times New Roman" w:cs="Times New Roman"/>
+          <w:sz w:val="24"/>
+          <w:szCs w:val="24"/>
+        </w:rPr>
+      </w:pPr>
+      <w:r>
+        <w:rPr>
+          <w:rFonts w:ascii="Times New Roman" w:hAnsi="Times New Roman" w:cs="Times New Roman"/>
+          <w:sz w:val="24"/>
+          <w:szCs w:val="24"/>
+        </w:rPr>
+        <w:t>Figure 4.1: SME credit overview showing the ML credit score, risk band, eligible financing, and score components</w:t>
+      </w:r>
+      <w:r>
+        <w:rPr>
+          <w:rFonts w:ascii="Times New Roman" w:hAnsi="Times New Roman" w:cs="Times New Roman"/>
+          <w:sz w:val="24"/>
+          <w:szCs w:val="24"/>
+        </w:rPr>
+        <w:t>………………………………………………………………………...</w:t>
+      </w:r>
+      <w:r>
+        <w:rPr>
+          <w:rFonts w:ascii="Times New Roman" w:hAnsi="Times New Roman" w:cs="Times New Roman"/>
+          <w:sz w:val="24"/>
+          <w:szCs w:val="24"/>
+        </w:rPr>
+        <w:t>14</w:t>
+      </w:r>
+    </w:p>
+    <w:p>
+      <w:pPr>
+        <w:jc w:val="both"/>
+        <w:rPr>
+          <w:rFonts w:ascii="Times New Roman" w:hAnsi="Times New Roman" w:cs="Times New Roman"/>
+          <w:sz w:val="24"/>
+          <w:szCs w:val="24"/>
+        </w:rPr>
+      </w:pPr>
+      <w:r>
+        <w:rPr>
+          <w:rFonts w:ascii="Times New Roman" w:hAnsi="Times New Roman" w:cs="Times New Roman"/>
+          <w:sz w:val="24"/>
+          <w:szCs w:val="24"/>
+        </w:rPr>
+        <w:t>Figure 4.2: Ushirika authentication screen (secure ID and PIN login)</w:t>
+      </w:r>
+      <w:r>
+        <w:rPr>
+          <w:rFonts w:ascii="Times New Roman" w:hAnsi="Times New Roman" w:cs="Times New Roman"/>
+          <w:sz w:val="24"/>
+          <w:szCs w:val="24"/>
+        </w:rPr>
+        <w:t xml:space="preserve"> ……………………......</w:t>
+      </w:r>
+      <w:r>
+        <w:rPr>
+          <w:rFonts w:ascii="Times New Roman" w:hAnsi="Times New Roman" w:cs="Times New Roman"/>
+          <w:sz w:val="24"/>
+          <w:szCs w:val="24"/>
+        </w:rPr>
+        <w:t>15</w:t>
+      </w:r>
+    </w:p>
+    <w:p>
+      <w:pPr>
+        <w:jc w:val="both"/>
+        <w:rPr>
+          <w:rFonts w:ascii="Times New Roman" w:hAnsi="Times New Roman" w:cs="Times New Roman"/>
+          <w:sz w:val="24"/>
+          <w:szCs w:val="24"/>
+        </w:rPr>
+      </w:pPr>
+      <w:r>
+        <w:rPr>
+          <w:rFonts w:ascii="Times New Roman" w:hAnsi="Times New Roman" w:cs="Times New Roman"/>
+          <w:sz w:val="24"/>
+          <w:szCs w:val="24"/>
+        </w:rPr>
+        <w:t>Figure 4.3: SME transaction register providing supply-chain activity used for feature engineering</w:t>
+      </w:r>
+      <w:r>
+        <w:rPr>
+          <w:rFonts w:ascii="Times New Roman" w:hAnsi="Times New Roman" w:cs="Times New Roman"/>
+          <w:sz w:val="24"/>
+          <w:szCs w:val="24"/>
+        </w:rPr>
+        <w:t>…………………………………………………………………………………..</w:t>
+      </w:r>
+      <w:r>
+        <w:rPr>
+          <w:rFonts w:ascii="Times New Roman" w:hAnsi="Times New Roman" w:cs="Times New Roman"/>
+          <w:sz w:val="24"/>
+          <w:szCs w:val="24"/>
+        </w:rPr>
+        <w:t>.</w:t>
+      </w:r>
+      <w:r>
+        <w:rPr>
+          <w:rFonts w:ascii="Times New Roman" w:hAnsi="Times New Roman" w:cs="Times New Roman"/>
+          <w:sz w:val="24"/>
+          <w:szCs w:val="24"/>
+        </w:rPr>
+        <w:t>16</w:t>
+      </w:r>
+    </w:p>
+    <w:p>
+      <w:pPr>
+        <w:jc w:val="both"/>
+        <w:rPr>
+          <w:rFonts w:ascii="Times New Roman" w:hAnsi="Times New Roman" w:cs="Times New Roman"/>
+          <w:sz w:val="24"/>
+          <w:szCs w:val="24"/>
+        </w:rPr>
+      </w:pPr>
+      <w:r>
+        <w:rPr>
+          <w:rFonts w:ascii="Times New Roman" w:hAnsi="Times New Roman" w:cs="Times New Roman"/>
+          <w:sz w:val="24"/>
+          <w:szCs w:val="24"/>
+        </w:rPr>
+        <w:t>Figure 4.4: CSV upload interface for importing transactional statements into the preprocessing pipeline</w:t>
+      </w:r>
+      <w:r>
+        <w:rPr>
+          <w:rFonts w:ascii="Times New Roman" w:hAnsi="Times New Roman" w:cs="Times New Roman"/>
+          <w:sz w:val="24"/>
+          <w:szCs w:val="24"/>
+        </w:rPr>
+        <w:t>……………………………………………………………………………………….</w:t>
+      </w:r>
+      <w:r>
+        <w:rPr>
+          <w:rFonts w:ascii="Times New Roman" w:hAnsi="Times New Roman" w:cs="Times New Roman"/>
+          <w:sz w:val="24"/>
+          <w:szCs w:val="24"/>
+        </w:rPr>
+        <w:t>16</w:t>
+      </w:r>
+    </w:p>
+    <w:p>
+      <w:pPr>
+        <w:jc w:val="both"/>
+        <w:rPr>
+          <w:rFonts w:ascii="Times New Roman" w:hAnsi="Times New Roman" w:cs="Times New Roman"/>
+          <w:sz w:val="24"/>
+          <w:szCs w:val="24"/>
+        </w:rPr>
+      </w:pPr>
+      <w:r>
+        <w:rPr>
+          <w:rFonts w:ascii="Times New Roman" w:hAnsi="Times New Roman" w:cs="Times New Roman"/>
+          <w:sz w:val="24"/>
+          <w:szCs w:val="24"/>
+        </w:rPr>
+        <w:t>Figure 4.5: Lender list of SMEs with risk classification, credit scores, and NIDA search</w:t>
+      </w:r>
+      <w:r>
+        <w:rPr>
+          <w:rFonts w:ascii="Times New Roman" w:hAnsi="Times New Roman" w:cs="Times New Roman"/>
+          <w:sz w:val="24"/>
+          <w:szCs w:val="24"/>
+        </w:rPr>
+        <w:t>…….</w:t>
+      </w:r>
+      <w:r>
+        <w:rPr>
+          <w:rFonts w:ascii="Times New Roman" w:hAnsi="Times New Roman" w:cs="Times New Roman"/>
+          <w:sz w:val="24"/>
+          <w:szCs w:val="24"/>
+        </w:rPr>
+        <w:t>17</w:t>
+      </w:r>
+    </w:p>
+    <w:p>
+      <w:pPr>
+        <w:jc w:val="both"/>
+        <w:rPr>
+          <w:rFonts w:ascii="Times New Roman" w:hAnsi="Times New Roman" w:cs="Times New Roman"/>
+          <w:sz w:val="24"/>
+          <w:szCs w:val="24"/>
+        </w:rPr>
+      </w:pPr>
+      <w:r>
+        <w:rPr>
+          <w:rFonts w:ascii="Times New Roman" w:hAnsi="Times New Roman" w:cs="Times New Roman"/>
+          <w:sz w:val="24"/>
+          <w:szCs w:val="24"/>
+        </w:rPr>
+        <w:t>Figure 4.6: Lender SME detail profile (including TIN) with tabbed ML analytics</w:t>
+      </w:r>
+      <w:r>
+        <w:rPr>
+          <w:rFonts w:ascii="Times New Roman" w:hAnsi="Times New Roman" w:cs="Times New Roman"/>
+          <w:sz w:val="24"/>
+          <w:szCs w:val="24"/>
+        </w:rPr>
+        <w:t>……………</w:t>
+      </w:r>
+      <w:r>
+        <w:rPr>
+          <w:rFonts w:ascii="Times New Roman" w:hAnsi="Times New Roman" w:cs="Times New Roman"/>
+          <w:sz w:val="24"/>
+          <w:szCs w:val="24"/>
+        </w:rPr>
+        <w:t>18</w:t>
+      </w:r>
+    </w:p>
+    <w:p>
+      <w:pPr>
+        <w:jc w:val="both"/>
+        <w:rPr>
+          <w:rFonts w:ascii="Times New Roman" w:hAnsi="Times New Roman" w:cs="Times New Roman"/>
+          <w:sz w:val="24"/>
+          <w:szCs w:val="24"/>
+        </w:rPr>
+      </w:pPr>
+      <w:r>
+        <w:rPr>
+          <w:rFonts w:ascii="Times New Roman" w:hAnsi="Times New Roman" w:cs="Times New Roman"/>
+          <w:sz w:val="24"/>
+          <w:szCs w:val="24"/>
+        </w:rPr>
+        <w:t>Figure 4.7: ML metrics panel for a selected SME (score, risk, probability, and financing)</w:t>
+      </w:r>
+      <w:r>
+        <w:rPr>
+          <w:rFonts w:ascii="Times New Roman" w:hAnsi="Times New Roman" w:cs="Times New Roman"/>
+          <w:sz w:val="24"/>
+          <w:szCs w:val="24"/>
+        </w:rPr>
+        <w:t xml:space="preserve"> ….</w:t>
+      </w:r>
+      <w:r>
+        <w:rPr>
+          <w:rFonts w:ascii="Times New Roman" w:hAnsi="Times New Roman" w:cs="Times New Roman"/>
+          <w:sz w:val="24"/>
+          <w:szCs w:val="24"/>
+        </w:rPr>
+        <w:t>.</w:t>
+      </w:r>
+      <w:r>
+        <w:rPr>
+          <w:rFonts w:ascii="Times New Roman" w:hAnsi="Times New Roman" w:cs="Times New Roman"/>
+          <w:sz w:val="24"/>
+          <w:szCs w:val="24"/>
+        </w:rPr>
+        <w:t>18</w:t>
+      </w:r>
+    </w:p>
+    <w:p>
+      <w:pPr>
+        <w:jc w:val="both"/>
+        <w:rPr>
+          <w:rFonts w:ascii="Times New Roman" w:hAnsi="Times New Roman" w:cs="Times New Roman"/>
+          <w:sz w:val="24"/>
+          <w:szCs w:val="24"/>
+        </w:rPr>
+      </w:pPr>
+      <w:r>
+        <w:rPr>
+          <w:rFonts w:ascii="Times New Roman" w:hAnsi="Times New Roman" w:cs="Times New Roman"/>
+          <w:sz w:val="24"/>
+          <w:szCs w:val="24"/>
+        </w:rPr>
+        <w:t>Figure 4.8: Explainable score signals derived from the SME’s engineered features</w:t>
+      </w:r>
+      <w:r>
+        <w:rPr>
+          <w:rFonts w:ascii="Times New Roman" w:hAnsi="Times New Roman" w:cs="Times New Roman"/>
+          <w:sz w:val="24"/>
+          <w:szCs w:val="24"/>
+        </w:rPr>
+        <w:t>………….</w:t>
+      </w:r>
+      <w:r>
+        <w:rPr>
+          <w:rFonts w:ascii="Times New Roman" w:hAnsi="Times New Roman" w:cs="Times New Roman"/>
+          <w:sz w:val="24"/>
+          <w:szCs w:val="24"/>
+        </w:rPr>
+        <w:t>19</w:t>
+      </w:r>
+    </w:p>
+    <w:p>
+      <w:pPr>
+        <w:jc w:val="both"/>
+        <w:rPr>
+          <w:rFonts w:ascii="Times New Roman" w:hAnsi="Times New Roman" w:cs="Times New Roman"/>
+          <w:sz w:val="24"/>
+          <w:szCs w:val="24"/>
+        </w:rPr>
+      </w:pPr>
+      <w:r>
+        <w:rPr>
+          <w:rFonts w:ascii="Times New Roman" w:hAnsi="Times New Roman" w:cs="Times New Roman"/>
+          <w:sz w:val="24"/>
+          <w:szCs w:val="24"/>
+        </w:rPr>
+        <w:t>Figure 4.9: Admin governance screen for managing SME and lender accounts in the prototype</w:t>
+      </w:r>
+      <w:r>
+        <w:rPr>
+          <w:rFonts w:ascii="Times New Roman" w:hAnsi="Times New Roman" w:cs="Times New Roman"/>
+          <w:sz w:val="24"/>
+          <w:szCs w:val="24"/>
+        </w:rPr>
+        <w:t>……………………………………………………………………………………...</w:t>
+      </w:r>
+      <w:r>
+        <w:rPr>
+          <w:rFonts w:ascii="Times New Roman" w:hAnsi="Times New Roman" w:cs="Times New Roman"/>
+          <w:sz w:val="24"/>
+          <w:szCs w:val="24"/>
+        </w:rPr>
+        <w:t>20</w:t>
+      </w:r>
+    </w:p>
+    <w:p>
+      <w:pPr>
+        <w:jc w:val="both"/>
+        <w:rPr>
+          <w:rFonts w:ascii="Times New Roman" w:hAnsi="Times New Roman" w:cs="Times New Roman"/>
+          <w:sz w:val="24"/>
+          <w:szCs w:val="24"/>
+        </w:rPr>
+      </w:pPr>
+      <w:r>
+        <w:rPr>
+          <w:rFonts w:ascii="Times New Roman" w:hAnsi="Times New Roman" w:cs="Times New Roman"/>
+          <w:sz w:val="24"/>
+          <w:szCs w:val="24"/>
+        </w:rPr>
+        <w:t>Figure 4.10: Recent transactions view used by lenders when reviewing an SME’s repayment behaviour</w:t>
+      </w:r>
+      <w:r>
+        <w:rPr>
+          <w:rFonts w:ascii="Times New Roman" w:hAnsi="Times New Roman" w:cs="Times New Roman"/>
+          <w:sz w:val="24"/>
+          <w:szCs w:val="24"/>
+        </w:rPr>
+        <w:t>…………………………………………………………………………………....</w:t>
+      </w:r>
+      <w:r>
+        <w:rPr>
+          <w:rFonts w:ascii="Times New Roman" w:hAnsi="Times New Roman" w:cs="Times New Roman"/>
+          <w:sz w:val="24"/>
+          <w:szCs w:val="24"/>
+        </w:rPr>
+        <w:t>.</w:t>
+      </w:r>
+      <w:r>
+        <w:rPr>
+          <w:rFonts w:ascii="Times New Roman" w:hAnsi="Times New Roman" w:cs="Times New Roman"/>
+          <w:sz w:val="24"/>
+          <w:szCs w:val="24"/>
+        </w:rPr>
+        <w:t>20</w:t>
+      </w:r>
+    </w:p>
+    <w:p>
+      <w:pPr>
+        <w:jc w:val="both"/>
+        <w:rPr>
+          <w:rFonts w:ascii="Times New Roman" w:hAnsi="Times New Roman" w:cs="Times New Roman"/>
+          <w:sz w:val="24"/>
+          <w:szCs w:val="24"/>
+        </w:rPr>
+      </w:pPr>
+      <w:r>
+        <w:rPr>
+          <w:rFonts w:ascii="Times New Roman" w:hAnsi="Times New Roman" w:cs="Times New Roman"/>
+          <w:sz w:val="24"/>
+          <w:szCs w:val="24"/>
+        </w:rPr>
+        <w:t>Figure 5.1: Admin create-lender form illustrating operational readiness of the deployed prototype</w:t>
+      </w:r>
+      <w:r>
+        <w:rPr>
+          <w:rFonts w:ascii="Times New Roman" w:hAnsi="Times New Roman" w:cs="Times New Roman"/>
+          <w:sz w:val="24"/>
+          <w:szCs w:val="24"/>
+        </w:rPr>
+        <w:t>……………………………………………………………………………………...</w:t>
+      </w:r>
+      <w:r>
+        <w:rPr>
+          <w:rFonts w:ascii="Times New Roman" w:hAnsi="Times New Roman" w:cs="Times New Roman"/>
+          <w:sz w:val="24"/>
+          <w:szCs w:val="24"/>
+        </w:rPr>
+        <w:t>22</w:t>
+      </w:r>
+    </w:p>
+    <w:p>
+      <w:pPr>
         <w:spacing w:after="120" w:line="360" w:lineRule="auto"/>
         <w:jc w:val="both"/>
         <w:rPr>
@@ -4244,22 +4686,6 @@
           <w:szCs w:val="24"/>
         </w:rPr>
       </w:pPr>
-      <w:r>
-        <w:rPr>
-          <w:rFonts w:ascii="Times New Roman" w:hAnsi="Times New Roman" w:cs="Times New Roman"/>
-          <w:sz w:val="24"/>
-          <w:szCs w:val="24"/>
-        </w:rPr>
-        <w:t>Fig 1: Project phase/ framework activities timeline…………………………………</w:t>
-      </w:r>
-      <w:r>
-        <w:rPr>
-          <w:rFonts w:ascii="Times New Roman" w:hAnsi="Times New Roman" w:cs="Times New Roman"/>
-          <w:sz w:val="24"/>
-          <w:szCs w:val="24"/>
-        </w:rPr>
-        <w:t>……….13</w:t>
-      </w:r>
     </w:p>
     <w:p>
       <w:pPr>
@@ -4311,6 +4737,15 @@
         <w:jc w:val="both"/>
         <w:rPr>
           <w:rFonts w:ascii="Times New Roman" w:hAnsi="Times New Roman" w:cs="Times New Roman"/>
+          <w:sz w:val="24"/>
+          <w:szCs w:val="24"/>
+        </w:rPr>
+      </w:pPr>
+    </w:p>
+    <w:p>
+      <w:pPr>
+        <w:rPr>
+          <w:rFonts w:ascii="Times New Roman" w:hAnsi="Times New Roman" w:cs="Times New Roman"/>
           <w:b/>
           <w:bCs/>
           <w:sz w:val="24"/>
@@ -4325,7 +4760,7 @@
           <w:sz w:val="24"/>
           <w:szCs w:val="24"/>
         </w:rPr>
-        <w:t>LIST OF ABBREVIATIONS.</w:t>
+        <w:br w:type="page"/>
       </w:r>
     </w:p>
     <w:p>
@@ -4334,385 +4769,500 @@
         <w:jc w:val="both"/>
         <w:rPr>
           <w:rFonts w:ascii="Times New Roman" w:hAnsi="Times New Roman" w:cs="Times New Roman"/>
-          <w:sz w:val="24"/>
-          <w:szCs w:val="24"/>
-        </w:rPr>
-      </w:pPr>
-      <w:r>
-        <w:rPr>
-          <w:rFonts w:ascii="Times New Roman" w:hAnsi="Times New Roman" w:cs="Times New Roman"/>
-          <w:sz w:val="24"/>
-          <w:szCs w:val="24"/>
-        </w:rPr>
-        <w:t>SME</w:t>
-      </w:r>
-      <w:r>
-        <w:rPr>
-          <w:rFonts w:ascii="Times New Roman" w:hAnsi="Times New Roman" w:cs="Times New Roman"/>
-          <w:sz w:val="24"/>
-          <w:szCs w:val="24"/>
-        </w:rPr>
-        <w:t xml:space="preserve"> </w:t>
-      </w:r>
-      <w:r>
-        <w:rPr>
-          <w:rFonts w:ascii="Times New Roman" w:hAnsi="Times New Roman" w:cs="Times New Roman"/>
-          <w:sz w:val="24"/>
-          <w:szCs w:val="24"/>
-        </w:rPr>
-        <w:t xml:space="preserve">  -   SMALL</w:t>
-      </w:r>
-      <w:r>
-        <w:rPr>
-          <w:rFonts w:ascii="Times New Roman" w:hAnsi="Times New Roman" w:cs="Times New Roman"/>
-          <w:sz w:val="24"/>
-          <w:szCs w:val="24"/>
-        </w:rPr>
-        <w:t xml:space="preserve"> AND MEDIUM- SIZED ENTERPRISE</w:t>
-      </w:r>
-    </w:p>
-    <w:p>
-      <w:pPr>
-        <w:spacing w:after="120" w:line="360" w:lineRule="auto"/>
-        <w:jc w:val="both"/>
-        <w:rPr>
-          <w:rFonts w:ascii="Times New Roman" w:hAnsi="Times New Roman" w:cs="Times New Roman"/>
-          <w:sz w:val="24"/>
-          <w:szCs w:val="24"/>
-        </w:rPr>
-      </w:pPr>
-      <w:r>
-        <w:rPr>
-          <w:rFonts w:ascii="Times New Roman" w:hAnsi="Times New Roman" w:cs="Times New Roman"/>
-          <w:sz w:val="24"/>
-          <w:szCs w:val="24"/>
-        </w:rPr>
-        <w:t>ML</w:t>
-      </w:r>
-      <w:r>
-        <w:rPr>
-          <w:rFonts w:ascii="Times New Roman" w:hAnsi="Times New Roman" w:cs="Times New Roman"/>
-          <w:sz w:val="24"/>
-          <w:szCs w:val="24"/>
-        </w:rPr>
-        <w:t xml:space="preserve">   -   MACHINE</w:t>
-      </w:r>
-      <w:r>
-        <w:rPr>
-          <w:rFonts w:ascii="Times New Roman" w:hAnsi="Times New Roman" w:cs="Times New Roman"/>
-          <w:sz w:val="24"/>
-          <w:szCs w:val="24"/>
-        </w:rPr>
-        <w:t xml:space="preserve"> LEARNING</w:t>
-      </w:r>
-    </w:p>
-    <w:p>
-      <w:pPr>
-        <w:spacing w:after="120" w:line="360" w:lineRule="auto"/>
-        <w:jc w:val="both"/>
-        <w:rPr>
-          <w:rFonts w:ascii="Times New Roman" w:hAnsi="Times New Roman" w:cs="Times New Roman"/>
-          <w:sz w:val="24"/>
-          <w:szCs w:val="24"/>
-        </w:rPr>
-      </w:pPr>
-      <w:r>
-        <w:rPr>
-          <w:rFonts w:ascii="Times New Roman" w:hAnsi="Times New Roman" w:cs="Times New Roman"/>
-          <w:sz w:val="24"/>
-          <w:szCs w:val="24"/>
-        </w:rPr>
-        <w:t>GDP</w:t>
-      </w:r>
-      <w:r>
-        <w:rPr>
-          <w:rFonts w:ascii="Times New Roman" w:hAnsi="Times New Roman" w:cs="Times New Roman"/>
-          <w:sz w:val="24"/>
-          <w:szCs w:val="24"/>
-        </w:rPr>
-        <w:t xml:space="preserve">   -    </w:t>
-      </w:r>
-      <w:r>
-        <w:rPr>
-          <w:rFonts w:ascii="Times New Roman" w:hAnsi="Times New Roman" w:cs="Times New Roman"/>
-          <w:sz w:val="24"/>
-          <w:szCs w:val="24"/>
-        </w:rPr>
-        <w:t>GROSS DOMESTIC PRODUCT</w:t>
-      </w:r>
-    </w:p>
-    <w:p>
-      <w:pPr>
-        <w:spacing w:after="120" w:line="360" w:lineRule="auto"/>
-        <w:jc w:val="both"/>
-        <w:rPr>
-          <w:rFonts w:ascii="Times New Roman" w:hAnsi="Times New Roman" w:cs="Times New Roman"/>
-          <w:sz w:val="24"/>
-          <w:szCs w:val="24"/>
-        </w:rPr>
-      </w:pPr>
-      <w:r>
-        <w:rPr>
-          <w:rFonts w:ascii="Times New Roman" w:hAnsi="Times New Roman" w:cs="Times New Roman"/>
-          <w:sz w:val="24"/>
-          <w:szCs w:val="24"/>
-        </w:rPr>
-        <w:t>B2B</w:t>
-      </w:r>
-      <w:r>
-        <w:rPr>
-          <w:rFonts w:ascii="Times New Roman" w:hAnsi="Times New Roman" w:cs="Times New Roman"/>
-          <w:sz w:val="24"/>
-          <w:szCs w:val="24"/>
-        </w:rPr>
-        <w:t xml:space="preserve">     -     </w:t>
-      </w:r>
-      <w:r>
-        <w:rPr>
-          <w:rFonts w:ascii="Times New Roman" w:hAnsi="Times New Roman" w:cs="Times New Roman"/>
-          <w:sz w:val="24"/>
-          <w:szCs w:val="24"/>
-        </w:rPr>
-        <w:t>BUSINESS TO BUSINESS</w:t>
-      </w:r>
-    </w:p>
-    <w:p>
-      <w:pPr>
-        <w:spacing w:after="120" w:line="360" w:lineRule="auto"/>
-        <w:jc w:val="both"/>
-        <w:rPr>
-          <w:rFonts w:ascii="Times New Roman" w:hAnsi="Times New Roman" w:cs="Times New Roman"/>
-          <w:sz w:val="24"/>
-          <w:szCs w:val="24"/>
-        </w:rPr>
-      </w:pPr>
-      <w:r>
-        <w:rPr>
-          <w:rFonts w:ascii="Times New Roman" w:hAnsi="Times New Roman" w:cs="Times New Roman"/>
-          <w:sz w:val="24"/>
-          <w:szCs w:val="24"/>
-        </w:rPr>
-        <w:t>APIs</w:t>
-      </w:r>
-      <w:r>
-        <w:rPr>
-          <w:rFonts w:ascii="Times New Roman" w:hAnsi="Times New Roman" w:cs="Times New Roman"/>
-          <w:sz w:val="24"/>
-          <w:szCs w:val="24"/>
-        </w:rPr>
-        <w:t xml:space="preserve"> </w:t>
-      </w:r>
-      <w:r>
-        <w:rPr>
-          <w:rFonts w:ascii="Times New Roman" w:hAnsi="Times New Roman" w:cs="Times New Roman"/>
-          <w:sz w:val="24"/>
-          <w:szCs w:val="24"/>
-        </w:rPr>
-        <w:t xml:space="preserve">   -   </w:t>
-      </w:r>
-      <w:r>
-        <w:rPr>
-          <w:rFonts w:ascii="Times New Roman" w:hAnsi="Times New Roman" w:cs="Times New Roman"/>
-          <w:sz w:val="24"/>
-          <w:szCs w:val="24"/>
-        </w:rPr>
-        <w:t>APPLICATION PROGRAMMING INTERFACES</w:t>
-      </w:r>
-    </w:p>
-    <w:p>
-      <w:pPr>
-        <w:spacing w:after="120" w:line="360" w:lineRule="auto"/>
-        <w:jc w:val="both"/>
-        <w:rPr>
-          <w:rFonts w:ascii="Times New Roman" w:hAnsi="Times New Roman" w:cs="Times New Roman"/>
-          <w:sz w:val="24"/>
-          <w:szCs w:val="24"/>
-        </w:rPr>
-      </w:pPr>
-      <w:r>
-        <w:rPr>
-          <w:rFonts w:ascii="Times New Roman" w:hAnsi="Times New Roman" w:cs="Times New Roman"/>
-          <w:sz w:val="24"/>
-          <w:szCs w:val="24"/>
-        </w:rPr>
-        <w:t>ERP</w:t>
-      </w:r>
-      <w:r>
-        <w:rPr>
-          <w:rFonts w:ascii="Times New Roman" w:hAnsi="Times New Roman" w:cs="Times New Roman"/>
-          <w:sz w:val="24"/>
-          <w:szCs w:val="24"/>
-        </w:rPr>
-        <w:t xml:space="preserve">    -    </w:t>
-      </w:r>
-      <w:r>
-        <w:rPr>
-          <w:rFonts w:ascii="Times New Roman" w:hAnsi="Times New Roman" w:cs="Times New Roman"/>
-          <w:sz w:val="24"/>
-          <w:szCs w:val="24"/>
-        </w:rPr>
-        <w:t>ENTERPRISE RESOURCE PLANNING</w:t>
-      </w:r>
-    </w:p>
-    <w:p>
-      <w:pPr>
-        <w:spacing w:after="120" w:line="360" w:lineRule="auto"/>
-        <w:jc w:val="both"/>
-        <w:rPr>
-          <w:rFonts w:ascii="Times New Roman" w:hAnsi="Times New Roman" w:cs="Times New Roman"/>
-          <w:sz w:val="24"/>
-          <w:szCs w:val="24"/>
-        </w:rPr>
-      </w:pPr>
-      <w:r>
-        <w:rPr>
-          <w:rFonts w:ascii="Times New Roman" w:hAnsi="Times New Roman" w:cs="Times New Roman"/>
-          <w:sz w:val="24"/>
-          <w:szCs w:val="24"/>
-        </w:rPr>
-        <w:t>SQL</w:t>
-      </w:r>
-      <w:r>
-        <w:rPr>
-          <w:rFonts w:ascii="Times New Roman" w:hAnsi="Times New Roman" w:cs="Times New Roman"/>
-          <w:sz w:val="24"/>
-          <w:szCs w:val="24"/>
-        </w:rPr>
-        <w:t xml:space="preserve">    -</w:t>
-      </w:r>
-      <w:r>
-        <w:rPr>
-          <w:rFonts w:ascii="Times New Roman" w:hAnsi="Times New Roman" w:cs="Times New Roman"/>
-          <w:sz w:val="24"/>
-          <w:szCs w:val="24"/>
-        </w:rPr>
-        <w:t xml:space="preserve">  </w:t>
-      </w:r>
-      <w:r>
-        <w:rPr>
-          <w:rFonts w:ascii="Times New Roman" w:hAnsi="Times New Roman" w:cs="Times New Roman"/>
-          <w:sz w:val="24"/>
-          <w:szCs w:val="24"/>
-        </w:rPr>
-        <w:t xml:space="preserve"> STRUCTURED</w:t>
-      </w:r>
-      <w:r>
-        <w:rPr>
-          <w:rFonts w:ascii="Times New Roman" w:hAnsi="Times New Roman" w:cs="Times New Roman"/>
-          <w:sz w:val="24"/>
-          <w:szCs w:val="24"/>
-        </w:rPr>
-        <w:t xml:space="preserve"> QUERY LANGUAGE</w:t>
-      </w:r>
-    </w:p>
-    <w:p>
-      <w:pPr>
-        <w:spacing w:after="120" w:line="360" w:lineRule="auto"/>
-        <w:jc w:val="both"/>
-        <w:rPr>
-          <w:rFonts w:ascii="Times New Roman" w:hAnsi="Times New Roman" w:cs="Times New Roman"/>
-          <w:sz w:val="24"/>
-          <w:szCs w:val="24"/>
-        </w:rPr>
-      </w:pPr>
-      <w:r>
-        <w:rPr>
-          <w:rFonts w:ascii="Times New Roman" w:hAnsi="Times New Roman" w:cs="Times New Roman"/>
-          <w:sz w:val="24"/>
-          <w:szCs w:val="24"/>
-        </w:rPr>
-        <w:t>EDA</w:t>
-      </w:r>
-      <w:r>
-        <w:rPr>
-          <w:rFonts w:ascii="Times New Roman" w:hAnsi="Times New Roman" w:cs="Times New Roman"/>
-          <w:sz w:val="24"/>
-          <w:szCs w:val="24"/>
-        </w:rPr>
-        <w:t xml:space="preserve">    -    EXPLORATORY DATA ANALYSIS</w:t>
-      </w:r>
-    </w:p>
-    <w:p>
-      <w:pPr>
-        <w:spacing w:after="120" w:line="360" w:lineRule="auto"/>
-        <w:jc w:val="both"/>
-        <w:rPr>
-          <w:rFonts w:ascii="Times New Roman" w:hAnsi="Times New Roman" w:cs="Times New Roman"/>
-          <w:sz w:val="24"/>
-          <w:szCs w:val="24"/>
-        </w:rPr>
-      </w:pPr>
-      <w:r>
-        <w:rPr>
-          <w:rFonts w:ascii="Times New Roman" w:hAnsi="Times New Roman" w:cs="Times New Roman"/>
-          <w:sz w:val="24"/>
-          <w:szCs w:val="24"/>
-        </w:rPr>
-        <w:t>ROC</w:t>
-      </w:r>
-      <w:r>
-        <w:rPr>
-          <w:rFonts w:ascii="Times New Roman" w:hAnsi="Times New Roman" w:cs="Times New Roman"/>
-          <w:sz w:val="24"/>
-          <w:szCs w:val="24"/>
-        </w:rPr>
-        <w:t xml:space="preserve">    -   RECEIVER OPERATING CHARACTERISTICS</w:t>
-      </w:r>
-    </w:p>
-    <w:p>
-      <w:pPr>
-        <w:spacing w:after="120" w:line="360" w:lineRule="auto"/>
-        <w:jc w:val="both"/>
-        <w:rPr>
-          <w:rFonts w:ascii="Times New Roman" w:hAnsi="Times New Roman" w:cs="Times New Roman"/>
-          <w:sz w:val="24"/>
-          <w:szCs w:val="24"/>
-        </w:rPr>
-      </w:pPr>
-      <w:r>
-        <w:rPr>
-          <w:rFonts w:ascii="Times New Roman" w:hAnsi="Times New Roman" w:cs="Times New Roman"/>
-          <w:sz w:val="24"/>
-          <w:szCs w:val="24"/>
-        </w:rPr>
-        <w:t>AUC</w:t>
-      </w:r>
-      <w:r>
-        <w:rPr>
-          <w:rFonts w:ascii="Times New Roman" w:hAnsi="Times New Roman" w:cs="Times New Roman"/>
-          <w:sz w:val="24"/>
-          <w:szCs w:val="24"/>
-        </w:rPr>
-        <w:t xml:space="preserve">   -   AREA UNDER THE CURVE</w:t>
-      </w:r>
-    </w:p>
-    <w:p>
-      <w:pPr>
-        <w:spacing w:after="120" w:line="360" w:lineRule="auto"/>
-        <w:jc w:val="both"/>
-        <w:rPr>
-          <w:rFonts w:ascii="Times New Roman" w:hAnsi="Times New Roman" w:cs="Times New Roman"/>
-          <w:sz w:val="24"/>
-          <w:szCs w:val="24"/>
-        </w:rPr>
-      </w:pPr>
-      <w:r>
-        <w:rPr>
-          <w:rFonts w:ascii="Times New Roman" w:hAnsi="Times New Roman" w:cs="Times New Roman"/>
-          <w:sz w:val="24"/>
-          <w:szCs w:val="24"/>
-        </w:rPr>
-        <w:t>PII</w:t>
-      </w:r>
-      <w:r>
-        <w:rPr>
-          <w:rFonts w:ascii="Times New Roman" w:hAnsi="Times New Roman" w:cs="Times New Roman"/>
-          <w:sz w:val="24"/>
-          <w:szCs w:val="24"/>
-        </w:rPr>
-        <w:t xml:space="preserve">      -     PERSONALLY IDENTIFIABLE INFORMATION</w:t>
-      </w:r>
-    </w:p>
+          <w:b/>
+          <w:bCs/>
+          <w:sz w:val="24"/>
+          <w:szCs w:val="24"/>
+        </w:rPr>
+      </w:pPr>
+      <w:r>
+        <w:rPr>
+          <w:rFonts w:ascii="Times New Roman" w:hAnsi="Times New Roman" w:cs="Times New Roman"/>
+          <w:b/>
+          <w:bCs/>
+          <w:sz w:val="24"/>
+          <w:szCs w:val="24"/>
+        </w:rPr>
+        <w:t>LIST OF ABBREVIATIONS.</w:t>
+      </w:r>
+    </w:p>
+    <w:tbl>
+      <w:tblPr>
+        <w:tblStyle w:val="PlainTable1"/>
+        <w:tblW w:w="9776" w:type="dxa"/>
+        <w:tblLook w:val="04A0" w:firstRow="1" w:lastRow="0" w:firstColumn="1" w:lastColumn="0" w:noHBand="0" w:noVBand="1"/>
+      </w:tblPr>
+      <w:tblGrid>
+        <w:gridCol w:w="9776"/>
+      </w:tblGrid>
+      <w:tr>
+        <w:trPr>
+          <w:cnfStyle w:val="100000000000" w:firstRow="1" w:lastRow="0" w:firstColumn="0" w:lastColumn="0" w:oddVBand="0" w:evenVBand="0" w:oddHBand="0" w:evenHBand="0" w:firstRowFirstColumn="0" w:firstRowLastColumn="0" w:lastRowFirstColumn="0" w:lastRowLastColumn="0"/>
+        </w:trPr>
+        <w:tc>
+          <w:tcPr>
+            <w:cnfStyle w:val="001000000000" w:firstRow="0" w:lastRow="0" w:firstColumn="1" w:lastColumn="0" w:oddVBand="0" w:evenVBand="0" w:oddHBand="0" w:evenHBand="0" w:firstRowFirstColumn="0" w:firstRowLastColumn="0" w:lastRowFirstColumn="0" w:lastRowLastColumn="0"/>
+            <w:tcW w:w="9776" w:type="dxa"/>
+          </w:tcPr>
+          <w:p>
+            <w:pPr>
+              <w:spacing w:after="120" w:line="360" w:lineRule="auto"/>
+              <w:jc w:val="both"/>
+              <w:rPr>
+                <w:rFonts w:ascii="Times New Roman" w:hAnsi="Times New Roman" w:cs="Times New Roman"/>
+                <w:b w:val="0"/>
+                <w:bCs w:val="0"/>
+                <w:sz w:val="24"/>
+                <w:szCs w:val="24"/>
+              </w:rPr>
+            </w:pPr>
+            <w:r>
+              <w:rPr>
+                <w:rFonts w:ascii="Times New Roman" w:hAnsi="Times New Roman" w:cs="Times New Roman"/>
+                <w:b w:val="0"/>
+                <w:bCs w:val="0"/>
+                <w:sz w:val="24"/>
+                <w:szCs w:val="24"/>
+              </w:rPr>
+              <w:t>SME   -   SMALL AND MEDIUM- SIZED ENTERPRISE</w:t>
+            </w:r>
+          </w:p>
+        </w:tc>
+      </w:tr>
+      <w:tr>
+        <w:trPr>
+          <w:cnfStyle w:val="000000100000" w:firstRow="0" w:lastRow="0" w:firstColumn="0" w:lastColumn="0" w:oddVBand="0" w:evenVBand="0" w:oddHBand="1" w:evenHBand="0" w:firstRowFirstColumn="0" w:firstRowLastColumn="0" w:lastRowFirstColumn="0" w:lastRowLastColumn="0"/>
+        </w:trPr>
+        <w:tc>
+          <w:tcPr>
+            <w:cnfStyle w:val="001000000000" w:firstRow="0" w:lastRow="0" w:firstColumn="1" w:lastColumn="0" w:oddVBand="0" w:evenVBand="0" w:oddHBand="0" w:evenHBand="0" w:firstRowFirstColumn="0" w:firstRowLastColumn="0" w:lastRowFirstColumn="0" w:lastRowLastColumn="0"/>
+            <w:tcW w:w="9776" w:type="dxa"/>
+          </w:tcPr>
+          <w:p>
+            <w:pPr>
+              <w:spacing w:after="120" w:line="360" w:lineRule="auto"/>
+              <w:jc w:val="both"/>
+              <w:rPr>
+                <w:rFonts w:ascii="Times New Roman" w:hAnsi="Times New Roman" w:cs="Times New Roman"/>
+                <w:b w:val="0"/>
+                <w:bCs w:val="0"/>
+                <w:sz w:val="24"/>
+                <w:szCs w:val="24"/>
+              </w:rPr>
+            </w:pPr>
+            <w:r>
+              <w:rPr>
+                <w:rFonts w:ascii="Times New Roman" w:hAnsi="Times New Roman" w:cs="Times New Roman"/>
+                <w:b w:val="0"/>
+                <w:bCs w:val="0"/>
+                <w:sz w:val="24"/>
+                <w:szCs w:val="24"/>
+              </w:rPr>
+              <w:t>ML   -   MACHINE LEARNING</w:t>
+            </w:r>
+          </w:p>
+        </w:tc>
+      </w:tr>
+      <w:tr>
+        <w:tc>
+          <w:tcPr>
+            <w:cnfStyle w:val="001000000000" w:firstRow="0" w:lastRow="0" w:firstColumn="1" w:lastColumn="0" w:oddVBand="0" w:evenVBand="0" w:oddHBand="0" w:evenHBand="0" w:firstRowFirstColumn="0" w:firstRowLastColumn="0" w:lastRowFirstColumn="0" w:lastRowLastColumn="0"/>
+            <w:tcW w:w="9776" w:type="dxa"/>
+          </w:tcPr>
+          <w:p>
+            <w:pPr>
+              <w:spacing w:after="120" w:line="360" w:lineRule="auto"/>
+              <w:jc w:val="both"/>
+              <w:rPr>
+                <w:rFonts w:ascii="Times New Roman" w:hAnsi="Times New Roman" w:cs="Times New Roman"/>
+                <w:b w:val="0"/>
+                <w:bCs w:val="0"/>
+                <w:sz w:val="24"/>
+                <w:szCs w:val="24"/>
+              </w:rPr>
+            </w:pPr>
+            <w:r>
+              <w:rPr>
+                <w:rFonts w:ascii="Times New Roman" w:hAnsi="Times New Roman" w:cs="Times New Roman"/>
+                <w:b w:val="0"/>
+                <w:bCs w:val="0"/>
+                <w:sz w:val="24"/>
+                <w:szCs w:val="24"/>
+              </w:rPr>
+              <w:t>GDP   -    GROSS DOMESTIC PRODUCT</w:t>
+            </w:r>
+          </w:p>
+        </w:tc>
+      </w:tr>
+      <w:tr>
+        <w:trPr>
+          <w:cnfStyle w:val="000000100000" w:firstRow="0" w:lastRow="0" w:firstColumn="0" w:lastColumn="0" w:oddVBand="0" w:evenVBand="0" w:oddHBand="1" w:evenHBand="0" w:firstRowFirstColumn="0" w:firstRowLastColumn="0" w:lastRowFirstColumn="0" w:lastRowLastColumn="0"/>
+        </w:trPr>
+        <w:tc>
+          <w:tcPr>
+            <w:cnfStyle w:val="001000000000" w:firstRow="0" w:lastRow="0" w:firstColumn="1" w:lastColumn="0" w:oddVBand="0" w:evenVBand="0" w:oddHBand="0" w:evenHBand="0" w:firstRowFirstColumn="0" w:firstRowLastColumn="0" w:lastRowFirstColumn="0" w:lastRowLastColumn="0"/>
+            <w:tcW w:w="9776" w:type="dxa"/>
+          </w:tcPr>
+          <w:p>
+            <w:pPr>
+              <w:spacing w:after="120" w:line="360" w:lineRule="auto"/>
+              <w:jc w:val="both"/>
+              <w:rPr>
+                <w:rFonts w:ascii="Times New Roman" w:hAnsi="Times New Roman" w:cs="Times New Roman"/>
+                <w:b w:val="0"/>
+                <w:bCs w:val="0"/>
+                <w:sz w:val="24"/>
+                <w:szCs w:val="24"/>
+              </w:rPr>
+            </w:pPr>
+            <w:r>
+              <w:rPr>
+                <w:rFonts w:ascii="Times New Roman" w:hAnsi="Times New Roman" w:cs="Times New Roman"/>
+                <w:b w:val="0"/>
+                <w:bCs w:val="0"/>
+                <w:sz w:val="24"/>
+                <w:szCs w:val="24"/>
+              </w:rPr>
+              <w:t>B2B     -     BUSINESS TO BUSINESS</w:t>
+            </w:r>
+          </w:p>
+        </w:tc>
+      </w:tr>
+      <w:tr>
+        <w:tc>
+          <w:tcPr>
+            <w:cnfStyle w:val="001000000000" w:firstRow="0" w:lastRow="0" w:firstColumn="1" w:lastColumn="0" w:oddVBand="0" w:evenVBand="0" w:oddHBand="0" w:evenHBand="0" w:firstRowFirstColumn="0" w:firstRowLastColumn="0" w:lastRowFirstColumn="0" w:lastRowLastColumn="0"/>
+            <w:tcW w:w="9776" w:type="dxa"/>
+          </w:tcPr>
+          <w:p>
+            <w:pPr>
+              <w:spacing w:after="120" w:line="360" w:lineRule="auto"/>
+              <w:jc w:val="both"/>
+              <w:rPr>
+                <w:rFonts w:ascii="Times New Roman" w:hAnsi="Times New Roman" w:cs="Times New Roman"/>
+                <w:b w:val="0"/>
+                <w:bCs w:val="0"/>
+                <w:sz w:val="24"/>
+                <w:szCs w:val="24"/>
+              </w:rPr>
+            </w:pPr>
+            <w:r>
+              <w:rPr>
+                <w:rFonts w:ascii="Times New Roman" w:hAnsi="Times New Roman" w:cs="Times New Roman"/>
+                <w:b w:val="0"/>
+                <w:bCs w:val="0"/>
+                <w:sz w:val="24"/>
+                <w:szCs w:val="24"/>
+              </w:rPr>
+              <w:t>APIS    -   APPLICATION PROGRAMMING INTERFACES</w:t>
+            </w:r>
+          </w:p>
+        </w:tc>
+      </w:tr>
+      <w:tr>
+        <w:trPr>
+          <w:cnfStyle w:val="000000100000" w:firstRow="0" w:lastRow="0" w:firstColumn="0" w:lastColumn="0" w:oddVBand="0" w:evenVBand="0" w:oddHBand="1" w:evenHBand="0" w:firstRowFirstColumn="0" w:firstRowLastColumn="0" w:lastRowFirstColumn="0" w:lastRowLastColumn="0"/>
+        </w:trPr>
+        <w:tc>
+          <w:tcPr>
+            <w:cnfStyle w:val="001000000000" w:firstRow="0" w:lastRow="0" w:firstColumn="1" w:lastColumn="0" w:oddVBand="0" w:evenVBand="0" w:oddHBand="0" w:evenHBand="0" w:firstRowFirstColumn="0" w:firstRowLastColumn="0" w:lastRowFirstColumn="0" w:lastRowLastColumn="0"/>
+            <w:tcW w:w="9776" w:type="dxa"/>
+          </w:tcPr>
+          <w:p>
+            <w:pPr>
+              <w:spacing w:after="120" w:line="360" w:lineRule="auto"/>
+              <w:jc w:val="both"/>
+              <w:rPr>
+                <w:rFonts w:ascii="Times New Roman" w:hAnsi="Times New Roman" w:cs="Times New Roman"/>
+                <w:b w:val="0"/>
+                <w:bCs w:val="0"/>
+                <w:sz w:val="24"/>
+                <w:szCs w:val="24"/>
+              </w:rPr>
+            </w:pPr>
+            <w:r>
+              <w:rPr>
+                <w:rFonts w:ascii="Times New Roman" w:hAnsi="Times New Roman" w:cs="Times New Roman"/>
+                <w:b w:val="0"/>
+                <w:bCs w:val="0"/>
+                <w:sz w:val="24"/>
+                <w:szCs w:val="24"/>
+              </w:rPr>
+              <w:t>ERP    -    ENTERPRISE RESOURCE PLANNING</w:t>
+            </w:r>
+          </w:p>
+        </w:tc>
+      </w:tr>
+      <w:tr>
+        <w:tc>
+          <w:tcPr>
+            <w:cnfStyle w:val="001000000000" w:firstRow="0" w:lastRow="0" w:firstColumn="1" w:lastColumn="0" w:oddVBand="0" w:evenVBand="0" w:oddHBand="0" w:evenHBand="0" w:firstRowFirstColumn="0" w:firstRowLastColumn="0" w:lastRowFirstColumn="0" w:lastRowLastColumn="0"/>
+            <w:tcW w:w="9776" w:type="dxa"/>
+          </w:tcPr>
+          <w:p>
+            <w:pPr>
+              <w:spacing w:after="120" w:line="360" w:lineRule="auto"/>
+              <w:jc w:val="both"/>
+              <w:rPr>
+                <w:rFonts w:ascii="Times New Roman" w:hAnsi="Times New Roman" w:cs="Times New Roman"/>
+                <w:b w:val="0"/>
+                <w:bCs w:val="0"/>
+                <w:sz w:val="24"/>
+                <w:szCs w:val="24"/>
+              </w:rPr>
+            </w:pPr>
+            <w:r>
+              <w:rPr>
+                <w:rFonts w:ascii="Times New Roman" w:hAnsi="Times New Roman" w:cs="Times New Roman"/>
+                <w:b w:val="0"/>
+                <w:bCs w:val="0"/>
+                <w:sz w:val="24"/>
+                <w:szCs w:val="24"/>
+              </w:rPr>
+              <w:t>SQL    -   STRUCTURED QUERY LANGUAGE</w:t>
+            </w:r>
+          </w:p>
+        </w:tc>
+      </w:tr>
+      <w:tr>
+        <w:trPr>
+          <w:cnfStyle w:val="000000100000" w:firstRow="0" w:lastRow="0" w:firstColumn="0" w:lastColumn="0" w:oddVBand="0" w:evenVBand="0" w:oddHBand="1" w:evenHBand="0" w:firstRowFirstColumn="0" w:firstRowLastColumn="0" w:lastRowFirstColumn="0" w:lastRowLastColumn="0"/>
+        </w:trPr>
+        <w:tc>
+          <w:tcPr>
+            <w:cnfStyle w:val="001000000000" w:firstRow="0" w:lastRow="0" w:firstColumn="1" w:lastColumn="0" w:oddVBand="0" w:evenVBand="0" w:oddHBand="0" w:evenHBand="0" w:firstRowFirstColumn="0" w:firstRowLastColumn="0" w:lastRowFirstColumn="0" w:lastRowLastColumn="0"/>
+            <w:tcW w:w="9776" w:type="dxa"/>
+          </w:tcPr>
+          <w:p>
+            <w:pPr>
+              <w:spacing w:after="120" w:line="360" w:lineRule="auto"/>
+              <w:jc w:val="both"/>
+              <w:rPr>
+                <w:rFonts w:ascii="Times New Roman" w:hAnsi="Times New Roman" w:cs="Times New Roman"/>
+                <w:b w:val="0"/>
+                <w:bCs w:val="0"/>
+                <w:sz w:val="24"/>
+                <w:szCs w:val="24"/>
+              </w:rPr>
+            </w:pPr>
+            <w:r>
+              <w:rPr>
+                <w:rFonts w:ascii="Times New Roman" w:hAnsi="Times New Roman" w:cs="Times New Roman"/>
+                <w:b w:val="0"/>
+                <w:bCs w:val="0"/>
+                <w:sz w:val="24"/>
+                <w:szCs w:val="24"/>
+              </w:rPr>
+              <w:t>EDA    -    EXPLORATORY DATA ANALYSIS</w:t>
+            </w:r>
+          </w:p>
+        </w:tc>
+      </w:tr>
+      <w:tr>
+        <w:tc>
+          <w:tcPr>
+            <w:cnfStyle w:val="001000000000" w:firstRow="0" w:lastRow="0" w:firstColumn="1" w:lastColumn="0" w:oddVBand="0" w:evenVBand="0" w:oddHBand="0" w:evenHBand="0" w:firstRowFirstColumn="0" w:firstRowLastColumn="0" w:lastRowFirstColumn="0" w:lastRowLastColumn="0"/>
+            <w:tcW w:w="9776" w:type="dxa"/>
+          </w:tcPr>
+          <w:p>
+            <w:pPr>
+              <w:spacing w:after="120" w:line="360" w:lineRule="auto"/>
+              <w:jc w:val="both"/>
+              <w:rPr>
+                <w:rFonts w:ascii="Times New Roman" w:hAnsi="Times New Roman" w:cs="Times New Roman"/>
+                <w:b w:val="0"/>
+                <w:bCs w:val="0"/>
+                <w:sz w:val="24"/>
+                <w:szCs w:val="24"/>
+              </w:rPr>
+            </w:pPr>
+            <w:r>
+              <w:rPr>
+                <w:rFonts w:ascii="Times New Roman" w:hAnsi="Times New Roman" w:cs="Times New Roman"/>
+                <w:b w:val="0"/>
+                <w:bCs w:val="0"/>
+                <w:sz w:val="24"/>
+                <w:szCs w:val="24"/>
+              </w:rPr>
+              <w:t>ROC-AUC- RECEIVER OPERATING CHARACTERISTICS-AREA UNDER THE CURVE</w:t>
+            </w:r>
+          </w:p>
+        </w:tc>
+      </w:tr>
+      <w:tr>
+        <w:trPr>
+          <w:cnfStyle w:val="000000100000" w:firstRow="0" w:lastRow="0" w:firstColumn="0" w:lastColumn="0" w:oddVBand="0" w:evenVBand="0" w:oddHBand="1" w:evenHBand="0" w:firstRowFirstColumn="0" w:firstRowLastColumn="0" w:lastRowFirstColumn="0" w:lastRowLastColumn="0"/>
+        </w:trPr>
+        <w:tc>
+          <w:tcPr>
+            <w:cnfStyle w:val="001000000000" w:firstRow="0" w:lastRow="0" w:firstColumn="1" w:lastColumn="0" w:oddVBand="0" w:evenVBand="0" w:oddHBand="0" w:evenHBand="0" w:firstRowFirstColumn="0" w:firstRowLastColumn="0" w:lastRowFirstColumn="0" w:lastRowLastColumn="0"/>
+            <w:tcW w:w="9776" w:type="dxa"/>
+          </w:tcPr>
+          <w:p>
+            <w:pPr>
+              <w:spacing w:after="120" w:line="360" w:lineRule="auto"/>
+              <w:jc w:val="both"/>
+              <w:rPr>
+                <w:rFonts w:ascii="Times New Roman" w:hAnsi="Times New Roman" w:cs="Times New Roman"/>
+                <w:b w:val="0"/>
+                <w:bCs w:val="0"/>
+                <w:sz w:val="24"/>
+                <w:szCs w:val="24"/>
+              </w:rPr>
+            </w:pPr>
+            <w:r>
+              <w:rPr>
+                <w:rFonts w:ascii="Times New Roman" w:hAnsi="Times New Roman" w:cs="Times New Roman"/>
+                <w:b w:val="0"/>
+                <w:bCs w:val="0"/>
+                <w:sz w:val="24"/>
+                <w:szCs w:val="24"/>
+              </w:rPr>
+              <w:t>PII      -     PERSONALLY IDENTIFIABLE INFORMATION</w:t>
+            </w:r>
+          </w:p>
+        </w:tc>
+      </w:tr>
+      <w:tr>
+        <w:tc>
+          <w:tcPr>
+            <w:cnfStyle w:val="001000000000" w:firstRow="0" w:lastRow="0" w:firstColumn="1" w:lastColumn="0" w:oddVBand="0" w:evenVBand="0" w:oddHBand="0" w:evenHBand="0" w:firstRowFirstColumn="0" w:firstRowLastColumn="0" w:lastRowFirstColumn="0" w:lastRowLastColumn="0"/>
+            <w:tcW w:w="9776" w:type="dxa"/>
+          </w:tcPr>
+          <w:p>
+            <w:pPr>
+              <w:spacing w:after="120" w:line="360" w:lineRule="auto"/>
+              <w:jc w:val="both"/>
+              <w:rPr>
+                <w:rFonts w:ascii="Times New Roman" w:hAnsi="Times New Roman" w:cs="Times New Roman"/>
+                <w:b w:val="0"/>
+                <w:bCs w:val="0"/>
+                <w:sz w:val="24"/>
+                <w:szCs w:val="24"/>
+              </w:rPr>
+            </w:pPr>
+            <w:r>
+              <w:rPr>
+                <w:rFonts w:ascii="Times New Roman" w:hAnsi="Times New Roman" w:cs="Times New Roman"/>
+                <w:b w:val="0"/>
+                <w:bCs w:val="0"/>
+                <w:sz w:val="24"/>
+                <w:szCs w:val="24"/>
+              </w:rPr>
+              <w:t>NIDA -     NATIONAL IDENTIFICATION AUTHORITY</w:t>
+            </w:r>
+          </w:p>
+        </w:tc>
+      </w:tr>
+      <w:tr>
+        <w:trPr>
+          <w:cnfStyle w:val="000000100000" w:firstRow="0" w:lastRow="0" w:firstColumn="0" w:lastColumn="0" w:oddVBand="0" w:evenVBand="0" w:oddHBand="1" w:evenHBand="0" w:firstRowFirstColumn="0" w:firstRowLastColumn="0" w:lastRowFirstColumn="0" w:lastRowLastColumn="0"/>
+        </w:trPr>
+        <w:tc>
+          <w:tcPr>
+            <w:cnfStyle w:val="001000000000" w:firstRow="0" w:lastRow="0" w:firstColumn="1" w:lastColumn="0" w:oddVBand="0" w:evenVBand="0" w:oddHBand="0" w:evenHBand="0" w:firstRowFirstColumn="0" w:firstRowLastColumn="0" w:lastRowFirstColumn="0" w:lastRowLastColumn="0"/>
+            <w:tcW w:w="9776" w:type="dxa"/>
+          </w:tcPr>
+          <w:p>
+            <w:pPr>
+              <w:spacing w:after="120" w:line="360" w:lineRule="auto"/>
+              <w:jc w:val="both"/>
+              <w:rPr>
+                <w:rFonts w:ascii="Times New Roman" w:hAnsi="Times New Roman" w:cs="Times New Roman"/>
+                <w:b w:val="0"/>
+                <w:bCs w:val="0"/>
+                <w:sz w:val="24"/>
+                <w:szCs w:val="24"/>
+              </w:rPr>
+            </w:pPr>
+            <w:r>
+              <w:rPr>
+                <w:rFonts w:ascii="Times New Roman" w:hAnsi="Times New Roman" w:cs="Times New Roman"/>
+                <w:b w:val="0"/>
+                <w:bCs w:val="0"/>
+                <w:sz w:val="24"/>
+                <w:szCs w:val="24"/>
+              </w:rPr>
+              <w:t>CSV – COMMA-SEPARATED VALUES</w:t>
+            </w:r>
+          </w:p>
+        </w:tc>
+      </w:tr>
+      <w:tr>
+        <w:trPr>
+          <w:trHeight w:val="444"/>
+        </w:trPr>
+        <w:tc>
+          <w:tcPr>
+            <w:cnfStyle w:val="001000000000" w:firstRow="0" w:lastRow="0" w:firstColumn="1" w:lastColumn="0" w:oddVBand="0" w:evenVBand="0" w:oddHBand="0" w:evenHBand="0" w:firstRowFirstColumn="0" w:firstRowLastColumn="0" w:lastRowFirstColumn="0" w:lastRowLastColumn="0"/>
+            <w:tcW w:w="9776" w:type="dxa"/>
+          </w:tcPr>
+          <w:p>
+            <w:pPr>
+              <w:rPr>
+                <w:rFonts w:ascii="Times New Roman" w:hAnsi="Times New Roman" w:cs="Times New Roman"/>
+                <w:b w:val="0"/>
+                <w:bCs w:val="0"/>
+                <w:sz w:val="24"/>
+                <w:szCs w:val="24"/>
+              </w:rPr>
+            </w:pPr>
+            <w:r>
+              <w:rPr>
+                <w:rFonts w:ascii="Times New Roman" w:hAnsi="Times New Roman" w:cs="Times New Roman"/>
+                <w:b w:val="0"/>
+                <w:bCs w:val="0"/>
+                <w:sz w:val="24"/>
+                <w:szCs w:val="24"/>
+              </w:rPr>
+              <w:t xml:space="preserve">TIN - </w:t>
+            </w:r>
+            <w:r>
+              <w:rPr>
+                <w:rStyle w:val="Strong"/>
+                <w:rFonts w:ascii="Times New Roman" w:hAnsi="Times New Roman" w:cs="Times New Roman"/>
+                <w:sz w:val="24"/>
+                <w:szCs w:val="24"/>
+              </w:rPr>
+              <w:t>TAXPAYER IDENTIFICATION NUMBER</w:t>
+            </w:r>
+          </w:p>
+        </w:tc>
+      </w:tr>
+      <w:tr>
+        <w:trPr>
+          <w:cnfStyle w:val="000000100000" w:firstRow="0" w:lastRow="0" w:firstColumn="0" w:lastColumn="0" w:oddVBand="0" w:evenVBand="0" w:oddHBand="1" w:evenHBand="0" w:firstRowFirstColumn="0" w:firstRowLastColumn="0" w:lastRowFirstColumn="0" w:lastRowLastColumn="0"/>
+          <w:trHeight w:val="435"/>
+        </w:trPr>
+        <w:tc>
+          <w:tcPr>
+            <w:cnfStyle w:val="001000000000" w:firstRow="0" w:lastRow="0" w:firstColumn="1" w:lastColumn="0" w:oddVBand="0" w:evenVBand="0" w:oddHBand="0" w:evenHBand="0" w:firstRowFirstColumn="0" w:firstRowLastColumn="0" w:lastRowFirstColumn="0" w:lastRowLastColumn="0"/>
+            <w:tcW w:w="9776" w:type="dxa"/>
+          </w:tcPr>
+          <w:p>
+            <w:pPr>
+              <w:rPr>
+                <w:rFonts w:ascii="Times New Roman" w:hAnsi="Times New Roman" w:cs="Times New Roman"/>
+                <w:b w:val="0"/>
+                <w:bCs w:val="0"/>
+                <w:sz w:val="24"/>
+                <w:szCs w:val="24"/>
+              </w:rPr>
+            </w:pPr>
+            <w:r>
+              <w:rPr>
+                <w:rFonts w:ascii="Times New Roman" w:hAnsi="Times New Roman" w:cs="Times New Roman"/>
+                <w:b w:val="0"/>
+                <w:bCs w:val="0"/>
+                <w:sz w:val="24"/>
+                <w:szCs w:val="24"/>
+              </w:rPr>
+              <w:t>SHAP- SHAPLEY ADDITIVE EXPLANATIONS</w:t>
+            </w:r>
+          </w:p>
+        </w:tc>
+      </w:tr>
+    </w:tbl>
     <w:p>
       <w:pPr>
         <w:spacing w:line="360" w:lineRule="auto"/>
@@ -4779,7 +5329,7 @@
           <w:color w:val="auto"/>
         </w:rPr>
       </w:pPr>
-      <w:bookmarkStart w:id="0" w:name="_Toc234742405"/>
+      <w:bookmarkStart w:id="0" w:name="_Toc235630712"/>
       <w:r>
         <w:rPr>
           <w:rFonts w:ascii="Times New Roman" w:hAnsi="Times New Roman" w:cs="Times New Roman"/>
@@ -4799,7 +5349,7 @@
           <w:color w:val="auto"/>
         </w:rPr>
       </w:pPr>
-      <w:bookmarkStart w:id="1" w:name="_Toc234742406"/>
+      <w:bookmarkStart w:id="1" w:name="_Toc235630713"/>
       <w:r>
         <w:rPr>
           <w:rFonts w:ascii="Times New Roman" w:hAnsi="Times New Roman" w:cs="Times New Roman"/>
@@ -4833,7 +5383,7 @@
           <w:color w:val="auto"/>
         </w:rPr>
       </w:pPr>
-      <w:bookmarkStart w:id="2" w:name="_Toc234742407"/>
+      <w:bookmarkStart w:id="2" w:name="_Toc235630714"/>
       <w:r>
         <w:rPr>
           <w:rFonts w:ascii="Times New Roman" w:hAnsi="Times New Roman" w:cs="Times New Roman"/>
@@ -4998,7 +5548,7 @@
           <w:color w:val="auto"/>
         </w:rPr>
       </w:pPr>
-      <w:bookmarkStart w:id="3" w:name="_Toc234742408"/>
+      <w:bookmarkStart w:id="3" w:name="_Toc235630715"/>
       <w:r>
         <w:rPr>
           <w:rFonts w:ascii="Times New Roman" w:hAnsi="Times New Roman" w:cs="Times New Roman"/>
@@ -5090,7 +5640,7 @@
           <w:color w:val="auto"/>
         </w:rPr>
       </w:pPr>
-      <w:bookmarkStart w:id="4" w:name="_Toc234742409"/>
+      <w:bookmarkStart w:id="4" w:name="_Toc235630716"/>
       <w:r>
         <w:rPr>
           <w:rFonts w:ascii="Times New Roman" w:hAnsi="Times New Roman" w:cs="Times New Roman"/>
@@ -5136,7 +5686,7 @@
           <w:color w:val="auto"/>
         </w:rPr>
       </w:pPr>
-      <w:bookmarkStart w:id="5" w:name="_Toc234742410"/>
+      <w:bookmarkStart w:id="5" w:name="_Toc235630717"/>
       <w:r>
         <w:rPr>
           <w:rFonts w:ascii="Times New Roman" w:hAnsi="Times New Roman" w:cs="Times New Roman"/>
@@ -5232,7 +5782,7 @@
           <w:color w:val="auto"/>
         </w:rPr>
       </w:pPr>
-      <w:bookmarkStart w:id="6" w:name="_Toc234742411"/>
+      <w:bookmarkStart w:id="6" w:name="_Toc235630718"/>
       <w:r>
         <w:rPr>
           <w:rFonts w:ascii="Times New Roman" w:hAnsi="Times New Roman" w:cs="Times New Roman"/>
@@ -5313,7 +5863,7 @@
           <w:color w:val="auto"/>
         </w:rPr>
       </w:pPr>
-      <w:bookmarkStart w:id="7" w:name="_Toc234742412"/>
+      <w:bookmarkStart w:id="7" w:name="_Toc235630719"/>
       <w:r>
         <w:rPr>
           <w:rFonts w:ascii="Times New Roman" w:hAnsi="Times New Roman" w:cs="Times New Roman"/>
@@ -5389,7 +5939,7 @@
           <w:color w:val="auto"/>
         </w:rPr>
       </w:pPr>
-      <w:bookmarkStart w:id="8" w:name="_Toc234742413"/>
+      <w:bookmarkStart w:id="8" w:name="_Toc235630720"/>
       <w:r>
         <w:rPr>
           <w:rFonts w:ascii="Times New Roman" w:hAnsi="Times New Roman" w:cs="Times New Roman"/>
@@ -5706,7 +6256,7 @@
           <w:color w:val="auto"/>
         </w:rPr>
       </w:pPr>
-      <w:bookmarkStart w:id="9" w:name="_Toc234742414"/>
+      <w:bookmarkStart w:id="9" w:name="_Toc235630721"/>
       <w:r>
         <w:rPr>
           <w:rFonts w:ascii="Times New Roman" w:hAnsi="Times New Roman" w:cs="Times New Roman"/>
@@ -5726,7 +6276,7 @@
           <w:color w:val="auto"/>
         </w:rPr>
       </w:pPr>
-      <w:bookmarkStart w:id="10" w:name="_Toc234742415"/>
+      <w:bookmarkStart w:id="10" w:name="_Toc235630722"/>
       <w:r>
         <w:rPr>
           <w:rFonts w:ascii="Times New Roman" w:hAnsi="Times New Roman" w:cs="Times New Roman"/>
@@ -5753,7 +6303,7 @@
           <w:color w:val="auto"/>
         </w:rPr>
       </w:pPr>
-      <w:bookmarkStart w:id="11" w:name="_Toc234742416"/>
+      <w:bookmarkStart w:id="11" w:name="_Toc235630723"/>
       <w:r>
         <w:rPr>
           <w:rFonts w:ascii="Times New Roman" w:hAnsi="Times New Roman" w:cs="Times New Roman"/>
@@ -6086,7 +6636,7 @@
           <w:color w:val="auto"/>
         </w:rPr>
       </w:pPr>
-      <w:bookmarkStart w:id="12" w:name="_Toc234742417"/>
+      <w:bookmarkStart w:id="12" w:name="_Toc235630724"/>
       <w:r>
         <w:rPr>
           <w:rFonts w:ascii="Times New Roman" w:hAnsi="Times New Roman" w:cs="Times New Roman"/>
@@ -6258,7 +6808,7 @@
           <w:color w:val="auto"/>
         </w:rPr>
       </w:pPr>
-      <w:bookmarkStart w:id="13" w:name="_Toc234742418"/>
+      <w:bookmarkStart w:id="13" w:name="_Toc235630725"/>
       <w:r>
         <w:rPr>
           <w:rFonts w:ascii="Times New Roman" w:hAnsi="Times New Roman" w:cs="Times New Roman"/>
@@ -6464,7 +7014,7 @@
           <w:color w:val="auto"/>
         </w:rPr>
       </w:pPr>
-      <w:bookmarkStart w:id="14" w:name="_Toc234742419"/>
+      <w:bookmarkStart w:id="14" w:name="_Toc235630726"/>
       <w:r>
         <w:rPr>
           <w:rFonts w:ascii="Times New Roman" w:hAnsi="Times New Roman" w:cs="Times New Roman"/>
@@ -6599,7 +7149,7 @@
           <w:color w:val="auto"/>
         </w:rPr>
       </w:pPr>
-      <w:bookmarkStart w:id="15" w:name="_Toc234742420"/>
+      <w:bookmarkStart w:id="15" w:name="_Toc235630727"/>
       <w:r>
         <w:rPr>
           <w:rFonts w:ascii="Times New Roman" w:hAnsi="Times New Roman" w:cs="Times New Roman"/>
@@ -6880,7 +7430,7 @@
           <w:color w:val="auto"/>
         </w:rPr>
       </w:pPr>
-      <w:bookmarkStart w:id="16" w:name="_Toc234742421"/>
+      <w:bookmarkStart w:id="16" w:name="_Toc235630728"/>
       <w:r>
         <w:rPr>
           <w:rFonts w:ascii="Times New Roman" w:hAnsi="Times New Roman" w:cs="Times New Roman"/>
@@ -6900,7 +7450,7 @@
           <w:color w:val="auto"/>
         </w:rPr>
       </w:pPr>
-      <w:bookmarkStart w:id="17" w:name="_Toc234742422"/>
+      <w:bookmarkStart w:id="17" w:name="_Toc235630729"/>
       <w:r>
         <w:rPr>
           <w:rFonts w:ascii="Times New Roman" w:hAnsi="Times New Roman" w:cs="Times New Roman"/>
@@ -6927,7 +7477,7 @@
           <w:color w:val="auto"/>
         </w:rPr>
       </w:pPr>
-      <w:bookmarkStart w:id="18" w:name="_Toc234742423"/>
+      <w:bookmarkStart w:id="18" w:name="_Toc235630730"/>
       <w:r>
         <w:rPr>
           <w:rFonts w:ascii="Times New Roman" w:hAnsi="Times New Roman" w:cs="Times New Roman"/>
@@ -6973,7 +7523,7 @@
           <w:color w:val="auto"/>
         </w:rPr>
       </w:pPr>
-      <w:bookmarkStart w:id="19" w:name="_Toc234742424"/>
+      <w:bookmarkStart w:id="19" w:name="_Toc235630731"/>
       <w:r>
         <w:rPr>
           <w:rFonts w:ascii="Times New Roman" w:hAnsi="Times New Roman" w:cs="Times New Roman"/>
@@ -7022,7 +7572,7 @@
           <w:szCs w:val="24"/>
         </w:rPr>
       </w:pPr>
-      <w:bookmarkStart w:id="20" w:name="_Toc234742425"/>
+      <w:bookmarkStart w:id="20" w:name="_Toc235630732"/>
       <w:r>
         <w:rPr>
           <w:rFonts w:ascii="Times New Roman" w:hAnsi="Times New Roman" w:cs="Times New Roman"/>
@@ -7169,7 +7719,7 @@
           <w:color w:val="auto"/>
         </w:rPr>
       </w:pPr>
-      <w:bookmarkStart w:id="21" w:name="_Toc234742426"/>
+      <w:bookmarkStart w:id="21" w:name="_Toc235630733"/>
       <w:r>
         <w:rPr>
           <w:rFonts w:ascii="Times New Roman" w:hAnsi="Times New Roman" w:cs="Times New Roman"/>
@@ -7215,7 +7765,7 @@
           <w:color w:val="auto"/>
         </w:rPr>
       </w:pPr>
-      <w:bookmarkStart w:id="22" w:name="_Toc234742427"/>
+      <w:bookmarkStart w:id="22" w:name="_Toc235630734"/>
       <w:r>
         <w:rPr>
           <w:rFonts w:ascii="Times New Roman" w:hAnsi="Times New Roman" w:cs="Times New Roman"/>
@@ -7261,7 +7811,7 @@
           <w:color w:val="auto"/>
         </w:rPr>
       </w:pPr>
-      <w:bookmarkStart w:id="23" w:name="_Toc234742428"/>
+      <w:bookmarkStart w:id="23" w:name="_Toc235630735"/>
       <w:r>
         <w:rPr>
           <w:rFonts w:ascii="Times New Roman" w:hAnsi="Times New Roman" w:cs="Times New Roman"/>
@@ -7355,7 +7905,7 @@
           <w:color w:val="auto"/>
         </w:rPr>
       </w:pPr>
-      <w:bookmarkStart w:id="24" w:name="_Toc234742429"/>
+      <w:bookmarkStart w:id="24" w:name="_Toc235630736"/>
       <w:r>
         <w:rPr>
           <w:rFonts w:ascii="Times New Roman" w:hAnsi="Times New Roman" w:cs="Times New Roman"/>
@@ -7434,7 +7984,7 @@
           <w:color w:val="auto"/>
         </w:rPr>
       </w:pPr>
-      <w:bookmarkStart w:id="25" w:name="_Toc234742430"/>
+      <w:bookmarkStart w:id="25" w:name="_Toc235630737"/>
       <w:r>
         <w:rPr>
           <w:rFonts w:ascii="Times New Roman" w:hAnsi="Times New Roman" w:cs="Times New Roman"/>
@@ -7542,7 +8092,7 @@
           <w:color w:val="auto"/>
         </w:rPr>
       </w:pPr>
-      <w:bookmarkStart w:id="26" w:name="_Toc234742431"/>
+      <w:bookmarkStart w:id="26" w:name="_Toc235630738"/>
       <w:r>
         <w:rPr>
           <w:rFonts w:ascii="Times New Roman" w:hAnsi="Times New Roman" w:cs="Times New Roman"/>
@@ -7638,7 +8188,7 @@
           <w:color w:val="auto"/>
         </w:rPr>
       </w:pPr>
-      <w:bookmarkStart w:id="27" w:name="_Toc234742432"/>
+      <w:bookmarkStart w:id="27" w:name="_Toc235630739"/>
       <w:r>
         <w:rPr>
           <w:rFonts w:ascii="Times New Roman" w:hAnsi="Times New Roman" w:cs="Times New Roman"/>
@@ -7676,14 +8226,21 @@
     </w:p>
     <w:p>
       <w:pPr>
-        <w:spacing w:after="120" w:line="360" w:lineRule="auto"/>
-        <w:jc w:val="both"/>
-        <w:rPr>
-          <w:rFonts w:ascii="Times New Roman" w:hAnsi="Times New Roman" w:cs="Times New Roman"/>
-          <w:sz w:val="24"/>
-          <w:szCs w:val="24"/>
-        </w:rPr>
-      </w:pPr>
+        <w:rPr>
+          <w:rFonts w:ascii="Times New Roman" w:eastAsiaTheme="majorEastAsia" w:hAnsi="Times New Roman" w:cs="Times New Roman"/>
+          <w:b/>
+          <w:bCs/>
+          <w:sz w:val="26"/>
+          <w:szCs w:val="26"/>
+        </w:rPr>
+      </w:pPr>
+      <w:bookmarkStart w:id="28" w:name="_Toc235630740"/>
+      <w:r>
+        <w:rPr>
+          <w:rFonts w:ascii="Times New Roman" w:hAnsi="Times New Roman" w:cs="Times New Roman"/>
+        </w:rPr>
+        <w:br w:type="page"/>
+      </w:r>
     </w:p>
     <w:p>
       <w:pPr>
@@ -7695,7 +8252,6 @@
           <w:color w:val="auto"/>
         </w:rPr>
       </w:pPr>
-      <w:bookmarkStart w:id="28" w:name="_Toc234742433"/>
       <w:r>
         <w:rPr>
           <w:rFonts w:ascii="Times New Roman" w:hAnsi="Times New Roman" w:cs="Times New Roman"/>
@@ -7800,7 +8356,7 @@
           <w:color w:val="auto"/>
         </w:rPr>
       </w:pPr>
-      <w:bookmarkStart w:id="29" w:name="_Toc234742434"/>
+      <w:bookmarkStart w:id="29" w:name="_Toc235630741"/>
       <w:r>
         <w:rPr>
           <w:rFonts w:ascii="Times New Roman" w:hAnsi="Times New Roman" w:cs="Times New Roman"/>
@@ -7846,7 +8402,7 @@
           <w:color w:val="auto"/>
         </w:rPr>
       </w:pPr>
-      <w:bookmarkStart w:id="30" w:name="_Toc234742435"/>
+      <w:bookmarkStart w:id="30" w:name="_Toc235630742"/>
       <w:r>
         <w:rPr>
           <w:rFonts w:ascii="Times New Roman" w:hAnsi="Times New Roman" w:cs="Times New Roman"/>
@@ -8096,9 +8652,9 @@
           <w:szCs w:val="24"/>
         </w:rPr>
         <w:drawing>
-          <wp:inline distT="0" distB="0" distL="0" distR="0" wp14:anchorId="2B33F3A7" wp14:editId="5E3CC468">
-            <wp:extent cx="6279952" cy="3244850"/>
-            <wp:effectExtent l="0" t="0" r="6985" b="0"/>
+          <wp:inline distT="0" distB="0" distL="0" distR="0" wp14:anchorId="51CA5E5E" wp14:editId="13A63239">
+            <wp:extent cx="6000750" cy="2819400"/>
+            <wp:effectExtent l="0" t="0" r="0" b="0"/>
             <wp:docPr id="1" name="Picture 1"/>
             <wp:cNvGraphicFramePr>
               <a:graphicFrameLocks xmlns:a="http://schemas.openxmlformats.org/drawingml/2006/main" noChangeAspect="1"/>
@@ -8119,7 +8675,7 @@
                   <pic:spPr>
                     <a:xfrm>
                       <a:off x="0" y="0"/>
-                      <a:ext cx="6395895" cy="3304758"/>
+                      <a:ext cx="6111971" cy="2871656"/>
                     </a:xfrm>
                     <a:prstGeom prst="rect">
                       <a:avLst/>
@@ -8152,7 +8708,7 @@
           <w:sz w:val="24"/>
           <w:szCs w:val="24"/>
         </w:rPr>
-        <w:t xml:space="preserve">Fig </w:t>
+        <w:t>Fig</w:t>
       </w:r>
       <w:r>
         <w:rPr>
@@ -8162,7 +8718,7 @@
           <w:sz w:val="24"/>
           <w:szCs w:val="24"/>
         </w:rPr>
-        <w:t>1: Project</w:t>
+        <w:t>ure</w:t>
       </w:r>
       <w:r>
         <w:rPr>
@@ -8172,6 +8728,36 @@
           <w:sz w:val="24"/>
           <w:szCs w:val="24"/>
         </w:rPr>
+        <w:t xml:space="preserve"> </w:t>
+      </w:r>
+      <w:r>
+        <w:rPr>
+          <w:rFonts w:ascii="Times New Roman" w:hAnsi="Times New Roman" w:cs="Times New Roman"/>
+          <w:i/>
+          <w:iCs/>
+          <w:sz w:val="24"/>
+          <w:szCs w:val="24"/>
+        </w:rPr>
+        <w:t>3.</w:t>
+      </w:r>
+      <w:r>
+        <w:rPr>
+          <w:rFonts w:ascii="Times New Roman" w:hAnsi="Times New Roman" w:cs="Times New Roman"/>
+          <w:i/>
+          <w:iCs/>
+          <w:sz w:val="24"/>
+          <w:szCs w:val="24"/>
+        </w:rPr>
+        <w:t>1: Project</w:t>
+      </w:r>
+      <w:r>
+        <w:rPr>
+          <w:rFonts w:ascii="Times New Roman" w:hAnsi="Times New Roman" w:cs="Times New Roman"/>
+          <w:i/>
+          <w:iCs/>
+          <w:sz w:val="24"/>
+          <w:szCs w:val="24"/>
+        </w:rPr>
         <w:t xml:space="preserve"> phase/ framework activities timeline.</w:t>
       </w:r>
     </w:p>
@@ -8184,7 +8770,7 @@
           <w:color w:val="auto"/>
         </w:rPr>
       </w:pPr>
-      <w:bookmarkStart w:id="31" w:name="_Toc234742436"/>
+      <w:bookmarkStart w:id="31" w:name="_Toc235630743"/>
       <w:r>
         <w:rPr>
           <w:rFonts w:ascii="Times New Roman" w:hAnsi="Times New Roman" w:cs="Times New Roman"/>
@@ -8203,7 +8789,7 @@
           <w:color w:val="auto"/>
         </w:rPr>
       </w:pPr>
-      <w:bookmarkStart w:id="32" w:name="_Toc234742437"/>
+      <w:bookmarkStart w:id="32" w:name="_Toc235630744"/>
       <w:r>
         <w:rPr>
           <w:rFonts w:ascii="Times New Roman" w:hAnsi="Times New Roman" w:cs="Times New Roman"/>
@@ -8240,7 +8826,7 @@
           <w:rFonts w:ascii="Times New Roman" w:hAnsi="Times New Roman" w:cs="Times New Roman"/>
         </w:rPr>
       </w:pPr>
-      <w:bookmarkStart w:id="33" w:name="_Toc234742438"/>
+      <w:bookmarkStart w:id="33" w:name="_Toc235630745"/>
       <w:r>
         <w:rPr>
           <w:rFonts w:ascii="Times New Roman" w:hAnsi="Times New Roman" w:cs="Times New Roman"/>
@@ -8261,7 +8847,7 @@
         </w:rPr>
       </w:pPr>
       <w:r>
-        <w:t>The project successfully produced and deployed a predictive credit scoring prototype that uses supply chain transaction data to classify SME credit risk. The analytical pipeline transforms uploaded or manually recorded transactions into structured behavioural variables. After an SME records at least five transactions, the system generates a credit score, risk band, creditworthy probability, explainable signals, and an indicative financing amount for SME and lender decision support.</w:t>
+        <w:t>The project successfully produced and deployed a predictive credit scoring prototype that uses supply chain transaction data to classify SME credit risk. The analytical pipeline transforms uploaded or manually recorded transactions into structured behavioural variables. After an SME record at least twelve transactions, the system generates a credit score, risk band, creditworthy probability, explainable signals, and an indicative financing amount for SME and lender decision support.</w:t>
       </w:r>
     </w:p>
     <w:p>
@@ -8275,6 +8861,11 @@
         </w:rPr>
       </w:pPr>
       <w:r>
+        <w:rPr>
+          <w:rFonts w:ascii="Times New Roman" w:hAnsi="Times New Roman" w:cs="Times New Roman"/>
+          <w:sz w:val="24"/>
+          <w:szCs w:val="24"/>
+        </w:rPr>
         <w:t>The findings show that supply-chain transaction behaviour can support alternative assessment of SMEs that lack sufficient collateral or audited financial statements. This is important in the Tanzanian context, where viable informal and semi-formal businesses may be excluded by traditional evaluation. The deployed Ushirika portal operationalises this approach through separate bilingual workspaces for SMEs, lenders, administrators, and sub-administrators.</w:t>
       </w:r>
     </w:p>
@@ -8283,22 +8874,38 @@
         <w:jc w:val="center"/>
       </w:pPr>
       <w:r>
+        <w:rPr>
+          <w:noProof/>
+        </w:rPr>
         <w:drawing>
-          <wp:inline xmlns:a="http://schemas.openxmlformats.org/drawingml/2006/main" xmlns:pic="http://schemas.openxmlformats.org/drawingml/2006/picture">
-            <wp:extent cx="5394960" cy="3371850"/>
+          <wp:inline distT="0" distB="0" distL="0" distR="0" wp14:anchorId="367A08AB" wp14:editId="5F68E7F2">
+            <wp:extent cx="5782310" cy="3000375"/>
+            <wp:effectExtent l="0" t="0" r="8890" b="9525"/>
             <wp:docPr id="3" name="Picture 3"/>
             <wp:cNvGraphicFramePr>
-              <a:graphicFrameLocks noChangeAspect="1"/>
+              <a:graphicFrameLocks xmlns:a="http://schemas.openxmlformats.org/drawingml/2006/main" noChangeAspect="1"/>
             </wp:cNvGraphicFramePr>
-            <a:graphic>
+            <a:graphic xmlns:a="http://schemas.openxmlformats.org/drawingml/2006/main">
               <a:graphicData uri="http://schemas.openxmlformats.org/drawingml/2006/picture">
-                <pic:pic>
+                <pic:pic xmlns:pic="http://schemas.openxmlformats.org/drawingml/2006/picture">
                   <pic:nvPicPr>
                     <pic:cNvPr id="0" name="02_sme_dashboard.png"/>
                     <pic:cNvPicPr/>
                   </pic:nvPicPr>
                   <pic:blipFill>
-                    <a:blip r:embed="rId19"/>
+                    <a:blip r:embed="rId11">
+                      <a:clrChange>
+                        <a:clrFrom>
+                          <a:srgbClr val="F3F7F8"/>
+                        </a:clrFrom>
+                        <a:clrTo>
+                          <a:srgbClr val="F3F7F8">
+                            <a:alpha val="0"/>
+                          </a:srgbClr>
+                        </a:clrTo>
+                      </a:clrChange>
+                      <a:alphaModFix/>
+                    </a:blip>
                     <a:stretch>
                       <a:fillRect/>
                     </a:stretch>
@@ -8306,9 +8913,11 @@
                   <pic:spPr>
                     <a:xfrm>
                       <a:off x="0" y="0"/>
-                      <a:ext cx="5394960" cy="3371850"/>
+                      <a:ext cx="5795028" cy="3006974"/>
                     </a:xfrm>
-                    <a:prstGeom prst="rect"/>
+                    <a:prstGeom prst="rect">
+                      <a:avLst/>
+                    </a:prstGeom>
                   </pic:spPr>
                 </pic:pic>
               </a:graphicData>
@@ -8325,7 +8934,6 @@
         <w:rPr>
           <w:rFonts w:ascii="Times New Roman" w:hAnsi="Times New Roman"/>
           <w:i/>
-          <w:sz w:val="22"/>
         </w:rPr>
         <w:t>Figure 4.1: SME credit overview showing the ML credit score, risk band, eligible financing, and score components.</w:t>
       </w:r>
@@ -8335,18 +8943,686 @@
         <w:jc w:val="center"/>
       </w:pPr>
       <w:r>
+        <w:rPr>
+          <w:noProof/>
+        </w:rPr>
         <w:drawing>
-          <wp:inline xmlns:a="http://schemas.openxmlformats.org/drawingml/2006/main" xmlns:pic="http://schemas.openxmlformats.org/drawingml/2006/picture">
-            <wp:extent cx="5394960" cy="3371850"/>
+          <wp:inline distT="0" distB="0" distL="0" distR="0" wp14:anchorId="00A990C6" wp14:editId="5ECC8860">
+            <wp:extent cx="5953125" cy="3371850"/>
+            <wp:effectExtent l="0" t="0" r="9525" b="0"/>
             <wp:docPr id="4" name="Picture 4"/>
             <wp:cNvGraphicFramePr>
-              <a:graphicFrameLocks noChangeAspect="1"/>
+              <a:graphicFrameLocks xmlns:a="http://schemas.openxmlformats.org/drawingml/2006/main" noChangeAspect="1"/>
             </wp:cNvGraphicFramePr>
-            <a:graphic>
+            <a:graphic xmlns:a="http://schemas.openxmlformats.org/drawingml/2006/main">
               <a:graphicData uri="http://schemas.openxmlformats.org/drawingml/2006/picture">
-                <pic:pic>
+                <pic:pic xmlns:pic="http://schemas.openxmlformats.org/drawingml/2006/picture">
                   <pic:nvPicPr>
                     <pic:cNvPr id="0" name="01_login.png"/>
+                    <pic:cNvPicPr/>
+                  </pic:nvPicPr>
+                  <pic:blipFill>
+                    <a:blip r:embed="rId12"/>
+                    <a:stretch>
+                      <a:fillRect/>
+                    </a:stretch>
+                  </pic:blipFill>
+                  <pic:spPr>
+                    <a:xfrm>
+                      <a:off x="0" y="0"/>
+                      <a:ext cx="5953125" cy="3371850"/>
+                    </a:xfrm>
+                    <a:prstGeom prst="rect">
+                      <a:avLst/>
+                    </a:prstGeom>
+                  </pic:spPr>
+                </pic:pic>
+              </a:graphicData>
+            </a:graphic>
+          </wp:inline>
+        </w:drawing>
+      </w:r>
+    </w:p>
+    <w:p>
+      <w:pPr>
+        <w:jc w:val="center"/>
+      </w:pPr>
+      <w:r>
+        <w:rPr>
+          <w:rFonts w:ascii="Times New Roman" w:hAnsi="Times New Roman"/>
+          <w:i/>
+        </w:rPr>
+        <w:t>Figure 4.2: Ushirika authentication screen (secure ID and PIN login).</w:t>
+      </w:r>
+    </w:p>
+    <w:p>
+      <w:pPr>
+        <w:pStyle w:val="Heading2"/>
+        <w:spacing w:line="360" w:lineRule="auto"/>
+        <w:rPr>
+          <w:rFonts w:ascii="Times New Roman" w:hAnsi="Times New Roman" w:cs="Times New Roman"/>
+          <w:color w:val="auto"/>
+        </w:rPr>
+      </w:pPr>
+      <w:bookmarkStart w:id="34" w:name="_Toc235630746"/>
+      <w:r>
+        <w:rPr>
+          <w:rFonts w:ascii="Times New Roman" w:hAnsi="Times New Roman" w:cs="Times New Roman"/>
+          <w:color w:val="auto"/>
+        </w:rPr>
+        <w:t>4.2 Pre-processing Results</w:t>
+      </w:r>
+      <w:bookmarkEnd w:id="34"/>
+    </w:p>
+    <w:p>
+      <w:pPr>
+        <w:spacing w:line="360" w:lineRule="auto"/>
+        <w:jc w:val="both"/>
+        <w:rPr>
+          <w:rFonts w:ascii="Times New Roman" w:hAnsi="Times New Roman" w:cs="Times New Roman"/>
+          <w:sz w:val="24"/>
+          <w:szCs w:val="24"/>
+        </w:rPr>
+      </w:pPr>
+      <w:r>
+        <w:rPr>
+          <w:rFonts w:ascii="Times New Roman" w:hAnsi="Times New Roman" w:cs="Times New Roman"/>
+          <w:sz w:val="24"/>
+          <w:szCs w:val="24"/>
+        </w:rPr>
+        <w:t>The preprocessing stage cleaned and prepared transaction data by validating required values, handling missing values, converting dates and amounts, normalising categorical values, and detecting unusual transactions. Numerical gaps were filled using median imputation, noisy continuous values were controlled using interquartile-range clipping, and the train/test process was stratified to preserve class balance. The platform accepts both English and Kiswahili CSV templates and manual transaction entry; counterparty TIN is optional because some informal buyers and suppliers do not possess one.</w:t>
+      </w:r>
+    </w:p>
+    <w:p>
+      <w:pPr>
+        <w:spacing w:line="360" w:lineRule="auto"/>
+        <w:jc w:val="both"/>
+        <w:rPr>
+          <w:rFonts w:ascii="Times New Roman" w:hAnsi="Times New Roman" w:cs="Times New Roman"/>
+          <w:sz w:val="24"/>
+          <w:szCs w:val="24"/>
+        </w:rPr>
+      </w:pPr>
+      <w:r>
+        <w:rPr>
+          <w:rFonts w:ascii="Times New Roman" w:hAnsi="Times New Roman" w:cs="Times New Roman"/>
+          <w:sz w:val="24"/>
+          <w:szCs w:val="24"/>
+        </w:rPr>
+        <w:t>Feature engineering converted raw transaction activity into predictive variables that reflect SME behaviour. These included payment reliability, average and maximum delay, transaction volume and frequency, account age, order completion, default and compliance rates, partner diversity, sales trend, on-time payment rate, intervals between transactions, buyer/supplier shares, and order-type mix. Rare high-value transactions were flagged so that a single unusual invoice would not inflate the indicative financing amount.</w:t>
+      </w:r>
+    </w:p>
+    <w:p>
+      <w:pPr>
+        <w:jc w:val="center"/>
+      </w:pPr>
+      <w:r>
+        <w:rPr>
+          <w:noProof/>
+        </w:rPr>
+        <w:drawing>
+          <wp:inline distT="0" distB="0" distL="0" distR="0" wp14:anchorId="652772D0" wp14:editId="450C651D">
+            <wp:extent cx="5619750" cy="3105150"/>
+            <wp:effectExtent l="0" t="0" r="0" b="0"/>
+            <wp:docPr id="5" name="Picture 5"/>
+            <wp:cNvGraphicFramePr>
+              <a:graphicFrameLocks xmlns:a="http://schemas.openxmlformats.org/drawingml/2006/main" noChangeAspect="1"/>
+            </wp:cNvGraphicFramePr>
+            <a:graphic xmlns:a="http://schemas.openxmlformats.org/drawingml/2006/main">
+              <a:graphicData uri="http://schemas.openxmlformats.org/drawingml/2006/picture">
+                <pic:pic xmlns:pic="http://schemas.openxmlformats.org/drawingml/2006/picture">
+                  <pic:nvPicPr>
+                    <pic:cNvPr id="0" name="03_sme_transactions.png"/>
+                    <pic:cNvPicPr/>
+                  </pic:nvPicPr>
+                  <pic:blipFill>
+                    <a:blip r:embed="rId13"/>
+                    <a:stretch>
+                      <a:fillRect/>
+                    </a:stretch>
+                  </pic:blipFill>
+                  <pic:spPr>
+                    <a:xfrm>
+                      <a:off x="0" y="0"/>
+                      <a:ext cx="5619750" cy="3105150"/>
+                    </a:xfrm>
+                    <a:prstGeom prst="rect">
+                      <a:avLst/>
+                    </a:prstGeom>
+                  </pic:spPr>
+                </pic:pic>
+              </a:graphicData>
+            </a:graphic>
+          </wp:inline>
+        </w:drawing>
+      </w:r>
+    </w:p>
+    <w:p>
+      <w:pPr>
+        <w:jc w:val="center"/>
+      </w:pPr>
+      <w:r>
+        <w:rPr>
+          <w:rFonts w:ascii="Times New Roman" w:hAnsi="Times New Roman"/>
+          <w:i/>
+        </w:rPr>
+        <w:t>Figure 4.3: SME transaction register providing supply-chain activity used for feature engineering.</w:t>
+      </w:r>
+    </w:p>
+    <w:p>
+      <w:pPr>
+        <w:jc w:val="center"/>
+      </w:pPr>
+      <w:r>
+        <w:rPr>
+          <w:noProof/>
+        </w:rPr>
+        <w:drawing>
+          <wp:inline distT="0" distB="0" distL="0" distR="0" wp14:anchorId="218B9BFF" wp14:editId="2773A2C0">
+            <wp:extent cx="5772150" cy="3076575"/>
+            <wp:effectExtent l="0" t="0" r="0" b="9525"/>
+            <wp:docPr id="6" name="Picture 6"/>
+            <wp:cNvGraphicFramePr>
+              <a:graphicFrameLocks xmlns:a="http://schemas.openxmlformats.org/drawingml/2006/main" noChangeAspect="1"/>
+            </wp:cNvGraphicFramePr>
+            <a:graphic xmlns:a="http://schemas.openxmlformats.org/drawingml/2006/main">
+              <a:graphicData uri="http://schemas.openxmlformats.org/drawingml/2006/picture">
+                <pic:pic xmlns:pic="http://schemas.openxmlformats.org/drawingml/2006/picture">
+                  <pic:nvPicPr>
+                    <pic:cNvPr id="0" name="04_sme_upload.png"/>
+                    <pic:cNvPicPr/>
+                  </pic:nvPicPr>
+                  <pic:blipFill>
+                    <a:blip r:embed="rId14"/>
+                    <a:stretch>
+                      <a:fillRect/>
+                    </a:stretch>
+                  </pic:blipFill>
+                  <pic:spPr>
+                    <a:xfrm>
+                      <a:off x="0" y="0"/>
+                      <a:ext cx="5772150" cy="3076575"/>
+                    </a:xfrm>
+                    <a:prstGeom prst="rect">
+                      <a:avLst/>
+                    </a:prstGeom>
+                  </pic:spPr>
+                </pic:pic>
+              </a:graphicData>
+            </a:graphic>
+          </wp:inline>
+        </w:drawing>
+      </w:r>
+    </w:p>
+    <w:p>
+      <w:pPr>
+        <w:jc w:val="center"/>
+      </w:pPr>
+      <w:r>
+        <w:rPr>
+          <w:rFonts w:ascii="Times New Roman" w:hAnsi="Times New Roman"/>
+          <w:i/>
+        </w:rPr>
+        <w:t>Figure 4.4: CSV upload interface for importing transactional statements into the preprocessing pipeline.</w:t>
+      </w:r>
+    </w:p>
+    <w:p>
+      <w:pPr>
+        <w:pStyle w:val="Heading2"/>
+        <w:spacing w:line="360" w:lineRule="auto"/>
+        <w:rPr>
+          <w:rFonts w:ascii="Times New Roman" w:hAnsi="Times New Roman" w:cs="Times New Roman"/>
+          <w:color w:val="auto"/>
+        </w:rPr>
+      </w:pPr>
+      <w:bookmarkStart w:id="35" w:name="_Toc235630747"/>
+      <w:r>
+        <w:rPr>
+          <w:rFonts w:ascii="Times New Roman" w:hAnsi="Times New Roman" w:cs="Times New Roman"/>
+          <w:color w:val="auto"/>
+        </w:rPr>
+        <w:t>4.3 Project Results</w:t>
+      </w:r>
+      <w:bookmarkEnd w:id="35"/>
+    </w:p>
+    <w:p>
+      <w:pPr>
+        <w:spacing w:line="360" w:lineRule="auto"/>
+        <w:jc w:val="both"/>
+        <w:rPr>
+          <w:rFonts w:ascii="Times New Roman" w:hAnsi="Times New Roman" w:cs="Times New Roman"/>
+          <w:sz w:val="24"/>
+          <w:szCs w:val="24"/>
+        </w:rPr>
+      </w:pPr>
+      <w:r>
+        <w:rPr>
+          <w:rFonts w:ascii="Times New Roman" w:hAnsi="Times New Roman" w:cs="Times New Roman"/>
+          <w:sz w:val="24"/>
+          <w:szCs w:val="24"/>
+        </w:rPr>
+        <w:t>The first specific objective was achieved. The implemented preprocessing and feature engineering pipeline transforms raw supply-chain transactions into seventeen behavioural predictors and outlier indicators. The same pipeline is used when SMEs upload a CSV file or record transactions manually, thereby connecting the analytical method directly to the working system.</w:t>
+      </w:r>
+    </w:p>
+    <w:p>
+      <w:pPr>
+        <w:spacing w:line="360" w:lineRule="auto"/>
+        <w:jc w:val="both"/>
+        <w:rPr>
+          <w:rFonts w:ascii="Times New Roman" w:hAnsi="Times New Roman" w:cs="Times New Roman"/>
+          <w:sz w:val="24"/>
+          <w:szCs w:val="24"/>
+        </w:rPr>
+      </w:pPr>
+      <w:r>
+        <w:rPr>
+          <w:rFonts w:ascii="Times New Roman" w:hAnsi="Times New Roman" w:cs="Times New Roman"/>
+          <w:sz w:val="24"/>
+          <w:szCs w:val="24"/>
+        </w:rPr>
+        <w:t>The second specific objective was achieved by comparing Logistic Regression as the classical baseline with Random Forest as the ensemble model on the same stratified 80:20 train/test split. On the hold-out test data, Random Forest achieved 88.6% accuracy, 93.0% precision, 85.7% recall, 89.2% F1-score, and 95.8% ROC-AUC. Logistic Regression achieved 77.9% accuracy, 75.8% precision, 87.7% recall, 81.3% F1-score, and 87.5% ROC-AUC. Random Forest was therefore selected as the primary scorer because it provided the stronger overall discrimination and classification balance.</w:t>
+      </w:r>
+    </w:p>
+    <w:p>
+      <w:pPr>
+        <w:spacing w:line="360" w:lineRule="auto"/>
+        <w:jc w:val="both"/>
+        <w:rPr>
+          <w:rFonts w:ascii="Times New Roman" w:hAnsi="Times New Roman" w:cs="Times New Roman"/>
+          <w:sz w:val="24"/>
+          <w:szCs w:val="24"/>
+        </w:rPr>
+      </w:pPr>
+      <w:r>
+        <w:t>The third specific objective was achieved through hold-out accuracy, precision, recall, F1-score, ROC-AUC, and confusion-matrix evaluation. Five-fold GridSearchCV was applied on the training portion using ROC-AUC as the selection measure, while the final metrics were calculated on unseen test data. These controls, together with a minimum of twelve transactions before scoring and conservative score and financing rules, provide a transparent basis for interpreting the prototype's predictions.</w:t>
+      </w:r>
+    </w:p>
+    <w:p>
+      <w:pPr>
+        <w:jc w:val="center"/>
+      </w:pPr>
+      <w:r>
+        <w:rPr>
+          <w:noProof/>
+        </w:rPr>
+        <w:drawing>
+          <wp:inline distT="0" distB="0" distL="0" distR="0" wp14:anchorId="1CD2CB9C" wp14:editId="27C79038">
+            <wp:extent cx="5819044" cy="3276600"/>
+            <wp:effectExtent l="0" t="0" r="0" b="0"/>
+            <wp:docPr id="7" name="Picture 7"/>
+            <wp:cNvGraphicFramePr>
+              <a:graphicFrameLocks xmlns:a="http://schemas.openxmlformats.org/drawingml/2006/main" noChangeAspect="1"/>
+            </wp:cNvGraphicFramePr>
+            <a:graphic xmlns:a="http://schemas.openxmlformats.org/drawingml/2006/main">
+              <a:graphicData uri="http://schemas.openxmlformats.org/drawingml/2006/picture">
+                <pic:pic xmlns:pic="http://schemas.openxmlformats.org/drawingml/2006/picture">
+                  <pic:nvPicPr>
+                    <pic:cNvPr id="0" name="05_lender_portfolio.png"/>
+                    <pic:cNvPicPr/>
+                  </pic:nvPicPr>
+                  <pic:blipFill>
+                    <a:blip r:embed="rId15"/>
+                    <a:stretch>
+                      <a:fillRect/>
+                    </a:stretch>
+                  </pic:blipFill>
+                  <pic:spPr>
+                    <a:xfrm>
+                      <a:off x="0" y="0"/>
+                      <a:ext cx="5837728" cy="3287120"/>
+                    </a:xfrm>
+                    <a:prstGeom prst="rect">
+                      <a:avLst/>
+                    </a:prstGeom>
+                  </pic:spPr>
+                </pic:pic>
+              </a:graphicData>
+            </a:graphic>
+          </wp:inline>
+        </w:drawing>
+      </w:r>
+    </w:p>
+    <w:p>
+      <w:pPr>
+        <w:jc w:val="center"/>
+      </w:pPr>
+      <w:r>
+        <w:t>Figure 4.5: Lender list of SMEs with risk classification, credit scores, and NIDA search.</w:t>
+      </w:r>
+    </w:p>
+    <w:p>
+      <w:pPr>
+        <w:jc w:val="center"/>
+      </w:pPr>
+      <w:r>
+        <w:rPr>
+          <w:rFonts w:ascii="Times New Roman" w:hAnsi="Times New Roman" w:cs="Times New Roman"/>
+          <w:noProof/>
+        </w:rPr>
+        <w:drawing>
+          <wp:inline distT="0" distB="0" distL="0" distR="0" wp14:anchorId="09410213" wp14:editId="0C7FF6BA">
+            <wp:extent cx="5648325" cy="3067050"/>
+            <wp:effectExtent l="0" t="0" r="9525" b="0"/>
+            <wp:docPr id="8" name="Picture 8"/>
+            <wp:cNvGraphicFramePr>
+              <a:graphicFrameLocks xmlns:a="http://schemas.openxmlformats.org/drawingml/2006/main" noChangeAspect="1"/>
+            </wp:cNvGraphicFramePr>
+            <a:graphic xmlns:a="http://schemas.openxmlformats.org/drawingml/2006/main">
+              <a:graphicData uri="http://schemas.openxmlformats.org/drawingml/2006/picture">
+                <pic:pic xmlns:pic="http://schemas.openxmlformats.org/drawingml/2006/picture">
+                  <pic:nvPicPr>
+                    <pic:cNvPr id="0" name="06_lender_sme_detail.png"/>
+                    <pic:cNvPicPr/>
+                  </pic:nvPicPr>
+                  <pic:blipFill>
+                    <a:blip r:embed="rId16"/>
+                    <a:stretch>
+                      <a:fillRect/>
+                    </a:stretch>
+                  </pic:blipFill>
+                  <pic:spPr>
+                    <a:xfrm>
+                      <a:off x="0" y="0"/>
+                      <a:ext cx="5648325" cy="3067050"/>
+                    </a:xfrm>
+                    <a:prstGeom prst="rect">
+                      <a:avLst/>
+                    </a:prstGeom>
+                  </pic:spPr>
+                </pic:pic>
+              </a:graphicData>
+            </a:graphic>
+          </wp:inline>
+        </w:drawing>
+      </w:r>
+    </w:p>
+    <w:p>
+      <w:pPr>
+        <w:jc w:val="center"/>
+      </w:pPr>
+      <w:r>
+        <w:rPr>
+          <w:rFonts w:ascii="Times New Roman" w:hAnsi="Times New Roman"/>
+          <w:i/>
+        </w:rPr>
+        <w:t>Figure 4.6: Lender SME detail profile (including TIN) with tabbed ML analytics.</w:t>
+      </w:r>
+    </w:p>
+    <w:p>
+      <w:pPr>
+        <w:jc w:val="center"/>
+      </w:pPr>
+      <w:r>
+        <w:rPr>
+          <w:noProof/>
+        </w:rPr>
+        <w:drawing>
+          <wp:inline distT="0" distB="0" distL="0" distR="0" wp14:anchorId="7F166885" wp14:editId="5902B9AF">
+            <wp:extent cx="5667375" cy="4308726"/>
+            <wp:effectExtent l="0" t="0" r="0" b="0"/>
+            <wp:docPr id="9" name="Picture 9"/>
+            <wp:cNvGraphicFramePr>
+              <a:graphicFrameLocks xmlns:a="http://schemas.openxmlformats.org/drawingml/2006/main" noChangeAspect="1"/>
+            </wp:cNvGraphicFramePr>
+            <a:graphic xmlns:a="http://schemas.openxmlformats.org/drawingml/2006/main">
+              <a:graphicData uri="http://schemas.openxmlformats.org/drawingml/2006/picture">
+                <pic:pic xmlns:pic="http://schemas.openxmlformats.org/drawingml/2006/picture">
+                  <pic:nvPicPr>
+                    <pic:cNvPr id="0" name="09_lender_ml_metrics.png"/>
+                    <pic:cNvPicPr/>
+                  </pic:nvPicPr>
+                  <pic:blipFill>
+                    <a:blip r:embed="rId17"/>
+                    <a:stretch>
+                      <a:fillRect/>
+                    </a:stretch>
+                  </pic:blipFill>
+                  <pic:spPr>
+                    <a:xfrm>
+                      <a:off x="0" y="0"/>
+                      <a:ext cx="5675459" cy="4314872"/>
+                    </a:xfrm>
+                    <a:prstGeom prst="rect">
+                      <a:avLst/>
+                    </a:prstGeom>
+                  </pic:spPr>
+                </pic:pic>
+              </a:graphicData>
+            </a:graphic>
+          </wp:inline>
+        </w:drawing>
+      </w:r>
+    </w:p>
+    <w:p>
+      <w:pPr>
+        <w:jc w:val="center"/>
+      </w:pPr>
+      <w:r>
+        <w:rPr>
+          <w:rFonts w:ascii="Times New Roman" w:hAnsi="Times New Roman"/>
+          <w:i/>
+        </w:rPr>
+        <w:t>Figure 4.7: ML metrics panel for a selected SME (score, risk, probability, and financing).</w:t>
+      </w:r>
+    </w:p>
+    <w:p>
+      <w:pPr>
+        <w:jc w:val="center"/>
+      </w:pPr>
+      <w:r>
+        <w:rPr>
+          <w:noProof/>
+        </w:rPr>
+        <w:drawing>
+          <wp:inline distT="0" distB="0" distL="0" distR="0" wp14:anchorId="42DF541A" wp14:editId="66DDF6E7">
+            <wp:extent cx="5915025" cy="3767278"/>
+            <wp:effectExtent l="0" t="0" r="0" b="5080"/>
+            <wp:docPr id="10" name="Picture 10"/>
+            <wp:cNvGraphicFramePr>
+              <a:graphicFrameLocks xmlns:a="http://schemas.openxmlformats.org/drawingml/2006/main" noChangeAspect="1"/>
+            </wp:cNvGraphicFramePr>
+            <a:graphic xmlns:a="http://schemas.openxmlformats.org/drawingml/2006/main">
+              <a:graphicData uri="http://schemas.openxmlformats.org/drawingml/2006/picture">
+                <pic:pic xmlns:pic="http://schemas.openxmlformats.org/drawingml/2006/picture">
+                  <pic:nvPicPr>
+                    <pic:cNvPr id="0" name="10_lender_signals.png"/>
+                    <pic:cNvPicPr/>
+                  </pic:nvPicPr>
+                  <pic:blipFill>
+                    <a:blip r:embed="rId18"/>
+                    <a:stretch>
+                      <a:fillRect/>
+                    </a:stretch>
+                  </pic:blipFill>
+                  <pic:spPr>
+                    <a:xfrm>
+                      <a:off x="0" y="0"/>
+                      <a:ext cx="5928990" cy="3776172"/>
+                    </a:xfrm>
+                    <a:prstGeom prst="rect">
+                      <a:avLst/>
+                    </a:prstGeom>
+                  </pic:spPr>
+                </pic:pic>
+              </a:graphicData>
+            </a:graphic>
+          </wp:inline>
+        </w:drawing>
+      </w:r>
+    </w:p>
+    <w:p>
+      <w:pPr>
+        <w:jc w:val="center"/>
+      </w:pPr>
+      <w:r>
+        <w:rPr>
+          <w:rFonts w:ascii="Times New Roman" w:hAnsi="Times New Roman"/>
+          <w:i/>
+        </w:rPr>
+        <w:t>Figure 4.8: Explainable score signals derived from the SME’s engineered features.</w:t>
+      </w:r>
+    </w:p>
+    <w:p>
+      <w:pPr>
+        <w:pStyle w:val="Heading2"/>
+        <w:spacing w:line="360" w:lineRule="auto"/>
+        <w:rPr>
+          <w:rFonts w:ascii="Times New Roman" w:hAnsi="Times New Roman" w:cs="Times New Roman"/>
+          <w:color w:val="auto"/>
+        </w:rPr>
+      </w:pPr>
+      <w:bookmarkStart w:id="36" w:name="_Toc235630748"/>
+      <w:r>
+        <w:rPr>
+          <w:rFonts w:ascii="Times New Roman" w:hAnsi="Times New Roman" w:cs="Times New Roman"/>
+          <w:color w:val="auto"/>
+        </w:rPr>
+        <w:t>4.4 Discussion</w:t>
+      </w:r>
+      <w:bookmarkEnd w:id="36"/>
+    </w:p>
+    <w:p>
+      <w:pPr>
+        <w:spacing w:line="360" w:lineRule="auto"/>
+        <w:jc w:val="both"/>
+        <w:rPr>
+          <w:rFonts w:ascii="Times New Roman" w:hAnsi="Times New Roman" w:cs="Times New Roman"/>
+          <w:sz w:val="24"/>
+          <w:szCs w:val="24"/>
+        </w:rPr>
+      </w:pPr>
+      <w:r>
+        <w:rPr>
+          <w:rFonts w:ascii="Times New Roman" w:hAnsi="Times New Roman" w:cs="Times New Roman"/>
+          <w:sz w:val="24"/>
+          <w:szCs w:val="24"/>
+        </w:rPr>
+        <w:t>The overall findings support the suitability of machine learning for alternative SME credit assessment where conventional financial information is limited. The stronger Random Forest ROC-AUC of 95.8%, compared with 87.5% for Logistic Regression, indicates that non-linear relationships in payment behaviour, volume, delays, and value-chain roles were useful for ranking risk in the evaluated data. However, the result should be interpreted as prototype evidence rather than proof of performance across all Tanzanian SMEs.</w:t>
+      </w:r>
+    </w:p>
+    <w:p>
+      <w:pPr>
+        <w:spacing w:line="360" w:lineRule="auto"/>
+        <w:jc w:val="both"/>
+        <w:rPr>
+          <w:rFonts w:ascii="Times New Roman" w:hAnsi="Times New Roman" w:cs="Times New Roman"/>
+          <w:sz w:val="24"/>
+          <w:szCs w:val="24"/>
+        </w:rPr>
+      </w:pPr>
+      <w:r>
+        <w:rPr>
+          <w:rFonts w:ascii="Times New Roman" w:hAnsi="Times New Roman" w:cs="Times New Roman"/>
+          <w:sz w:val="24"/>
+          <w:szCs w:val="24"/>
+        </w:rPr>
+        <w:t>The Random Forest result is consistent with Breiman (2001) and Lessmann et al. (2015), who demonstrate the value of ensemble methods for complex classification and credit-scoring tasks. The use of transaction behaviour as an alternative signal also agrees with Khandani et al. (2010), while the inclusion of buyer-supplier relationships reflects the value-chain financing perspective discussed by Klapper (2006). The project contributes by converting these ideas into a working Tanzanian SME credit-risk prototype rather than presenting only a theoretical model.</w:t>
+      </w:r>
+    </w:p>
+    <w:p>
+      <w:pPr>
+        <w:spacing w:line="360" w:lineRule="auto"/>
+        <w:jc w:val="both"/>
+        <w:rPr>
+          <w:rFonts w:ascii="Times New Roman" w:hAnsi="Times New Roman" w:cs="Times New Roman"/>
+          <w:sz w:val="24"/>
+          <w:szCs w:val="24"/>
+        </w:rPr>
+      </w:pPr>
+      <w:r>
+        <w:rPr>
+          <w:rFonts w:ascii="Times New Roman" w:hAnsi="Times New Roman" w:cs="Times New Roman"/>
+          <w:sz w:val="24"/>
+          <w:szCs w:val="24"/>
+        </w:rPr>
+        <w:t>Although the prototype is deployed online and its core workflows are operational, it is not yet a bank-production system. The training evidence still depends partly on synthetic bootstrap data and engineered labels because sufficiently large longitudinal repayment datasets from Tanzanian SMEs were not available. Transaction quality, sparse histories, free-tier cloud cold starts, and the absence of formal integration with national identity, banking, ERP, and credit-bureau systems may affect operational reliability and generalisability.</w:t>
+      </w:r>
+    </w:p>
+    <w:p>
+      <w:pPr>
+        <w:jc w:val="center"/>
+      </w:pPr>
+      <w:r>
+        <w:rPr>
+          <w:rFonts w:ascii="Times New Roman" w:hAnsi="Times New Roman" w:cs="Times New Roman"/>
+          <w:noProof/>
+        </w:rPr>
+        <w:drawing>
+          <wp:inline distT="0" distB="0" distL="0" distR="0" wp14:anchorId="7CF22185" wp14:editId="434D1BF8">
+            <wp:extent cx="5838825" cy="3371769"/>
+            <wp:effectExtent l="57150" t="57150" r="47625" b="57785"/>
+            <wp:docPr id="11" name="Picture 11"/>
+            <wp:cNvGraphicFramePr>
+              <a:graphicFrameLocks xmlns:a="http://schemas.openxmlformats.org/drawingml/2006/main" noChangeAspect="1"/>
+            </wp:cNvGraphicFramePr>
+            <a:graphic xmlns:a="http://schemas.openxmlformats.org/drawingml/2006/main">
+              <a:graphicData uri="http://schemas.openxmlformats.org/drawingml/2006/picture">
+                <pic:pic xmlns:pic="http://schemas.openxmlformats.org/drawingml/2006/picture">
+                  <pic:nvPicPr>
+                    <pic:cNvPr id="0" name="07_admin_accounts.png"/>
+                    <pic:cNvPicPr/>
+                  </pic:nvPicPr>
+                  <pic:blipFill rotWithShape="1">
+                    <a:blip r:embed="rId19"/>
+                    <a:srcRect t="1492" b="1492"/>
+                    <a:stretch/>
+                  </pic:blipFill>
+                  <pic:spPr>
+                    <a:xfrm>
+                      <a:off x="0" y="0"/>
+                      <a:ext cx="5853020" cy="3379966"/>
+                    </a:xfrm>
+                    <a:prstGeom prst="rect">
+                      <a:avLst/>
+                    </a:prstGeom>
+                    <a:ln w="57150">
+                      <a:solidFill>
+                        <a:schemeClr val="tx1"/>
+                      </a:solidFill>
+                    </a:ln>
+                    <a:effectLst/>
+                  </pic:spPr>
+                </pic:pic>
+              </a:graphicData>
+            </a:graphic>
+          </wp:inline>
+        </w:drawing>
+      </w:r>
+    </w:p>
+    <w:p>
+      <w:pPr>
+        <w:jc w:val="center"/>
+      </w:pPr>
+      <w:r>
+        <w:rPr>
+          <w:rFonts w:ascii="Times New Roman" w:hAnsi="Times New Roman"/>
+          <w:i/>
+        </w:rPr>
+        <w:t>Figure 4.9: Admin governance screen for managing SME and lender accounts in the prototype.</w:t>
+      </w:r>
+    </w:p>
+    <w:p>
+      <w:pPr>
+        <w:jc w:val="center"/>
+      </w:pPr>
+      <w:r>
+        <w:rPr>
+          <w:rFonts w:ascii="Times New Roman" w:hAnsi="Times New Roman" w:cs="Times New Roman"/>
+          <w:noProof/>
+        </w:rPr>
+        <w:drawing>
+          <wp:inline distT="0" distB="0" distL="0" distR="0" wp14:anchorId="56C9E922" wp14:editId="7B95136A">
+            <wp:extent cx="5942215" cy="2924175"/>
+            <wp:effectExtent l="0" t="0" r="1905" b="0"/>
+            <wp:docPr id="12" name="Picture 12"/>
+            <wp:cNvGraphicFramePr>
+              <a:graphicFrameLocks xmlns:a="http://schemas.openxmlformats.org/drawingml/2006/main" noChangeAspect="1"/>
+            </wp:cNvGraphicFramePr>
+            <a:graphic xmlns:a="http://schemas.openxmlformats.org/drawingml/2006/main">
+              <a:graphicData uri="http://schemas.openxmlformats.org/drawingml/2006/picture">
+                <pic:pic xmlns:pic="http://schemas.openxmlformats.org/drawingml/2006/picture">
+                  <pic:nvPicPr>
+                    <pic:cNvPr id="0" name="11_lender_recent_tx.png"/>
                     <pic:cNvPicPr/>
                   </pic:nvPicPr>
                   <pic:blipFill>
@@ -8358,9 +9634,11 @@
                   <pic:spPr>
                     <a:xfrm>
                       <a:off x="0" y="0"/>
-                      <a:ext cx="5394960" cy="3371850"/>
+                      <a:ext cx="5957644" cy="2931768"/>
                     </a:xfrm>
-                    <a:prstGeom prst="rect"/>
+                    <a:prstGeom prst="rect">
+                      <a:avLst/>
+                    </a:prstGeom>
                   </pic:spPr>
                 </pic:pic>
               </a:graphicData>
@@ -8377,10 +9655,38 @@
         <w:rPr>
           <w:rFonts w:ascii="Times New Roman" w:hAnsi="Times New Roman"/>
           <w:i/>
-          <w:sz w:val="22"/>
-        </w:rPr>
-        <w:t>Figure 4.2: Ushirika authentication screen (secure ID and PIN login).</w:t>
-      </w:r>
+        </w:rPr>
+        <w:t>Figure 4.10: Recent transactions view used by lenders when reviewing an SME’s repayment behaviour.</w:t>
+      </w:r>
+    </w:p>
+    <w:p>
+      <w:pPr>
+        <w:spacing w:line="360" w:lineRule="auto"/>
+        <w:rPr>
+          <w:rFonts w:ascii="Times New Roman" w:hAnsi="Times New Roman" w:cs="Times New Roman"/>
+          <w:sz w:val="24"/>
+          <w:szCs w:val="24"/>
+        </w:rPr>
+      </w:pPr>
+    </w:p>
+    <w:p>
+      <w:pPr>
+        <w:pStyle w:val="Heading1"/>
+        <w:spacing w:line="360" w:lineRule="auto"/>
+        <w:rPr>
+          <w:rFonts w:ascii="Times New Roman" w:hAnsi="Times New Roman" w:cs="Times New Roman"/>
+          <w:color w:val="auto"/>
+        </w:rPr>
+      </w:pPr>
+      <w:bookmarkStart w:id="37" w:name="_Toc235630749"/>
+      <w:r>
+        <w:rPr>
+          <w:rFonts w:ascii="Times New Roman" w:hAnsi="Times New Roman" w:cs="Times New Roman"/>
+          <w:color w:val="auto"/>
+        </w:rPr>
+        <w:t>CHAPTER FIVE</w:t>
+      </w:r>
+      <w:bookmarkEnd w:id="37"/>
     </w:p>
     <w:p>
       <w:pPr>
@@ -8391,15 +9697,41 @@
           <w:color w:val="auto"/>
         </w:rPr>
       </w:pPr>
-      <w:bookmarkStart w:id="34" w:name="_Toc234742439"/>
+      <w:bookmarkStart w:id="38" w:name="_Toc235630750"/>
       <w:r>
         <w:rPr>
           <w:rFonts w:ascii="Times New Roman" w:hAnsi="Times New Roman" w:cs="Times New Roman"/>
           <w:color w:val="auto"/>
         </w:rPr>
-        <w:t>4.2 Pre-processing Results</w:t>
-      </w:r>
-      <w:bookmarkEnd w:id="34"/>
+        <w:t xml:space="preserve">5.0 </w:t>
+      </w:r>
+      <w:r>
+        <w:rPr>
+          <w:rFonts w:ascii="Times New Roman" w:hAnsi="Times New Roman" w:cs="Times New Roman"/>
+          <w:color w:val="auto"/>
+        </w:rPr>
+        <w:t>Conclusion and Recommendations</w:t>
+      </w:r>
+      <w:bookmarkEnd w:id="38"/>
+    </w:p>
+    <w:p>
+      <w:pPr>
+        <w:pStyle w:val="Heading2"/>
+        <w:spacing w:line="360" w:lineRule="auto"/>
+        <w:rPr>
+          <w:rFonts w:ascii="Times New Roman" w:hAnsi="Times New Roman" w:cs="Times New Roman"/>
+          <w:color w:val="auto"/>
+        </w:rPr>
+      </w:pPr>
+      <w:bookmarkStart w:id="39" w:name="_Toc235630751"/>
+      <w:r>
+        <w:rPr>
+          <w:rFonts w:ascii="Times New Roman" w:hAnsi="Times New Roman" w:cs="Times New Roman"/>
+          <w:color w:val="auto"/>
+        </w:rPr>
+        <w:t>5.1 Conclusion</w:t>
+      </w:r>
+      <w:bookmarkEnd w:id="39"/>
     </w:p>
     <w:p>
       <w:pPr>
@@ -8412,7 +9744,12 @@
         </w:rPr>
       </w:pPr>
       <w:r>
-        <w:t>The preprocessing stage cleaned and prepared transaction data by validating required values, handling missing values, converting dates and amounts, normalising categorical values, and detecting unusual transactions. Numerical gaps were filled using median imputation, noisy continuous values were controlled using interquartile-range clipping, and the train/test process was stratified to preserve class balance. The platform accepts both English and Kiswahili CSV templates and manual transaction entry; counterparty TIN is optional because some informal buyers and suppliers do not possess one.</w:t>
+        <w:rPr>
+          <w:rFonts w:ascii="Times New Roman" w:hAnsi="Times New Roman" w:cs="Times New Roman"/>
+          <w:sz w:val="24"/>
+          <w:szCs w:val="24"/>
+        </w:rPr>
+        <w:t xml:space="preserve">The project set out to develop an automated machine learning-based credit risk assessment system for SME value chain financing in Tanzania. Its main objectives were to build preprocessing and feature engineering pipelines, compare ensemble and classical models, and evaluate predictive performance using standard metrics. </w:t>
       </w:r>
     </w:p>
     <w:p>
@@ -8426,7 +9763,35 @@
         </w:rPr>
       </w:pPr>
       <w:r>
-        <w:t>Feature engineering converted raw transaction activity into predictive variables that reflect SME behaviour. These included payment reliability, average and maximum delay, transaction volume and frequency, account age, order completion, default and compliance rates, partner diversity, sales trend, on-time payment rate, intervals between transactions, buyer/supplier shares, and order-type mix. Rare high-value transactions were flagged so that a single unusual invoice would not inflate the indicative financing amount.</w:t>
+        <w:t>The study concludes that the proposed approach can improve SME credit assessment by supplementing collateral-heavy methods with data-driven analysis of supply-chain behaviour. The findings demonstrate that transaction data provides useful indicators of payment reliability, trading activity, delays, partner diversity, and order completion, especially for informal or semi-formal businesses with limited conventional records.</w:t>
+      </w:r>
+    </w:p>
+    <w:p>
+      <w:pPr>
+        <w:spacing w:line="360" w:lineRule="auto"/>
+        <w:jc w:val="both"/>
+        <w:rPr>
+          <w:rFonts w:ascii="Times New Roman" w:hAnsi="Times New Roman" w:cs="Times New Roman"/>
+          <w:sz w:val="24"/>
+          <w:szCs w:val="24"/>
+        </w:rPr>
+      </w:pPr>
+      <w:r>
+        <w:t>The development process confirmed that data preparation is as important as modelling. Under the evaluated protocol, Random Forest performed better overall than Logistic Regression, particularly in accuracy, F1-score, and ROC-AUC. The conclusion is therefore limited to the evaluated dataset and protocol, but it supports the selection of Random Forest as the primary model for the current prototype.</w:t>
+      </w:r>
+    </w:p>
+    <w:p>
+      <w:pPr>
+        <w:spacing w:line="360" w:lineRule="auto"/>
+        <w:jc w:val="both"/>
+        <w:rPr>
+          <w:rFonts w:ascii="Times New Roman" w:hAnsi="Times New Roman" w:cs="Times New Roman"/>
+          <w:sz w:val="24"/>
+          <w:szCs w:val="24"/>
+        </w:rPr>
+      </w:pPr>
+      <w:r>
+        <w:t>The system is applicable as a deployed prototype for financial institutions, fintech developers, and policymakers interested in financial inclusion. Its bilingual SME, lender, administrator, and sub-administrator dashboards demonstrate the complete workflow from account management and transaction capture to scoring and lender review. Its usefulness nevertheless remains constrained by data availability, data quality, prototype hosting, and the need for supervised pilots using observed repayment outcomes.</w:t>
       </w:r>
     </w:p>
     <w:p>
@@ -8434,18 +9799,22 @@
         <w:jc w:val="center"/>
       </w:pPr>
       <w:r>
+        <w:rPr>
+          <w:noProof/>
+        </w:rPr>
         <w:drawing>
-          <wp:inline xmlns:a="http://schemas.openxmlformats.org/drawingml/2006/main" xmlns:pic="http://schemas.openxmlformats.org/drawingml/2006/picture">
-            <wp:extent cx="5394960" cy="3371850"/>
-            <wp:docPr id="5" name="Picture 5"/>
+          <wp:inline distT="0" distB="0" distL="0" distR="0" wp14:anchorId="26208F57" wp14:editId="3383C297">
+            <wp:extent cx="6086475" cy="3371501"/>
+            <wp:effectExtent l="0" t="0" r="0" b="635"/>
+            <wp:docPr id="13" name="Picture 13"/>
             <wp:cNvGraphicFramePr>
-              <a:graphicFrameLocks noChangeAspect="1"/>
+              <a:graphicFrameLocks xmlns:a="http://schemas.openxmlformats.org/drawingml/2006/main" noChangeAspect="1"/>
             </wp:cNvGraphicFramePr>
-            <a:graphic>
+            <a:graphic xmlns:a="http://schemas.openxmlformats.org/drawingml/2006/main">
               <a:graphicData uri="http://schemas.openxmlformats.org/drawingml/2006/picture">
-                <pic:pic>
+                <pic:pic xmlns:pic="http://schemas.openxmlformats.org/drawingml/2006/picture">
                   <pic:nvPicPr>
-                    <pic:cNvPr id="0" name="03_sme_transactions.png"/>
+                    <pic:cNvPr id="0" name="08_admin_create.png"/>
                     <pic:cNvPicPr/>
                   </pic:nvPicPr>
                   <pic:blipFill>
@@ -8457,9 +9826,11 @@
                   <pic:spPr>
                     <a:xfrm>
                       <a:off x="0" y="0"/>
-                      <a:ext cx="5394960" cy="3371850"/>
+                      <a:ext cx="6092274" cy="3374713"/>
                     </a:xfrm>
-                    <a:prstGeom prst="rect"/>
+                    <a:prstGeom prst="rect">
+                      <a:avLst/>
+                    </a:prstGeom>
                   </pic:spPr>
                 </pic:pic>
               </a:graphicData>
@@ -8476,62 +9847,28 @@
         <w:rPr>
           <w:rFonts w:ascii="Times New Roman" w:hAnsi="Times New Roman"/>
           <w:i/>
-          <w:sz w:val="22"/>
-        </w:rPr>
-        <w:t>Figure 4.3: SME transaction register providing supply-chain activity used for feature engineering.</w:t>
-      </w:r>
-    </w:p>
-    <w:p>
-      <w:pPr>
-        <w:jc w:val="center"/>
-      </w:pPr>
-      <w:r>
-        <w:drawing>
-          <wp:inline xmlns:a="http://schemas.openxmlformats.org/drawingml/2006/main" xmlns:pic="http://schemas.openxmlformats.org/drawingml/2006/picture">
-            <wp:extent cx="5394960" cy="3371850"/>
-            <wp:docPr id="6" name="Picture 6"/>
-            <wp:cNvGraphicFramePr>
-              <a:graphicFrameLocks noChangeAspect="1"/>
-            </wp:cNvGraphicFramePr>
-            <a:graphic>
-              <a:graphicData uri="http://schemas.openxmlformats.org/drawingml/2006/picture">
-                <pic:pic>
-                  <pic:nvPicPr>
-                    <pic:cNvPr id="0" name="04_sme_upload.png"/>
-                    <pic:cNvPicPr/>
-                  </pic:nvPicPr>
-                  <pic:blipFill>
-                    <a:blip r:embed="rId22"/>
-                    <a:stretch>
-                      <a:fillRect/>
-                    </a:stretch>
-                  </pic:blipFill>
-                  <pic:spPr>
-                    <a:xfrm>
-                      <a:off x="0" y="0"/>
-                      <a:ext cx="5394960" cy="3371850"/>
-                    </a:xfrm>
-                    <a:prstGeom prst="rect"/>
-                  </pic:spPr>
-                </pic:pic>
-              </a:graphicData>
-            </a:graphic>
-          </wp:inline>
-        </w:drawing>
-      </w:r>
-    </w:p>
-    <w:p>
-      <w:pPr>
-        <w:jc w:val="center"/>
-      </w:pPr>
-      <w:r>
-        <w:rPr>
-          <w:rFonts w:ascii="Times New Roman" w:hAnsi="Times New Roman"/>
-          <w:i/>
-          <w:sz w:val="22"/>
-        </w:rPr>
-        <w:t>Figure 4.4: CSV upload interface for importing transactional statements into the preprocessing pipeline.</w:t>
-      </w:r>
+        </w:rPr>
+        <w:t>Figure 5.1: Admin create-lender form illustrating operational readiness of the deployed prototype.</w:t>
+      </w:r>
+    </w:p>
+    <w:p>
+      <w:pPr>
+        <w:pStyle w:val="Heading2"/>
+        <w:spacing w:line="360" w:lineRule="auto"/>
+        <w:rPr>
+          <w:rFonts w:ascii="Times New Roman" w:hAnsi="Times New Roman" w:cs="Times New Roman"/>
+          <w:color w:val="auto"/>
+        </w:rPr>
+      </w:pPr>
+      <w:bookmarkStart w:id="40" w:name="_Toc235630752"/>
+      <w:r>
+        <w:rPr>
+          <w:rFonts w:ascii="Times New Roman" w:hAnsi="Times New Roman" w:cs="Times New Roman"/>
+          <w:color w:val="auto"/>
+        </w:rPr>
+        <w:t>5.2 Recommendations</w:t>
+      </w:r>
+      <w:bookmarkEnd w:id="40"/>
     </w:p>
     <w:p>
       <w:pPr>
@@ -8543,6 +9880,14 @@
           <w:szCs w:val="24"/>
         </w:rPr>
       </w:pPr>
+      <w:r>
+        <w:rPr>
+          <w:rFonts w:ascii="Times New Roman" w:hAnsi="Times New Roman" w:cs="Times New Roman"/>
+          <w:sz w:val="24"/>
+          <w:szCs w:val="24"/>
+        </w:rPr>
+        <w:t>Financial institutions should pilot data-driven credit assessment that incorporates supply-chain transaction behaviour alongside, rather than immediately replacing, existing affordability, identity, and compliance checks. A phased pilot in one value-chain sector would allow lenders to compare Ushirika scores with observed repayment outcomes before wider adoption.</w:t>
+      </w:r>
     </w:p>
     <w:p>
       <w:pPr>
@@ -8554,6 +9899,50 @@
           <w:szCs w:val="24"/>
         </w:rPr>
       </w:pPr>
+      <w:r>
+        <w:rPr>
+          <w:rFonts w:ascii="Times New Roman" w:hAnsi="Times New Roman" w:cs="Times New Roman"/>
+          <w:sz w:val="24"/>
+          <w:szCs w:val="24"/>
+        </w:rPr>
+        <w:t>Authorities and lending organisations should invest in secure digital record keeping, consent-based data sharing, and common transaction standards. Production implementation should integrate verified NIDA services, managed database infrastructure, ERP systems, digital wallets, merchant platforms, and auditable access controls while complying with applicable Tanzanian data-protection requirements.</w:t>
+      </w:r>
+    </w:p>
+    <w:p>
+      <w:pPr>
+        <w:spacing w:line="360" w:lineRule="auto"/>
+        <w:jc w:val="both"/>
+        <w:rPr>
+          <w:rFonts w:ascii="Times New Roman" w:hAnsi="Times New Roman" w:cs="Times New Roman"/>
+          <w:sz w:val="24"/>
+          <w:szCs w:val="24"/>
+        </w:rPr>
+      </w:pPr>
+      <w:r>
+        <w:rPr>
+          <w:rFonts w:ascii="Times New Roman" w:hAnsi="Times New Roman" w:cs="Times New Roman"/>
+          <w:sz w:val="24"/>
+          <w:szCs w:val="24"/>
+        </w:rPr>
+        <w:t>Before production use, the model should be validated on larger longitudinal datasets covering different SME sectors and regions of Tanzania. Evaluation should include fairness across groups, calibration, model drift, false-positive and false-negative costs, security testing, and independent human review of lending decisions.</w:t>
+      </w:r>
+    </w:p>
+    <w:p>
+      <w:pPr>
+        <w:rPr>
+          <w:rFonts w:ascii="Times New Roman" w:hAnsi="Times New Roman" w:cs="Times New Roman"/>
+          <w:sz w:val="24"/>
+          <w:szCs w:val="24"/>
+        </w:rPr>
+      </w:pPr>
+      <w:r>
+        <w:rPr>
+          <w:rFonts w:ascii="Times New Roman" w:hAnsi="Times New Roman" w:cs="Times New Roman"/>
+          <w:sz w:val="24"/>
+          <w:szCs w:val="24"/>
+        </w:rPr>
+        <w:br w:type="page"/>
+      </w:r>
     </w:p>
     <w:p>
       <w:pPr>
@@ -8564,15 +9953,15 @@
           <w:color w:val="auto"/>
         </w:rPr>
       </w:pPr>
-      <w:bookmarkStart w:id="35" w:name="_Toc234742440"/>
+      <w:bookmarkStart w:id="41" w:name="_Toc235630753"/>
       <w:r>
         <w:rPr>
           <w:rFonts w:ascii="Times New Roman" w:hAnsi="Times New Roman" w:cs="Times New Roman"/>
           <w:color w:val="auto"/>
         </w:rPr>
-        <w:t>4.3 Project Results</w:t>
-      </w:r>
-      <w:bookmarkEnd w:id="35"/>
+        <w:t>5.3 Future Work</w:t>
+      </w:r>
+      <w:bookmarkEnd w:id="41"/>
     </w:p>
     <w:p>
       <w:pPr>
@@ -8585,7 +9974,12 @@
         </w:rPr>
       </w:pPr>
       <w:r>
-        <w:t>The first specific objective was achieved. The implemented preprocessing and feature engineering pipeline transforms raw supply-chain transactions into seventeen behavioural predictors and outlier indicators. The same pipeline is used when SMEs upload a CSV file or record transactions manually, thereby connecting the analytical method directly to the working system.</w:t>
+        <w:rPr>
+          <w:rFonts w:ascii="Times New Roman" w:hAnsi="Times New Roman" w:cs="Times New Roman"/>
+          <w:sz w:val="24"/>
+          <w:szCs w:val="24"/>
+        </w:rPr>
+        <w:t>Future research should collect longitudinal transaction and observed repayment-outcome data, then compare Random Forest with gradient boosting, XGBoost, and other suitable algorithms under local Tanzanian SME conditions. Explainability methods such as SHAP and ongoing model-drift monitoring should also be evaluated before production adoption.</w:t>
       </w:r>
     </w:p>
     <w:p>
@@ -8599,780 +9993,18 @@
         </w:rPr>
       </w:pPr>
       <w:r>
-        <w:t>The second specific objective was achieved by comparing Logistic Regression as the classical baseline with Random Forest as the ensemble model on the same stratified 80:20 train/test split. On the hold-out test data, Random Forest achieved 88.6% accuracy, 93.0% precision, 85.7% recall, 89.2% F1-score, and 95.8% ROC-AUC. Logistic Regression achieved 77.9% accuracy, 75.8% precision, 87.7% recall, 81.3% F1-score, and 87.5% ROC-AUC. Random Forest was therefore selected as the primary scorer because it provided the stronger overall discrimination and classification balance.</w:t>
-      </w:r>
-    </w:p>
-    <w:p>
-      <w:pPr>
-        <w:spacing w:line="360" w:lineRule="auto"/>
-        <w:jc w:val="both"/>
-        <w:rPr>
-          <w:rFonts w:ascii="Times New Roman" w:hAnsi="Times New Roman" w:cs="Times New Roman"/>
-          <w:sz w:val="24"/>
-          <w:szCs w:val="24"/>
-        </w:rPr>
-      </w:pPr>
-      <w:r>
-        <w:t>The third specific objective was achieved through hold-out accuracy, precision, recall, F1-score, ROC-AUC, and confusion-matrix evaluation. Five-fold GridSearchCV was applied on the training portion using ROC-AUC as the selection measure, while the final metrics were calculated on unseen test data. These controls, together with a minimum of five transactions before scoring and conservative score and financing rules, provide a transparent basis for interpreting the prototype's predictions.</w:t>
-      </w:r>
-    </w:p>
-    <w:p>
-      <w:pPr>
-        <w:jc w:val="center"/>
-      </w:pPr>
-      <w:r>
-        <w:drawing>
-          <wp:inline xmlns:a="http://schemas.openxmlformats.org/drawingml/2006/main" xmlns:pic="http://schemas.openxmlformats.org/drawingml/2006/picture">
-            <wp:extent cx="5394960" cy="3371850"/>
-            <wp:docPr id="7" name="Picture 7"/>
-            <wp:cNvGraphicFramePr>
-              <a:graphicFrameLocks noChangeAspect="1"/>
-            </wp:cNvGraphicFramePr>
-            <a:graphic>
-              <a:graphicData uri="http://schemas.openxmlformats.org/drawingml/2006/picture">
-                <pic:pic>
-                  <pic:nvPicPr>
-                    <pic:cNvPr id="0" name="05_lender_portfolio.png"/>
-                    <pic:cNvPicPr/>
-                  </pic:nvPicPr>
-                  <pic:blipFill>
-                    <a:blip r:embed="rId23"/>
-                    <a:stretch>
-                      <a:fillRect/>
-                    </a:stretch>
-                  </pic:blipFill>
-                  <pic:spPr>
-                    <a:xfrm>
-                      <a:off x="0" y="0"/>
-                      <a:ext cx="5394960" cy="3371850"/>
-                    </a:xfrm>
-                    <a:prstGeom prst="rect"/>
-                  </pic:spPr>
-                </pic:pic>
-              </a:graphicData>
-            </a:graphic>
-          </wp:inline>
-        </w:drawing>
-      </w:r>
-    </w:p>
-    <w:p>
-      <w:pPr>
-        <w:jc w:val="center"/>
-      </w:pPr>
-      <w:r>
-        <w:t>Figure 4.5: Lender list of SMEs with risk classification, credit scores, and NIDA search.</w:t>
-      </w:r>
-    </w:p>
-    <w:p>
-      <w:pPr>
-        <w:jc w:val="center"/>
-      </w:pPr>
-      <w:r>
-        <w:drawing>
-          <wp:inline xmlns:a="http://schemas.openxmlformats.org/drawingml/2006/main" xmlns:pic="http://schemas.openxmlformats.org/drawingml/2006/picture">
-            <wp:extent cx="5394960" cy="3371850"/>
-            <wp:docPr id="8" name="Picture 8"/>
-            <wp:cNvGraphicFramePr>
-              <a:graphicFrameLocks noChangeAspect="1"/>
-            </wp:cNvGraphicFramePr>
-            <a:graphic>
-              <a:graphicData uri="http://schemas.openxmlformats.org/drawingml/2006/picture">
-                <pic:pic>
-                  <pic:nvPicPr>
-                    <pic:cNvPr id="0" name="06_lender_sme_detail.png"/>
-                    <pic:cNvPicPr/>
-                  </pic:nvPicPr>
-                  <pic:blipFill>
-                    <a:blip r:embed="rId24"/>
-                    <a:stretch>
-                      <a:fillRect/>
-                    </a:stretch>
-                  </pic:blipFill>
-                  <pic:spPr>
-                    <a:xfrm>
-                      <a:off x="0" y="0"/>
-                      <a:ext cx="5394960" cy="3371850"/>
-                    </a:xfrm>
-                    <a:prstGeom prst="rect"/>
-                  </pic:spPr>
-                </pic:pic>
-              </a:graphicData>
-            </a:graphic>
-          </wp:inline>
-        </w:drawing>
-      </w:r>
-    </w:p>
-    <w:p>
-      <w:pPr>
-        <w:jc w:val="center"/>
-      </w:pPr>
-      <w:r>
-        <w:rPr>
-          <w:rFonts w:ascii="Times New Roman" w:hAnsi="Times New Roman"/>
-          <w:i/>
-          <w:sz w:val="22"/>
-        </w:rPr>
-        <w:t>Figure 4.6: Lender SME detail profile (including TIN) with tabbed ML analytics.</w:t>
-      </w:r>
-    </w:p>
-    <w:p>
-      <w:pPr>
-        <w:jc w:val="center"/>
-      </w:pPr>
-      <w:r>
-        <w:drawing>
-          <wp:inline xmlns:a="http://schemas.openxmlformats.org/drawingml/2006/main" xmlns:pic="http://schemas.openxmlformats.org/drawingml/2006/picture">
-            <wp:extent cx="4754880" cy="4309110"/>
-            <wp:docPr id="9" name="Picture 9"/>
-            <wp:cNvGraphicFramePr>
-              <a:graphicFrameLocks noChangeAspect="1"/>
-            </wp:cNvGraphicFramePr>
-            <a:graphic>
-              <a:graphicData uri="http://schemas.openxmlformats.org/drawingml/2006/picture">
-                <pic:pic>
-                  <pic:nvPicPr>
-                    <pic:cNvPr id="0" name="09_lender_ml_metrics.png"/>
-                    <pic:cNvPicPr/>
-                  </pic:nvPicPr>
-                  <pic:blipFill>
-                    <a:blip r:embed="rId25"/>
-                    <a:stretch>
-                      <a:fillRect/>
-                    </a:stretch>
-                  </pic:blipFill>
-                  <pic:spPr>
-                    <a:xfrm>
-                      <a:off x="0" y="0"/>
-                      <a:ext cx="4754880" cy="4309110"/>
-                    </a:xfrm>
-                    <a:prstGeom prst="rect"/>
-                  </pic:spPr>
-                </pic:pic>
-              </a:graphicData>
-            </a:graphic>
-          </wp:inline>
-        </w:drawing>
-      </w:r>
-    </w:p>
-    <w:p>
-      <w:pPr>
-        <w:jc w:val="center"/>
-      </w:pPr>
-      <w:r>
-        <w:rPr>
-          <w:rFonts w:ascii="Times New Roman" w:hAnsi="Times New Roman"/>
-          <w:i/>
-          <w:sz w:val="22"/>
-        </w:rPr>
-        <w:t>Figure 4.7: ML metrics panel for a selected SME (score, risk, probability, and financing).</w:t>
-      </w:r>
-    </w:p>
-    <w:p>
-      <w:pPr>
-        <w:jc w:val="center"/>
-      </w:pPr>
-      <w:r>
-        <w:drawing>
-          <wp:inline xmlns:a="http://schemas.openxmlformats.org/drawingml/2006/main" xmlns:pic="http://schemas.openxmlformats.org/drawingml/2006/picture">
-            <wp:extent cx="4754880" cy="3767818"/>
-            <wp:docPr id="10" name="Picture 10"/>
-            <wp:cNvGraphicFramePr>
-              <a:graphicFrameLocks noChangeAspect="1"/>
-            </wp:cNvGraphicFramePr>
-            <a:graphic>
-              <a:graphicData uri="http://schemas.openxmlformats.org/drawingml/2006/picture">
-                <pic:pic>
-                  <pic:nvPicPr>
-                    <pic:cNvPr id="0" name="10_lender_signals.png"/>
-                    <pic:cNvPicPr/>
-                  </pic:nvPicPr>
-                  <pic:blipFill>
-                    <a:blip r:embed="rId26"/>
-                    <a:stretch>
-                      <a:fillRect/>
-                    </a:stretch>
-                  </pic:blipFill>
-                  <pic:spPr>
-                    <a:xfrm>
-                      <a:off x="0" y="0"/>
-                      <a:ext cx="4754880" cy="3767818"/>
-                    </a:xfrm>
-                    <a:prstGeom prst="rect"/>
-                  </pic:spPr>
-                </pic:pic>
-              </a:graphicData>
-            </a:graphic>
-          </wp:inline>
-        </w:drawing>
-      </w:r>
-    </w:p>
-    <w:p>
-      <w:pPr>
-        <w:jc w:val="center"/>
-      </w:pPr>
-      <w:r>
-        <w:rPr>
-          <w:rFonts w:ascii="Times New Roman" w:hAnsi="Times New Roman"/>
-          <w:i/>
-          <w:sz w:val="22"/>
-        </w:rPr>
-        <w:t>Figure 4.8: Explainable score signals derived from the SME’s engineered features.</w:t>
-      </w:r>
-    </w:p>
-    <w:p>
-      <w:pPr>
-        <w:pStyle w:val="Heading2"/>
-        <w:spacing w:line="360" w:lineRule="auto"/>
-        <w:rPr>
-          <w:rFonts w:ascii="Times New Roman" w:hAnsi="Times New Roman" w:cs="Times New Roman"/>
-          <w:color w:val="auto"/>
-        </w:rPr>
-      </w:pPr>
-      <w:bookmarkStart w:id="36" w:name="_Toc234742441"/>
-      <w:r>
-        <w:rPr>
-          <w:rFonts w:ascii="Times New Roman" w:hAnsi="Times New Roman" w:cs="Times New Roman"/>
-          <w:color w:val="auto"/>
-        </w:rPr>
-        <w:t>4.4 Discussion</w:t>
-      </w:r>
-      <w:bookmarkEnd w:id="36"/>
-    </w:p>
-    <w:p>
-      <w:pPr>
-        <w:spacing w:line="360" w:lineRule="auto"/>
-        <w:jc w:val="both"/>
-        <w:rPr>
-          <w:rFonts w:ascii="Times New Roman" w:hAnsi="Times New Roman" w:cs="Times New Roman"/>
-          <w:sz w:val="24"/>
-          <w:szCs w:val="24"/>
-        </w:rPr>
-      </w:pPr>
-      <w:r>
-        <w:t>The overall findings support the suitability of machine learning for alternative SME credit assessment where conventional financial information is limited. The stronger Random Forest ROC-AUC of 95.8%, compared with 87.5% for Logistic Regression, indicates that non-linear relationships in payment behaviour, volume, delays, and value-chain roles were useful for ranking risk in the evaluated data. However, the result should be interpreted as prototype evidence rather than proof of performance across all Tanzanian SMEs.</w:t>
-      </w:r>
-    </w:p>
-    <w:p>
-      <w:pPr>
-        <w:spacing w:line="360" w:lineRule="auto"/>
-        <w:jc w:val="both"/>
-        <w:rPr>
-          <w:rFonts w:ascii="Times New Roman" w:hAnsi="Times New Roman" w:cs="Times New Roman"/>
-          <w:sz w:val="24"/>
-          <w:szCs w:val="24"/>
-        </w:rPr>
-      </w:pPr>
-      <w:r>
-        <w:t>The Random Forest result is consistent with Breiman (2001) and Lessmann et al. (2015), who demonstrate the value of ensemble methods for complex classification and credit-scoring tasks. The use of transaction behaviour as an alternative signal also agrees with Khandani et al. (2010), while the inclusion of buyer-supplier relationships reflects the value-chain financing perspective discussed by Klapper (2006). The project contributes by converting these ideas into a working Tanzanian SME credit-risk prototype rather than presenting only a theoretical model.</w:t>
-      </w:r>
-    </w:p>
-    <w:p>
-      <w:pPr>
-        <w:spacing w:line="360" w:lineRule="auto"/>
-        <w:jc w:val="both"/>
-        <w:rPr>
-          <w:rFonts w:ascii="Times New Roman" w:hAnsi="Times New Roman" w:cs="Times New Roman"/>
-          <w:sz w:val="24"/>
-          <w:szCs w:val="24"/>
-        </w:rPr>
-      </w:pPr>
-      <w:r>
-        <w:t>Although the prototype is deployed online and its core workflows are operational, it is not yet a bank-production system. The training evidence still depends partly on synthetic bootstrap data and engineered labels because sufficiently large longitudinal repayment datasets from Tanzanian SMEs were not available. Transaction quality, sparse histories, free-tier cloud cold starts, and the absence of formal integration with national identity, banking, ERP, and credit-bureau systems may affect operational reliability and generalisability.</w:t>
-      </w:r>
-    </w:p>
-    <w:p>
-      <w:pPr>
-        <w:jc w:val="center"/>
-      </w:pPr>
-      <w:r>
-        <w:drawing>
-          <wp:inline xmlns:a="http://schemas.openxmlformats.org/drawingml/2006/main" xmlns:pic="http://schemas.openxmlformats.org/drawingml/2006/picture">
-            <wp:extent cx="5394960" cy="3371850"/>
-            <wp:docPr id="11" name="Picture 11"/>
-            <wp:cNvGraphicFramePr>
-              <a:graphicFrameLocks noChangeAspect="1"/>
-            </wp:cNvGraphicFramePr>
-            <a:graphic>
-              <a:graphicData uri="http://schemas.openxmlformats.org/drawingml/2006/picture">
-                <pic:pic>
-                  <pic:nvPicPr>
-                    <pic:cNvPr id="0" name="07_admin_accounts.png"/>
-                    <pic:cNvPicPr/>
-                  </pic:nvPicPr>
-                  <pic:blipFill>
-                    <a:blip r:embed="rId27"/>
-                    <a:stretch>
-                      <a:fillRect/>
-                    </a:stretch>
-                  </pic:blipFill>
-                  <pic:spPr>
-                    <a:xfrm>
-                      <a:off x="0" y="0"/>
-                      <a:ext cx="5394960" cy="3371850"/>
-                    </a:xfrm>
-                    <a:prstGeom prst="rect"/>
-                  </pic:spPr>
-                </pic:pic>
-              </a:graphicData>
-            </a:graphic>
-          </wp:inline>
-        </w:drawing>
-      </w:r>
-    </w:p>
-    <w:p>
-      <w:pPr>
-        <w:jc w:val="center"/>
-      </w:pPr>
-      <w:r>
-        <w:rPr>
-          <w:rFonts w:ascii="Times New Roman" w:hAnsi="Times New Roman"/>
-          <w:i/>
-          <w:sz w:val="22"/>
-        </w:rPr>
-        <w:t>Figure 4.9: Admin governance screen for managing SME and lender accounts in the prototype.</w:t>
-      </w:r>
-    </w:p>
-    <w:p>
-      <w:pPr>
-        <w:jc w:val="center"/>
-      </w:pPr>
-      <w:r>
-        <w:drawing>
-          <wp:inline xmlns:a="http://schemas.openxmlformats.org/drawingml/2006/main" xmlns:pic="http://schemas.openxmlformats.org/drawingml/2006/picture">
-            <wp:extent cx="4754880" cy="2557871"/>
-            <wp:docPr id="12" name="Picture 12"/>
-            <wp:cNvGraphicFramePr>
-              <a:graphicFrameLocks noChangeAspect="1"/>
-            </wp:cNvGraphicFramePr>
-            <a:graphic>
-              <a:graphicData uri="http://schemas.openxmlformats.org/drawingml/2006/picture">
-                <pic:pic>
-                  <pic:nvPicPr>
-                    <pic:cNvPr id="0" name="11_lender_recent_tx.png"/>
-                    <pic:cNvPicPr/>
-                  </pic:nvPicPr>
-                  <pic:blipFill>
-                    <a:blip r:embed="rId28"/>
-                    <a:stretch>
-                      <a:fillRect/>
-                    </a:stretch>
-                  </pic:blipFill>
-                  <pic:spPr>
-                    <a:xfrm>
-                      <a:off x="0" y="0"/>
-                      <a:ext cx="4754880" cy="2557871"/>
-                    </a:xfrm>
-                    <a:prstGeom prst="rect"/>
-                  </pic:spPr>
-                </pic:pic>
-              </a:graphicData>
-            </a:graphic>
-          </wp:inline>
-        </w:drawing>
-      </w:r>
-    </w:p>
-    <w:p>
-      <w:pPr>
-        <w:jc w:val="center"/>
-      </w:pPr>
-      <w:r>
-        <w:rPr>
-          <w:rFonts w:ascii="Times New Roman" w:hAnsi="Times New Roman"/>
-          <w:i/>
-          <w:sz w:val="22"/>
-        </w:rPr>
-        <w:t>Figure 4.10: Recent transactions view used by lenders when reviewing an SME’s repayment behaviour.</w:t>
-      </w:r>
-    </w:p>
-    <w:p>
-      <w:pPr>
-        <w:spacing w:line="360" w:lineRule="auto"/>
-        <w:rPr>
-          <w:rFonts w:ascii="Times New Roman" w:hAnsi="Times New Roman" w:cs="Times New Roman"/>
-          <w:sz w:val="24"/>
-          <w:szCs w:val="24"/>
-        </w:rPr>
-      </w:pPr>
-    </w:p>
-    <w:p>
-      <w:pPr>
-        <w:spacing w:line="360" w:lineRule="auto"/>
-        <w:rPr>
-          <w:rFonts w:ascii="Times New Roman" w:hAnsi="Times New Roman" w:cs="Times New Roman"/>
-          <w:sz w:val="24"/>
-          <w:szCs w:val="24"/>
-        </w:rPr>
-      </w:pPr>
-    </w:p>
-    <w:p>
-      <w:pPr>
-        <w:spacing w:line="360" w:lineRule="auto"/>
-        <w:rPr>
-          <w:rFonts w:ascii="Times New Roman" w:hAnsi="Times New Roman" w:cs="Times New Roman"/>
-          <w:sz w:val="24"/>
-          <w:szCs w:val="24"/>
-        </w:rPr>
-      </w:pPr>
-    </w:p>
-    <w:p>
-      <w:pPr>
-        <w:spacing w:line="360" w:lineRule="auto"/>
-        <w:rPr>
-          <w:rFonts w:ascii="Times New Roman" w:hAnsi="Times New Roman" w:cs="Times New Roman"/>
-          <w:sz w:val="24"/>
-          <w:szCs w:val="24"/>
-        </w:rPr>
-      </w:pPr>
-    </w:p>
-    <w:p>
-      <w:pPr>
-        <w:pStyle w:val="Heading1"/>
-        <w:spacing w:line="360" w:lineRule="auto"/>
-        <w:rPr>
-          <w:rFonts w:ascii="Times New Roman" w:hAnsi="Times New Roman" w:cs="Times New Roman"/>
-          <w:color w:val="auto"/>
-        </w:rPr>
-      </w:pPr>
-      <w:bookmarkStart w:id="37" w:name="_Toc234742442"/>
-      <w:r>
-        <w:rPr>
-          <w:rFonts w:ascii="Times New Roman" w:hAnsi="Times New Roman" w:cs="Times New Roman"/>
-          <w:color w:val="auto"/>
-        </w:rPr>
-        <w:t>CHAPTER FIVE</w:t>
-      </w:r>
-      <w:bookmarkEnd w:id="37"/>
-    </w:p>
-    <w:p>
-      <w:pPr>
-        <w:pStyle w:val="Heading2"/>
-        <w:spacing w:line="360" w:lineRule="auto"/>
-        <w:rPr>
-          <w:rFonts w:ascii="Times New Roman" w:hAnsi="Times New Roman" w:cs="Times New Roman"/>
-          <w:color w:val="auto"/>
-        </w:rPr>
-      </w:pPr>
-      <w:bookmarkStart w:id="38" w:name="_Toc234742443"/>
-      <w:r>
-        <w:rPr>
-          <w:rFonts w:ascii="Times New Roman" w:hAnsi="Times New Roman" w:cs="Times New Roman"/>
-          <w:color w:val="auto"/>
-        </w:rPr>
-        <w:t xml:space="preserve">5.0 </w:t>
-      </w:r>
-      <w:r>
-        <w:rPr>
-          <w:rFonts w:ascii="Times New Roman" w:hAnsi="Times New Roman" w:cs="Times New Roman"/>
-          <w:color w:val="auto"/>
-        </w:rPr>
-        <w:t>Conclusion and Recommendations</w:t>
-      </w:r>
-      <w:bookmarkEnd w:id="38"/>
-    </w:p>
-    <w:p>
-      <w:pPr>
-        <w:pStyle w:val="Heading2"/>
-        <w:spacing w:line="360" w:lineRule="auto"/>
-        <w:rPr>
-          <w:rFonts w:ascii="Times New Roman" w:hAnsi="Times New Roman" w:cs="Times New Roman"/>
-          <w:color w:val="auto"/>
-        </w:rPr>
-      </w:pPr>
-      <w:bookmarkStart w:id="39" w:name="_Toc234742444"/>
-      <w:r>
-        <w:rPr>
-          <w:rFonts w:ascii="Times New Roman" w:hAnsi="Times New Roman" w:cs="Times New Roman"/>
-          <w:color w:val="auto"/>
-        </w:rPr>
-        <w:t>5.1 Conclusion</w:t>
-      </w:r>
-      <w:bookmarkEnd w:id="39"/>
-    </w:p>
-    <w:p>
-      <w:pPr>
-        <w:spacing w:line="360" w:lineRule="auto"/>
-        <w:jc w:val="both"/>
-        <w:rPr>
-          <w:rFonts w:ascii="Times New Roman" w:hAnsi="Times New Roman" w:cs="Times New Roman"/>
-          <w:sz w:val="24"/>
-          <w:szCs w:val="24"/>
-        </w:rPr>
-      </w:pPr>
-      <w:r>
-        <w:rPr>
-          <w:rFonts w:ascii="Times New Roman" w:hAnsi="Times New Roman" w:cs="Times New Roman"/>
-          <w:sz w:val="24"/>
-          <w:szCs w:val="24"/>
-        </w:rPr>
-        <w:t xml:space="preserve">The project set out to develop an automated machine learning-based credit risk assessment system for SME value chain financing in Tanzania. Its main objectives were to build preprocessing and feature engineering pipelines, compare ensemble and classical models, and evaluate predictive performance using standard metrics. </w:t>
-      </w:r>
-    </w:p>
-    <w:p>
-      <w:pPr>
-        <w:spacing w:line="360" w:lineRule="auto"/>
-        <w:jc w:val="both"/>
-        <w:rPr>
-          <w:rFonts w:ascii="Times New Roman" w:hAnsi="Times New Roman" w:cs="Times New Roman"/>
-          <w:sz w:val="24"/>
-          <w:szCs w:val="24"/>
-        </w:rPr>
-      </w:pPr>
-      <w:r>
-        <w:t>The study concludes that the proposed approach can improve SME credit assessment by supplementing collateral-heavy methods with data-driven analysis of supply-chain behaviour. The findings demonstrate that transaction data provides useful indicators of payment reliability, trading activity, delays, partner diversity, and order completion, especially for informal or semi-formal businesses with limited conventional records.</w:t>
-      </w:r>
-    </w:p>
-    <w:p>
-      <w:pPr>
-        <w:spacing w:line="360" w:lineRule="auto"/>
-        <w:jc w:val="both"/>
-        <w:rPr>
-          <w:rFonts w:ascii="Times New Roman" w:hAnsi="Times New Roman" w:cs="Times New Roman"/>
-          <w:sz w:val="24"/>
-          <w:szCs w:val="24"/>
-        </w:rPr>
-      </w:pPr>
-      <w:r>
-        <w:t>The development process confirmed that data preparation is as important as modelling. Under the evaluated protocol, Random Forest performed better overall than Logistic Regression, particularly in accuracy, F1-score, and ROC-AUC. The conclusion is therefore limited to the evaluated dataset and protocol, but it supports the selection of Random Forest as the primary model for the current prototype.</w:t>
-      </w:r>
-    </w:p>
-    <w:p>
-      <w:pPr>
-        <w:spacing w:line="360" w:lineRule="auto"/>
-        <w:jc w:val="both"/>
-        <w:rPr>
-          <w:rFonts w:ascii="Times New Roman" w:hAnsi="Times New Roman" w:cs="Times New Roman"/>
-          <w:sz w:val="24"/>
-          <w:szCs w:val="24"/>
-        </w:rPr>
-      </w:pPr>
-      <w:r>
-        <w:t>The system is applicable as a deployed prototype for financial institutions, fintech developers, and policymakers interested in financial inclusion. Its bilingual SME, lender, administrator, and sub-administrator dashboards demonstrate the complete workflow from account management and transaction capture to scoring and lender review. Its usefulness nevertheless remains constrained by data availability, data quality, prototype hosting, and the need for supervised pilots using observed repayment outcomes.</w:t>
-      </w:r>
-    </w:p>
-    <w:p>
-      <w:pPr>
-        <w:jc w:val="center"/>
-      </w:pPr>
-      <w:r>
-        <w:drawing>
-          <wp:inline xmlns:a="http://schemas.openxmlformats.org/drawingml/2006/main" xmlns:pic="http://schemas.openxmlformats.org/drawingml/2006/picture">
-            <wp:extent cx="5394960" cy="3371850"/>
-            <wp:docPr id="13" name="Picture 13"/>
-            <wp:cNvGraphicFramePr>
-              <a:graphicFrameLocks noChangeAspect="1"/>
-            </wp:cNvGraphicFramePr>
-            <a:graphic>
-              <a:graphicData uri="http://schemas.openxmlformats.org/drawingml/2006/picture">
-                <pic:pic>
-                  <pic:nvPicPr>
-                    <pic:cNvPr id="0" name="08_admin_create.png"/>
-                    <pic:cNvPicPr/>
-                  </pic:nvPicPr>
-                  <pic:blipFill>
-                    <a:blip r:embed="rId29"/>
-                    <a:stretch>
-                      <a:fillRect/>
-                    </a:stretch>
-                  </pic:blipFill>
-                  <pic:spPr>
-                    <a:xfrm>
-                      <a:off x="0" y="0"/>
-                      <a:ext cx="5394960" cy="3371850"/>
-                    </a:xfrm>
-                    <a:prstGeom prst="rect"/>
-                  </pic:spPr>
-                </pic:pic>
-              </a:graphicData>
-            </a:graphic>
-          </wp:inline>
-        </w:drawing>
-      </w:r>
-    </w:p>
-    <w:p>
-      <w:pPr>
-        <w:jc w:val="center"/>
-      </w:pPr>
-      <w:r>
-        <w:rPr>
-          <w:rFonts w:ascii="Times New Roman" w:hAnsi="Times New Roman"/>
-          <w:i/>
-          <w:sz w:val="22"/>
-        </w:rPr>
-        <w:t>Figure 5.1: Admin create-lender form illustrating operational readiness of the deployed prototype.</w:t>
-      </w:r>
-    </w:p>
-    <w:p>
-      <w:pPr>
-        <w:spacing w:line="360" w:lineRule="auto"/>
-        <w:jc w:val="both"/>
-        <w:rPr>
-          <w:rFonts w:ascii="Times New Roman" w:hAnsi="Times New Roman" w:cs="Times New Roman"/>
-          <w:sz w:val="24"/>
-          <w:szCs w:val="24"/>
-        </w:rPr>
-      </w:pPr>
-    </w:p>
-    <w:p>
-      <w:pPr>
-        <w:spacing w:line="360" w:lineRule="auto"/>
-        <w:jc w:val="both"/>
-        <w:rPr>
-          <w:rFonts w:ascii="Times New Roman" w:hAnsi="Times New Roman" w:cs="Times New Roman"/>
-          <w:sz w:val="24"/>
-          <w:szCs w:val="24"/>
-        </w:rPr>
-      </w:pPr>
-    </w:p>
-    <w:p>
-      <w:pPr>
-        <w:spacing w:line="360" w:lineRule="auto"/>
-        <w:jc w:val="both"/>
-        <w:rPr>
-          <w:rFonts w:ascii="Times New Roman" w:hAnsi="Times New Roman" w:cs="Times New Roman"/>
-          <w:sz w:val="24"/>
-          <w:szCs w:val="24"/>
-        </w:rPr>
-      </w:pPr>
-    </w:p>
-    <w:p>
-      <w:pPr>
-        <w:spacing w:line="360" w:lineRule="auto"/>
-        <w:jc w:val="both"/>
-        <w:rPr>
-          <w:rFonts w:ascii="Times New Roman" w:hAnsi="Times New Roman" w:cs="Times New Roman"/>
-          <w:sz w:val="24"/>
-          <w:szCs w:val="24"/>
-        </w:rPr>
-      </w:pPr>
-    </w:p>
-    <w:p>
-      <w:pPr>
-        <w:spacing w:line="360" w:lineRule="auto"/>
-        <w:jc w:val="both"/>
-        <w:rPr>
-          <w:rFonts w:ascii="Times New Roman" w:hAnsi="Times New Roman" w:cs="Times New Roman"/>
-          <w:sz w:val="24"/>
-          <w:szCs w:val="24"/>
-        </w:rPr>
-      </w:pPr>
-    </w:p>
-    <w:p>
-      <w:pPr>
-        <w:pStyle w:val="Heading2"/>
-        <w:spacing w:line="360" w:lineRule="auto"/>
-        <w:rPr>
-          <w:rFonts w:ascii="Times New Roman" w:hAnsi="Times New Roman" w:cs="Times New Roman"/>
-          <w:color w:val="auto"/>
-        </w:rPr>
-      </w:pPr>
-      <w:bookmarkStart w:id="40" w:name="_Toc234742445"/>
-      <w:r>
-        <w:rPr>
-          <w:rFonts w:ascii="Times New Roman" w:hAnsi="Times New Roman" w:cs="Times New Roman"/>
-          <w:color w:val="auto"/>
-        </w:rPr>
-        <w:t>5.2 Recommendations</w:t>
-      </w:r>
-      <w:bookmarkEnd w:id="40"/>
-    </w:p>
-    <w:p>
-      <w:pPr>
-        <w:spacing w:line="360" w:lineRule="auto"/>
-        <w:jc w:val="both"/>
-        <w:rPr>
-          <w:rFonts w:ascii="Times New Roman" w:hAnsi="Times New Roman" w:cs="Times New Roman"/>
-          <w:sz w:val="24"/>
-          <w:szCs w:val="24"/>
-        </w:rPr>
-      </w:pPr>
-      <w:r>
-        <w:t>Financial institutions should pilot data-driven credit assessment that incorporates supply-chain transaction behaviour alongside, rather than immediately replacing, existing affordability, identity, and compliance checks. A phased pilot in one value-chain sector would allow lenders to compare Ushirika scores with observed repayment outcomes before wider adoption.</w:t>
-      </w:r>
-    </w:p>
-    <w:p>
-      <w:pPr>
-        <w:spacing w:line="360" w:lineRule="auto"/>
-        <w:jc w:val="both"/>
-        <w:rPr>
-          <w:rFonts w:ascii="Times New Roman" w:hAnsi="Times New Roman" w:cs="Times New Roman"/>
-          <w:sz w:val="24"/>
-          <w:szCs w:val="24"/>
-        </w:rPr>
-      </w:pPr>
-      <w:r>
-        <w:t>Authorities and lending organisations should invest in secure digital record keeping, consent-based data sharing, and common transaction standards. Production implementation should integrate verified NIDA services, managed database infrastructure, ERP systems, digital wallets, merchant platforms, and auditable access controls while complying with applicable Tanzanian data-protection requirements.</w:t>
-      </w:r>
-    </w:p>
-    <w:p>
-      <w:pPr>
-        <w:spacing w:line="360" w:lineRule="auto"/>
-        <w:jc w:val="both"/>
-        <w:rPr>
-          <w:rFonts w:ascii="Times New Roman" w:hAnsi="Times New Roman" w:cs="Times New Roman"/>
-          <w:sz w:val="24"/>
-          <w:szCs w:val="24"/>
-        </w:rPr>
-      </w:pPr>
-      <w:r>
-        <w:t>Before production use, the model should be validated on larger longitudinal datasets covering different SME sectors and regions of Tanzania. Evaluation should include fairness across groups, calibration, model drift, false-positive and false-negative costs, security testing, and independent human review of lending decisions.</w:t>
-      </w:r>
-    </w:p>
-    <w:p>
-      <w:pPr>
-        <w:pStyle w:val="Heading2"/>
-        <w:spacing w:line="360" w:lineRule="auto"/>
-        <w:rPr>
-          <w:rFonts w:ascii="Times New Roman" w:hAnsi="Times New Roman" w:cs="Times New Roman"/>
-          <w:color w:val="auto"/>
-        </w:rPr>
-      </w:pPr>
-      <w:bookmarkStart w:id="41" w:name="_Toc234742446"/>
-      <w:r>
-        <w:rPr>
-          <w:rFonts w:ascii="Times New Roman" w:hAnsi="Times New Roman" w:cs="Times New Roman"/>
-          <w:color w:val="auto"/>
-        </w:rPr>
-        <w:t>5.3 Future Work</w:t>
-      </w:r>
-      <w:bookmarkEnd w:id="41"/>
-    </w:p>
-    <w:p>
-      <w:pPr>
-        <w:spacing w:line="360" w:lineRule="auto"/>
-        <w:jc w:val="both"/>
-        <w:rPr>
-          <w:rFonts w:ascii="Times New Roman" w:hAnsi="Times New Roman" w:cs="Times New Roman"/>
-          <w:sz w:val="24"/>
-          <w:szCs w:val="24"/>
-        </w:rPr>
-      </w:pPr>
-      <w:r>
-        <w:t>Future research should collect longitudinal transaction and observed repayment-outcome data, then compare Random Forest with gradient boosting, XGBoost, and other suitable algorithms under local Tanzanian SME conditions. Explainability methods such as SHAP and ongoing model-drift monitoring should also be evaluated before production adoption.</w:t>
-      </w:r>
-    </w:p>
-    <w:p>
-      <w:pPr>
-        <w:spacing w:line="360" w:lineRule="auto"/>
-        <w:jc w:val="both"/>
-        <w:rPr>
-          <w:rFonts w:ascii="Times New Roman" w:hAnsi="Times New Roman" w:cs="Times New Roman"/>
-          <w:sz w:val="24"/>
-          <w:szCs w:val="24"/>
-        </w:rPr>
-      </w:pPr>
-      <w:r>
+        <w:rPr>
+          <w:rFonts w:ascii="Times New Roman" w:hAnsi="Times New Roman" w:cs="Times New Roman"/>
+          <w:sz w:val="24"/>
+          <w:szCs w:val="24"/>
+        </w:rPr>
         <w:t>Because a web-based scoring platform, role-based dashboards, bilingual forms, CSV import, and explainable score signals have already been implemented, future work should focus on production hardening rather than basic interface development. Priorities include managed PostgreSQL, verified identity services, multi-factor recovery, automated lender alerts, ERP and payment integrations, continuous model audit, and monitored pilots with partner financial institutions.</w:t>
       </w:r>
     </w:p>
     <w:p>
       <w:pPr>
-        <w:jc w:val="both"/>
-        <w:rPr>
-          <w:rFonts w:ascii="Times New Roman" w:eastAsiaTheme="majorEastAsia" w:hAnsi="Times New Roman" w:cs="Times New Roman"/>
-          <w:b/>
-          <w:bCs/>
-          <w:sz w:val="28"/>
-          <w:szCs w:val="28"/>
+        <w:rPr>
+          <w:rFonts w:ascii="Times New Roman" w:hAnsi="Times New Roman" w:cs="Times New Roman"/>
         </w:rPr>
       </w:pPr>
       <w:r>
@@ -9392,7 +10024,7 @@
           <w:color w:val="auto"/>
         </w:rPr>
       </w:pPr>
-      <w:bookmarkStart w:id="42" w:name="_Toc234742447"/>
+      <w:bookmarkStart w:id="42" w:name="_Toc235630754"/>
       <w:r>
         <w:rPr>
           <w:rFonts w:ascii="Times New Roman" w:hAnsi="Times New Roman" w:cs="Times New Roman"/>
@@ -9420,7 +10052,7 @@
         </w:rPr>
         <w:t xml:space="preserve">Altman, E. I. (1968). Financial ratios, discriminant analysis and the prediction of corporate bankruptcy. The Journal of Finance, 23(4), 589–609. </w:t>
       </w:r>
-      <w:hyperlink r:id="rId11" w:history="1">
+      <w:hyperlink r:id="rId22" w:history="1">
         <w:r>
           <w:rPr>
             <w:rStyle w:val="Hyperlink"/>
@@ -9469,7 +10101,7 @@
         </w:rPr>
         <w:t xml:space="preserve">Breiman, L. (2001). Random forests. Machine Learning, 45(1), 5–32. </w:t>
       </w:r>
-      <w:hyperlink r:id="rId12" w:history="1">
+      <w:hyperlink r:id="rId23" w:history="1">
         <w:r>
           <w:rPr>
             <w:rStyle w:val="Hyperlink"/>
@@ -9518,7 +10150,7 @@
         </w:rPr>
         <w:t xml:space="preserve">Khandani, A. E., Kim, A. J., &amp; Lo, A. W. (2010). Consumer credit-risk models via machine-learning algorithms. Journal of Banking &amp; Finance, 34(11), 2767–2787. </w:t>
       </w:r>
-      <w:hyperlink r:id="rId13" w:history="1">
+      <w:hyperlink r:id="rId24" w:history="1">
         <w:r>
           <w:rPr>
             <w:rStyle w:val="Hyperlink"/>
@@ -9548,7 +10180,7 @@
         </w:rPr>
         <w:t xml:space="preserve">Klapper, L. (2006). The role of factoring for financing small and medium enterprises. Journal of Banking &amp; Finance, 30(11), 3111–3130. </w:t>
       </w:r>
-      <w:hyperlink r:id="rId14" w:history="1">
+      <w:hyperlink r:id="rId25" w:history="1">
         <w:r>
           <w:rPr>
             <w:rStyle w:val="Hyperlink"/>
@@ -9578,7 +10210,7 @@
         </w:rPr>
         <w:t xml:space="preserve">Lessmann, S., Baesens, B., Seow, H.-V., &amp; Thomas, L. C. (2015). Benchmarking state-of-the-art classification algorithms for credit scoring. European Journal of Operational Research, 247(1), 124–136. </w:t>
       </w:r>
-      <w:hyperlink r:id="rId15" w:history="1">
+      <w:hyperlink r:id="rId26" w:history="1">
         <w:r>
           <w:rPr>
             <w:rStyle w:val="Hyperlink"/>
@@ -9648,7 +10280,7 @@
       </w:r>
     </w:p>
     <w:sectPr>
-      <w:footerReference w:type="default" r:id="rId16"/>
+      <w:footerReference w:type="default" r:id="rId27"/>
       <w:pgSz w:w="11909" w:h="16834"/>
       <w:pgMar w:top="1440" w:right="1440" w:bottom="1440" w:left="1440" w:header="720" w:footer="720" w:gutter="0"/>
       <w:pgNumType w:start="1"/>

</xml_diff>